<commit_message>
Lead portfolio with Parwah and correct past-role content
</commit_message>
<xml_diff>
--- a/assets/anchit-tandon-freelance-resume.docx
+++ b/assets/anchit-tandon-freelance-resume.docx
@@ -3,426 +3,221 @@
 <w:document xmlns:wpc="http://schemas.microsoft.com/office/word/2010/wordprocessingCanvas" xmlns:mo="http://schemas.microsoft.com/office/mac/office/2008/main" xmlns:mc="http://schemas.openxmlformats.org/markup-compatibility/2006" xmlns:mv="urn:schemas-microsoft-com:mac:vml" xmlns:o="urn:schemas-microsoft-com:office:office" xmlns:r="http://schemas.openxmlformats.org/officeDocument/2006/relationships" xmlns:m="http://schemas.openxmlformats.org/officeDocument/2006/math" xmlns:v="urn:schemas-microsoft-com:vml" xmlns:wp14="http://schemas.microsoft.com/office/word/2010/wordprocessingDrawing" xmlns:wp="http://schemas.openxmlformats.org/drawingml/2006/wordprocessingDrawing" xmlns:w10="urn:schemas-microsoft-com:office:word" xmlns:w="http://schemas.openxmlformats.org/wordprocessingml/2006/main" xmlns:w14="http://schemas.microsoft.com/office/word/2010/wordml" xmlns:wpg="http://schemas.microsoft.com/office/word/2010/wordprocessingGroup" xmlns:wpi="http://schemas.microsoft.com/office/word/2010/wordprocessingInk" xmlns:wne="http://schemas.microsoft.com/office/word/2006/wordml" xmlns:wps="http://schemas.microsoft.com/office/word/2010/wordprocessingShape" mc:Ignorable="w14 wp14">
   <w:body>
     <w:p>
-      <w:pPr>
-        <w:pStyle w:val="Title"/>
-      </w:pPr>
       <w:r>
-        <w:t>Anchit Tandon</w:t>
+        <w:rPr>
+          <w:b/>
+          <w:color w:val="19302B"/>
+          <w:sz w:val="36"/>
+        </w:rPr>
+        <w:t>ANCHIT TANDON</w:t>
+      </w:r>
+    </w:p>
+    <w:p>
+      <w:r>
+        <w:t>Building Parwah  |  Product, AI &amp; Growth Consulting</w:t>
+      </w:r>
+    </w:p>
+    <w:p>
+      <w:r>
+        <w:t>Delhi, India  |  anchit.tandon@gmail.com  |  linkedin.com/in/anchit-tandon  |  anchit-tandon.com</w:t>
+      </w:r>
+    </w:p>
+    <w:p>
+      <w:r>
+        <w:rPr>
+          <w:b/>
+          <w:color w:val="1B5048"/>
+          <w:sz w:val="20"/>
+        </w:rPr>
+        <w:t>PROFILE</w:t>
       </w:r>
     </w:p>
     <w:p>
       <w:pPr>
-        <w:pStyle w:val="Subtitle"/>
+        <w:ind w:left="144"/>
       </w:pPr>
       <w:r>
-        <w:t>Technical Product and Growth Builder</w:t>
+        <w:t>Building Parwah, a family care product for India with parents at the centre. Engineer turned product and growth builder with experience across consumer platforms, subscriptions, D2C ecommerce and AI workflows. Taking select consulting engagements alongside Parwah.</w:t>
       </w:r>
     </w:p>
     <w:p>
       <w:r>
-        <w:t>Delhi, India | +91 9873945238 | anchit.tandon@gmail.com</w:t>
-      </w:r>
-    </w:p>
-    <w:p>
-      <w:r>
-        <w:t>anchit-tandon.com/freelancer | linkedin.com/in/anchit-tandon</w:t>
+        <w:rPr>
+          <w:b/>
+          <w:color w:val="1B5048"/>
+          <w:sz w:val="20"/>
+        </w:rPr>
+        <w:t>CURRENT PROJECT</w:t>
       </w:r>
     </w:p>
     <w:p>
       <w:pPr>
-        <w:pStyle w:val="Heading1"/>
-      </w:pPr>
-      <w:r>
-        <w:t>Profile</w:t>
-      </w:r>
-    </w:p>
-    <w:p>
-      <w:r>
-        <w:t>Engineer turned product leader with experience across consumer platforms, subscriptions, sales operations and international ecommerce. Connects problem definition, customer journeys, AI-assisted development and experimentation to deliver useful products and improve conversion, retention and operational efficiency. Available for freelance builds and fractional product and growth engagements.</w:t>
-      </w:r>
-    </w:p>
-    <w:p>
-      <w:pPr>
-        <w:pStyle w:val="Heading1"/>
-      </w:pPr>
-      <w:r>
-        <w:t>Core capabilities</w:t>
-      </w:r>
-    </w:p>
-    <w:p>
-      <w:r>
-        <w:t>Product discovery and prioritisation • Customer journeys and conversion funnels • AI workflows and internal tools • Web MVPs • Subscription monetisation • Lifecycle and retention • Analytics and experimentation • Cross-functional delivery</w:t>
-      </w:r>
-    </w:p>
-    <w:p>
-      <w:pPr>
-        <w:pStyle w:val="Heading1"/>
-      </w:pPr>
-      <w:r>
-        <w:t>Professional experience</w:t>
-      </w:r>
-    </w:p>
-    <w:p>
-      <w:pPr>
-        <w:keepNext/>
+        <w:ind w:left="144"/>
       </w:pPr>
       <w:r>
         <w:rPr>
           <w:b/>
         </w:rPr>
-        <w:t>Vahdam India — Assistant General Manager, Product Management</w:t>
-      </w:r>
-      <w:r>
-        <w:t xml:space="preserve"> | 2026</w:t>
+        <w:t>Parwah | Solo product builder | Sep 2026–present</w:t>
       </w:r>
     </w:p>
     <w:p>
       <w:pPr>
-        <w:pStyle w:val="ListBullet"/>
-        <w:spacing w:after="80"/>
+        <w:ind w:left="144"/>
       </w:pPr>
       <w:r>
-        <w:t>Led D2C product and growth work across US, UK and global markets, covering customer experience, product performance and revenue optimisation.</w:t>
+        <w:t>Building the product, design and parent-controlled consent model. The marketing site, interactive two-phone demo and beta app are live; the product is pre-launch.</w:t>
+      </w:r>
+    </w:p>
+    <w:p>
+      <w:r>
+        <w:rPr>
+          <w:b/>
+          <w:color w:val="1B5048"/>
+          <w:sz w:val="20"/>
+        </w:rPr>
+        <w:t>PROFESSIONAL EXPERIENCE</w:t>
       </w:r>
     </w:p>
     <w:p>
       <w:pPr>
-        <w:pStyle w:val="ListBullet"/>
-        <w:spacing w:after="80"/>
-      </w:pPr>
-      <w:r>
-        <w:t>Designed and executed product and CRM experiments, including lifecycle campaigns through Klaviyo and WebEngage and customer-rating improvement initiatives.</w:t>
-      </w:r>
-    </w:p>
-    <w:p>
-      <w:pPr>
-        <w:keepNext/>
+        <w:ind w:left="144"/>
       </w:pPr>
       <w:r>
         <w:rPr>
           <w:b/>
         </w:rPr>
-        <w:t>Times Internet</w:t>
-      </w:r>
-      <w:r>
-        <w:t xml:space="preserve"> | Jun 2022 – Apr 2026</w:t>
-      </w:r>
-    </w:p>
-    <w:p>
-      <w:r>
-        <w:t>Senior Product Manager | Apr 2025 – Apr 2026</w:t>
-        <w:br/>
-        <w:t>Product Manager | Oct 2023 – Mar 2025</w:t>
-        <w:br/>
-        <w:t>Associate Product Manager | Jun 2022 – Oct 2023</w:t>
+        <w:t>Vahdam India | AGM, Product Management &amp; D2C Growth | Apr–Sep 2026</w:t>
       </w:r>
     </w:p>
     <w:p>
       <w:pPr>
-        <w:pStyle w:val="Heading2"/>
+        <w:ind w:left="144"/>
       </w:pPr>
       <w:r>
-        <w:t>Assisted conversion and subscriptions</w:t>
+        <w:t>Worked across US, UK and global D2C markets on customer experience, growth and lifecycle initiatives. Developed a retention workflow connecting analytics, segmentation, planning and mailer generation; contributed to increased UK marketing revenue.</w:t>
       </w:r>
     </w:p>
     <w:p>
       <w:pPr>
-        <w:pStyle w:val="ListBullet"/>
-        <w:spacing w:after="80"/>
-      </w:pPr>
-      <w:r>
-        <w:t>Scaled Economic Times assisted-sales monthly revenue from INR 15 lakh to INR 80 lakh through funnel redesign and continuous experimentation; delivered 400%+ ROI within six months for ET Prime’s structured assisted-conversion funnel.</w:t>
-      </w:r>
-    </w:p>
-    <w:p>
-      <w:pPr>
-        <w:pStyle w:val="ListBullet"/>
-        <w:spacing w:after="80"/>
-      </w:pPr>
-      <w:r>
-        <w:t>Built AI TeleSuite for call transcription, quality scoring and pitch assistance to support conversion consistency across high-intent traffic.</w:t>
-      </w:r>
-    </w:p>
-    <w:p>
-      <w:pPr>
-        <w:pStyle w:val="ListBullet"/>
-        <w:spacing w:after="80"/>
-      </w:pPr>
-      <w:r>
-        <w:t>Introduced Assisted Buying features, increasing qualified leads from approximately 30 to 150+ per day; improved subscriber retention by 10% through onboarding and engagement experiments.</w:t>
-      </w:r>
-    </w:p>
-    <w:p>
-      <w:pPr>
-        <w:pStyle w:val="Heading2"/>
-      </w:pPr>
-      <w:r>
-        <w:t>Consumer platforms and new product launches</w:t>
-      </w:r>
-    </w:p>
-    <w:p>
-      <w:pPr>
-        <w:pStyle w:val="ListBullet"/>
-        <w:spacing w:after="80"/>
-      </w:pPr>
-      <w:r>
-        <w:t>Led the ET Markets web and mobile-web revamp, improving engagement by 27% and unlocking INR 3 crore+ in incremental annual revenue.</w:t>
-      </w:r>
-    </w:p>
-    <w:p>
-      <w:pPr>
-        <w:pStyle w:val="ListBullet"/>
-        <w:spacing w:after="80"/>
-      </w:pPr>
-      <w:r>
-        <w:t>Revamped ET Markets Android and iOS apps, increasing daily active users by 25% and average session duration by 15%.</w:t>
-      </w:r>
-    </w:p>
-    <w:p>
-      <w:pPr>
-        <w:pStyle w:val="ListBullet"/>
-        <w:spacing w:after="80"/>
-      </w:pPr>
-      <w:r>
-        <w:t>Launched paid wellness subscriptions for Times Health Plus and led discovery, registration and acquisition journeys for the Times Internet Half Marathon.</w:t>
-      </w:r>
-    </w:p>
-    <w:p>
-      <w:r>
-        <w:br w:type="page"/>
-      </w:r>
-    </w:p>
-    <w:p>
-      <w:pPr>
-        <w:pStyle w:val="Heading1"/>
-      </w:pPr>
-      <w:r>
-        <w:t>Anchit Tandon</w:t>
-      </w:r>
-    </w:p>
-    <w:p>
-      <w:r>
-        <w:t>Technical Product and Growth Builder | anchit.tandon@gmail.com</w:t>
-      </w:r>
-    </w:p>
-    <w:p>
-      <w:pPr>
-        <w:pStyle w:val="Heading1"/>
-      </w:pPr>
-      <w:r>
-        <w:t>Earlier experience</w:t>
-      </w:r>
-    </w:p>
-    <w:p>
-      <w:pPr>
-        <w:keepNext/>
+        <w:ind w:left="144"/>
       </w:pPr>
       <w:r>
         <w:rPr>
           <w:b/>
         </w:rPr>
-        <w:t>Citymall — Software Engineer</w:t>
-      </w:r>
-      <w:r>
-        <w:t xml:space="preserve"> | Mar 2022 – Jun 2022</w:t>
+        <w:t>Times Internet | APM → PM → Senior PM | Jun 2022–Apr 2026</w:t>
       </w:r>
     </w:p>
     <w:p>
       <w:pPr>
-        <w:pStyle w:val="ListBullet"/>
-        <w:spacing w:after="80"/>
+        <w:ind w:left="144"/>
       </w:pPr>
       <w:r>
-        <w:t>Supported data pipelines and backend systems for consumer commerce platforms.</w:t>
+        <w:t>Scaled ET Prime assisted-sales monthly revenue from ₹15L to ₹80L and built an AI telesuite for call quality and conversion support. The assisted conversion funnel delivered 400%+ ROI within six months.</w:t>
       </w:r>
     </w:p>
     <w:p>
       <w:pPr>
-        <w:keepNext/>
+        <w:ind w:left="144"/>
+      </w:pPr>
+      <w:r>
+        <w:t>Led ET Markets web and mobile product improvements: +27% engagement, +25% mobile DAU and ₹3Cr+ incremental annual revenue. Launched paid Times Health+ subscriptions and helped launch the 2026 Times Internet Delhi Half Marathon for 15,000+ participants.</w:t>
+      </w:r>
+    </w:p>
+    <w:p>
+      <w:pPr>
+        <w:ind w:left="144"/>
       </w:pPr>
       <w:r>
         <w:rPr>
           <w:b/>
         </w:rPr>
-        <w:t>Tuple Technologies — Software Engineer</w:t>
-      </w:r>
-      <w:r>
-        <w:t xml:space="preserve"> | Apr 2020 – Mar 2022</w:t>
+        <w:t>Citymall | Software Engineer | 2022 — Consumer commerce backend and data pipelines.</w:t>
       </w:r>
     </w:p>
     <w:p>
       <w:pPr>
-        <w:pStyle w:val="ListBullet"/>
-        <w:spacing w:after="80"/>
-      </w:pPr>
-      <w:r>
-        <w:t>Built and scaled backend services for consumer-facing applications.</w:t>
-      </w:r>
-    </w:p>
-    <w:p>
-      <w:pPr>
-        <w:pStyle w:val="ListBullet"/>
-        <w:spacing w:after="80"/>
-      </w:pPr>
-      <w:r>
-        <w:t>Owned an early live sports commentary product, connecting product decisions with technical delivery.</w:t>
-      </w:r>
-    </w:p>
-    <w:p>
-      <w:pPr>
-        <w:pStyle w:val="Heading1"/>
-      </w:pPr>
-      <w:r>
-        <w:t>Selected independent product builds</w:t>
-      </w:r>
-    </w:p>
-    <w:p>
-      <w:r>
-        <w:t>AI-assisted development across personal products and prototypes, with scope spanning product design, application workflows and integrations.</w:t>
-      </w:r>
-    </w:p>
-    <w:p>
-      <w:pPr>
-        <w:pStyle w:val="Heading2"/>
-      </w:pPr>
-      <w:r>
-        <w:t>Third Eye — Personal AI assistant</w:t>
-      </w:r>
-    </w:p>
-    <w:p>
-      <w:pPr>
-        <w:pStyle w:val="ListBullet"/>
-        <w:spacing w:after="80"/>
-      </w:pPr>
-      <w:r>
-        <w:t>Built a Next.js and Supabase application with tool calling, memory, tasks and Google integration, exploring how a personal assistant can connect information with actions.</w:t>
-      </w:r>
-    </w:p>
-    <w:p>
-      <w:pPr>
-        <w:pStyle w:val="Heading2"/>
-      </w:pPr>
-      <w:r>
-        <w:t>Lifecycle OS — Marketing workflow application</w:t>
-      </w:r>
-    </w:p>
-    <w:p>
-      <w:pPr>
-        <w:pStyle w:val="ListBullet"/>
-        <w:spacing w:after="80"/>
-      </w:pPr>
-      <w:r>
-        <w:t>Developed multi-brand workspace and campaign workflows, including publishing and dispatch code. Focused on connecting planning, content and operational execution.</w:t>
-      </w:r>
-    </w:p>
-    <w:p>
-      <w:pPr>
-        <w:pStyle w:val="Heading2"/>
-      </w:pPr>
-      <w:r>
-        <w:t>Parwah — Family coordination and care</w:t>
-      </w:r>
-    </w:p>
-    <w:p>
-      <w:pPr>
-        <w:pStyle w:val="ListBullet"/>
-        <w:spacing w:after="80"/>
-      </w:pPr>
-      <w:r>
-        <w:t>Designed and built workflows for shared memory, care requests, reminders and family coordination, with permission-aware product requirements.</w:t>
-      </w:r>
-    </w:p>
-    <w:p>
-      <w:pPr>
-        <w:pStyle w:val="Heading2"/>
-      </w:pPr>
-      <w:r>
-        <w:t>The Passion Table — Subscription and ordering product</w:t>
-      </w:r>
-    </w:p>
-    <w:p>
-      <w:pPr>
-        <w:pStyle w:val="ListBullet"/>
-        <w:spacing w:after="80"/>
-      </w:pPr>
-      <w:r>
-        <w:t>Developed subscription, ordering and operational workflows for a food-service concept, including a test-mode payment journey. Independent product in development.</w:t>
-      </w:r>
-    </w:p>
-    <w:p>
-      <w:pPr>
-        <w:pStyle w:val="Heading1"/>
-      </w:pPr>
-      <w:r>
-        <w:t>Engagement focus</w:t>
-      </w:r>
-    </w:p>
-    <w:p>
-      <w:pPr>
-        <w:pStyle w:val="ListBullet"/>
-        <w:spacing w:after="80"/>
-      </w:pPr>
-      <w:r>
-        <w:t>AI workflows and internal tools: call review, knowledge assistants, reporting dashboards and scoped integrations with human review.</w:t>
-      </w:r>
-    </w:p>
-    <w:p>
-      <w:pPr>
-        <w:pStyle w:val="ListBullet"/>
-        <w:spacing w:after="80"/>
-      </w:pPr>
-      <w:r>
-        <w:t>Conversion-focused websites: offer clarity, enquiry or purchase journeys, integrations and measurement.</w:t>
-      </w:r>
-    </w:p>
-    <w:p>
-      <w:pPr>
-        <w:pStyle w:val="ListBullet"/>
-        <w:spacing w:after="80"/>
-      </w:pPr>
-      <w:r>
-        <w:t>Fractional product and growth: prioritisation, launches, conversion experiments and subscription or ecommerce retention.</w:t>
-      </w:r>
-    </w:p>
-    <w:p>
-      <w:pPr>
-        <w:pStyle w:val="ListBullet"/>
-        <w:spacing w:after="80"/>
-      </w:pPr>
-      <w:r>
-        <w:t>Focused web MVPs: one core customer journey, agreed acceptance criteria and a usable handover.</w:t>
-      </w:r>
-    </w:p>
-    <w:p>
-      <w:pPr>
-        <w:pStyle w:val="Heading1"/>
-      </w:pPr>
-      <w:r>
-        <w:t>Education</w:t>
-      </w:r>
-    </w:p>
-    <w:p>
-      <w:pPr>
-        <w:keepNext/>
+        <w:ind w:left="144"/>
       </w:pPr>
       <w:r>
         <w:rPr>
           <w:b/>
         </w:rPr>
-        <w:t>B.Tech in Computer Science and Engineering</w:t>
-      </w:r>
-      <w:r>
-        <w:t xml:space="preserve"> | 2016 – 2020</w:t>
+        <w:t>Tuple Technologies | Software Engineer | 2020–2022 — Backend services and live sports product ownership.</w:t>
       </w:r>
     </w:p>
     <w:p>
       <w:r>
-        <w:t>Vellore Institute of Technology, Vellore</w:t>
+        <w:rPr>
+          <w:b/>
+          <w:color w:val="1B5048"/>
+          <w:sz w:val="20"/>
+        </w:rPr>
+        <w:t>SELECTED INDEPENDENT BUILDS</w:t>
+      </w:r>
+    </w:p>
+    <w:p>
+      <w:pPr>
+        <w:ind w:left="144"/>
+      </w:pPr>
+      <w:r>
+        <w:t>Lifecycle OS — Customer lifecycle and retention planning workflows.</w:t>
+      </w:r>
+    </w:p>
+    <w:p>
+      <w:pPr>
+        <w:ind w:left="144"/>
+      </w:pPr>
+      <w:r>
+        <w:t>The Third Eye — Context-aware AI assistant with memory, tasks and voice.</w:t>
+      </w:r>
+    </w:p>
+    <w:p>
+      <w:pPr>
+        <w:ind w:left="144"/>
+      </w:pPr>
+      <w:r>
+        <w:t>Hey Yaara — Voice-first companion designed for older adults.</w:t>
+      </w:r>
+    </w:p>
+    <w:p>
+      <w:pPr>
+        <w:ind w:left="144"/>
+      </w:pPr>
+      <w:r>
+        <w:t>MusicGenAI — Text-to-music product with inspectable generation steps.</w:t>
+      </w:r>
+    </w:p>
+    <w:p>
+      <w:r>
+        <w:rPr>
+          <w:b/>
+          <w:color w:val="1B5048"/>
+          <w:sz w:val="20"/>
+        </w:rPr>
+        <w:t>SKILLS &amp; EDUCATION</w:t>
+      </w:r>
+    </w:p>
+    <w:p>
+      <w:pPr>
+        <w:ind w:left="144"/>
+      </w:pPr>
+      <w:r>
+        <w:t>Product strategy, growth funnels, subscription monetisation, lifecycle and retention, experimentation, AI workflows, React, TypeScript, Python, SQL, Shopify, Klaviyo and WebEngage.</w:t>
+      </w:r>
+    </w:p>
+    <w:p>
+      <w:pPr>
+        <w:ind w:left="144"/>
+      </w:pPr>
+      <w:r>
+        <w:t>B.Tech, Computer Science &amp; Engineering | VIT Vellore | 2016–2020</w:t>
       </w:r>
     </w:p>
     <w:sectPr>
-      <w:pgSz w:w="11909" w:h="16834"/>
-      <w:pgMar w:top="893" w:right="1008" w:bottom="864" w:left="1008" w:header="720" w:footer="720" w:gutter="0"/>
+      <w:pgSz w:w="12240" w:h="15840"/>
+      <w:pgMar w:top="936" w:right="1800" w:bottom="864" w:left="1800" w:header="720" w:footer="720" w:gutter="0"/>
       <w:cols w:space="720"/>
       <w:docGrid w:linePitch="360"/>
     </w:sectPr>
@@ -794,12 +589,11 @@
     <w:qFormat/>
     <w:rsid w:val="00FC693F"/>
     <w:pPr>
-      <w:spacing w:after="100" w:line="259" w:lineRule="auto"/>
+      <w:spacing w:after="100"/>
     </w:pPr>
     <w:rPr>
-      <w:rFonts w:ascii="Arial" w:hAnsi="Arial"/>
-      <w:color w:val="000000"/>
-      <w:sz w:val="21"/>
+      <w:rFonts w:ascii="Aptos" w:hAnsi="Aptos"/>
+      <w:sz w:val="18"/>
     </w:rPr>
   </w:style>
   <w:style w:type="paragraph" w:styleId="Header">
@@ -857,15 +651,15 @@
     <w:pPr>
       <w:keepNext/>
       <w:keepLines/>
-      <w:spacing w:before="240" w:after="100"/>
+      <w:spacing w:before="480" w:after="0"/>
       <w:outlineLvl w:val="0"/>
     </w:pPr>
     <w:rPr>
-      <w:rFonts w:asciiTheme="majorHAnsi" w:eastAsiaTheme="majorEastAsia" w:hAnsiTheme="majorHAnsi" w:cstheme="majorBidi" w:ascii="Arial" w:hAnsi="Arial"/>
+      <w:rFonts w:asciiTheme="majorHAnsi" w:eastAsiaTheme="majorEastAsia" w:hAnsiTheme="majorHAnsi" w:cstheme="majorBidi"/>
       <w:b/>
       <w:bCs/>
-      <w:color w:val="000000"/>
-      <w:sz w:val="24"/>
+      <w:color w:val="365F91" w:themeColor="accent1" w:themeShade="BF"/>
+      <w:sz w:val="28"/>
       <w:szCs w:val="28"/>
     </w:rPr>
   </w:style>
@@ -881,15 +675,15 @@
     <w:pPr>
       <w:keepNext/>
       <w:keepLines/>
-      <w:spacing w:before="140" w:after="100"/>
+      <w:spacing w:before="200" w:after="0"/>
       <w:outlineLvl w:val="1"/>
     </w:pPr>
     <w:rPr>
-      <w:rFonts w:asciiTheme="majorHAnsi" w:eastAsiaTheme="majorEastAsia" w:hAnsiTheme="majorHAnsi" w:cstheme="majorBidi" w:ascii="Arial" w:hAnsi="Arial"/>
+      <w:rFonts w:asciiTheme="majorHAnsi" w:eastAsiaTheme="majorEastAsia" w:hAnsiTheme="majorHAnsi" w:cstheme="majorBidi"/>
       <w:b/>
       <w:bCs/>
-      <w:color w:val="000000"/>
-      <w:sz w:val="22"/>
+      <w:color w:val="4F81BD" w:themeColor="accent1"/>
+      <w:sz w:val="26"/>
       <w:szCs w:val="26"/>
     </w:rPr>
   </w:style>
@@ -1143,13 +937,15 @@
     <w:qFormat/>
     <w:rsid w:val="00FC693F"/>
     <w:pPr>
-      <w:spacing w:after="100" w:line="240" w:lineRule="auto"/>
+      <w:pBdr>
+        <w:bottom w:val="single" w:sz="8" w:space="4" w:color="4F81BD" w:themeColor="accent1"/>
+      </w:pBdr>
+      <w:spacing w:after="300" w:line="240" w:lineRule="auto"/>
       <w:contextualSpacing/>
     </w:pPr>
     <w:rPr>
-      <w:rFonts w:asciiTheme="majorHAnsi" w:eastAsiaTheme="majorEastAsia" w:hAnsiTheme="majorHAnsi" w:cstheme="majorBidi" w:ascii="Arial" w:hAnsi="Arial"/>
-      <w:b/>
-      <w:color w:val="000000"/>
+      <w:rFonts w:asciiTheme="majorHAnsi" w:eastAsiaTheme="majorEastAsia" w:hAnsiTheme="majorHAnsi" w:cstheme="majorBidi"/>
+      <w:color w:val="17365D" w:themeColor="text2" w:themeShade="BF"/>
       <w:spacing w:val="5"/>
       <w:kern w:val="28"/>
       <w:sz w:val="52"/>
@@ -1183,15 +979,14 @@
       <w:numPr>
         <w:ilvl w:val="1"/>
       </w:numPr>
-      <w:spacing w:after="100"/>
     </w:pPr>
     <w:rPr>
-      <w:rFonts w:asciiTheme="majorHAnsi" w:eastAsiaTheme="majorEastAsia" w:hAnsiTheme="majorHAnsi" w:cstheme="majorBidi" w:ascii="Arial" w:hAnsi="Arial"/>
+      <w:rFonts w:asciiTheme="majorHAnsi" w:eastAsiaTheme="majorEastAsia" w:hAnsiTheme="majorHAnsi" w:cstheme="majorBidi"/>
       <w:i/>
       <w:iCs/>
-      <w:color w:val="000000"/>
+      <w:color w:val="4F81BD" w:themeColor="accent1"/>
       <w:spacing w:val="15"/>
-      <w:sz w:val="21"/>
+      <w:sz w:val="24"/>
       <w:szCs w:val="24"/>
     </w:rPr>
   </w:style>
@@ -1327,14 +1122,8 @@
       <w:numPr>
         <w:numId w:val="1"/>
       </w:numPr>
-      <w:spacing w:after="100"/>
       <w:contextualSpacing/>
     </w:pPr>
-    <w:rPr>
-      <w:rFonts w:ascii="Arial" w:hAnsi="Arial"/>
-      <w:color w:val="000000"/>
-      <w:sz w:val="21"/>
-    </w:rPr>
   </w:style>
   <w:style w:type="paragraph" w:styleId="ListBullet2">
     <w:name w:val="List Bullet 2"/>
@@ -1635,6 +1424,9 @@
     <w:qFormat/>
     <w:rsid w:val="00FC693F"/>
     <w:pPr>
+      <w:pBdr>
+        <w:bottom w:val="single" w:sz="4" w:space="4" w:color="4F81BD" w:themeColor="accent1"/>
+      </w:pBdr>
       <w:spacing w:before="200" w:after="280"/>
       <w:ind w:left="936" w:right="936"/>
     </w:pPr>

</xml_diff>

<commit_message>
Lead portfolio with Parwah and correct past-role content (#174)
</commit_message>
<xml_diff>
--- a/assets/anchit-tandon-freelance-resume.docx
+++ b/assets/anchit-tandon-freelance-resume.docx
@@ -3,426 +3,221 @@
 <w:document xmlns:wpc="http://schemas.microsoft.com/office/word/2010/wordprocessingCanvas" xmlns:mo="http://schemas.microsoft.com/office/mac/office/2008/main" xmlns:mc="http://schemas.openxmlformats.org/markup-compatibility/2006" xmlns:mv="urn:schemas-microsoft-com:mac:vml" xmlns:o="urn:schemas-microsoft-com:office:office" xmlns:r="http://schemas.openxmlformats.org/officeDocument/2006/relationships" xmlns:m="http://schemas.openxmlformats.org/officeDocument/2006/math" xmlns:v="urn:schemas-microsoft-com:vml" xmlns:wp14="http://schemas.microsoft.com/office/word/2010/wordprocessingDrawing" xmlns:wp="http://schemas.openxmlformats.org/drawingml/2006/wordprocessingDrawing" xmlns:w10="urn:schemas-microsoft-com:office:word" xmlns:w="http://schemas.openxmlformats.org/wordprocessingml/2006/main" xmlns:w14="http://schemas.microsoft.com/office/word/2010/wordml" xmlns:wpg="http://schemas.microsoft.com/office/word/2010/wordprocessingGroup" xmlns:wpi="http://schemas.microsoft.com/office/word/2010/wordprocessingInk" xmlns:wne="http://schemas.microsoft.com/office/word/2006/wordml" xmlns:wps="http://schemas.microsoft.com/office/word/2010/wordprocessingShape" mc:Ignorable="w14 wp14">
   <w:body>
     <w:p>
-      <w:pPr>
-        <w:pStyle w:val="Title"/>
-      </w:pPr>
       <w:r>
-        <w:t>Anchit Tandon</w:t>
+        <w:rPr>
+          <w:b/>
+          <w:color w:val="19302B"/>
+          <w:sz w:val="36"/>
+        </w:rPr>
+        <w:t>ANCHIT TANDON</w:t>
+      </w:r>
+    </w:p>
+    <w:p>
+      <w:r>
+        <w:t>Building Parwah  |  Product, AI &amp; Growth Consulting</w:t>
+      </w:r>
+    </w:p>
+    <w:p>
+      <w:r>
+        <w:t>Delhi, India  |  anchit.tandon@gmail.com  |  linkedin.com/in/anchit-tandon  |  anchit-tandon.com</w:t>
+      </w:r>
+    </w:p>
+    <w:p>
+      <w:r>
+        <w:rPr>
+          <w:b/>
+          <w:color w:val="1B5048"/>
+          <w:sz w:val="20"/>
+        </w:rPr>
+        <w:t>PROFILE</w:t>
       </w:r>
     </w:p>
     <w:p>
       <w:pPr>
-        <w:pStyle w:val="Subtitle"/>
+        <w:ind w:left="144"/>
       </w:pPr>
       <w:r>
-        <w:t>Technical Product and Growth Builder</w:t>
+        <w:t>Building Parwah, a family care product for India with parents at the centre. Engineer turned product and growth builder with experience across consumer platforms, subscriptions, D2C ecommerce and AI workflows. Taking select consulting engagements alongside Parwah.</w:t>
       </w:r>
     </w:p>
     <w:p>
       <w:r>
-        <w:t>Delhi, India | +91 9873945238 | anchit.tandon@gmail.com</w:t>
-      </w:r>
-    </w:p>
-    <w:p>
-      <w:r>
-        <w:t>anchit-tandon.com/freelancer | linkedin.com/in/anchit-tandon</w:t>
+        <w:rPr>
+          <w:b/>
+          <w:color w:val="1B5048"/>
+          <w:sz w:val="20"/>
+        </w:rPr>
+        <w:t>CURRENT PROJECT</w:t>
       </w:r>
     </w:p>
     <w:p>
       <w:pPr>
-        <w:pStyle w:val="Heading1"/>
-      </w:pPr>
-      <w:r>
-        <w:t>Profile</w:t>
-      </w:r>
-    </w:p>
-    <w:p>
-      <w:r>
-        <w:t>Engineer turned product leader with experience across consumer platforms, subscriptions, sales operations and international ecommerce. Connects problem definition, customer journeys, AI-assisted development and experimentation to deliver useful products and improve conversion, retention and operational efficiency. Available for freelance builds and fractional product and growth engagements.</w:t>
-      </w:r>
-    </w:p>
-    <w:p>
-      <w:pPr>
-        <w:pStyle w:val="Heading1"/>
-      </w:pPr>
-      <w:r>
-        <w:t>Core capabilities</w:t>
-      </w:r>
-    </w:p>
-    <w:p>
-      <w:r>
-        <w:t>Product discovery and prioritisation • Customer journeys and conversion funnels • AI workflows and internal tools • Web MVPs • Subscription monetisation • Lifecycle and retention • Analytics and experimentation • Cross-functional delivery</w:t>
-      </w:r>
-    </w:p>
-    <w:p>
-      <w:pPr>
-        <w:pStyle w:val="Heading1"/>
-      </w:pPr>
-      <w:r>
-        <w:t>Professional experience</w:t>
-      </w:r>
-    </w:p>
-    <w:p>
-      <w:pPr>
-        <w:keepNext/>
+        <w:ind w:left="144"/>
       </w:pPr>
       <w:r>
         <w:rPr>
           <w:b/>
         </w:rPr>
-        <w:t>Vahdam India — Assistant General Manager, Product Management</w:t>
-      </w:r>
-      <w:r>
-        <w:t xml:space="preserve"> | 2026</w:t>
+        <w:t>Parwah | Solo product builder | Sep 2026–present</w:t>
       </w:r>
     </w:p>
     <w:p>
       <w:pPr>
-        <w:pStyle w:val="ListBullet"/>
-        <w:spacing w:after="80"/>
+        <w:ind w:left="144"/>
       </w:pPr>
       <w:r>
-        <w:t>Led D2C product and growth work across US, UK and global markets, covering customer experience, product performance and revenue optimisation.</w:t>
+        <w:t>Building the product, design and parent-controlled consent model. The marketing site, interactive two-phone demo and beta app are live; the product is pre-launch.</w:t>
+      </w:r>
+    </w:p>
+    <w:p>
+      <w:r>
+        <w:rPr>
+          <w:b/>
+          <w:color w:val="1B5048"/>
+          <w:sz w:val="20"/>
+        </w:rPr>
+        <w:t>PROFESSIONAL EXPERIENCE</w:t>
       </w:r>
     </w:p>
     <w:p>
       <w:pPr>
-        <w:pStyle w:val="ListBullet"/>
-        <w:spacing w:after="80"/>
-      </w:pPr>
-      <w:r>
-        <w:t>Designed and executed product and CRM experiments, including lifecycle campaigns through Klaviyo and WebEngage and customer-rating improvement initiatives.</w:t>
-      </w:r>
-    </w:p>
-    <w:p>
-      <w:pPr>
-        <w:keepNext/>
+        <w:ind w:left="144"/>
       </w:pPr>
       <w:r>
         <w:rPr>
           <w:b/>
         </w:rPr>
-        <w:t>Times Internet</w:t>
-      </w:r>
-      <w:r>
-        <w:t xml:space="preserve"> | Jun 2022 – Apr 2026</w:t>
-      </w:r>
-    </w:p>
-    <w:p>
-      <w:r>
-        <w:t>Senior Product Manager | Apr 2025 – Apr 2026</w:t>
-        <w:br/>
-        <w:t>Product Manager | Oct 2023 – Mar 2025</w:t>
-        <w:br/>
-        <w:t>Associate Product Manager | Jun 2022 – Oct 2023</w:t>
+        <w:t>Vahdam India | AGM, Product Management &amp; D2C Growth | Apr–Sep 2026</w:t>
       </w:r>
     </w:p>
     <w:p>
       <w:pPr>
-        <w:pStyle w:val="Heading2"/>
+        <w:ind w:left="144"/>
       </w:pPr>
       <w:r>
-        <w:t>Assisted conversion and subscriptions</w:t>
+        <w:t>Worked across US, UK and global D2C markets on customer experience, growth and lifecycle initiatives. Developed a retention workflow connecting analytics, segmentation, planning and mailer generation; contributed to increased UK marketing revenue.</w:t>
       </w:r>
     </w:p>
     <w:p>
       <w:pPr>
-        <w:pStyle w:val="ListBullet"/>
-        <w:spacing w:after="80"/>
-      </w:pPr>
-      <w:r>
-        <w:t>Scaled Economic Times assisted-sales monthly revenue from INR 15 lakh to INR 80 lakh through funnel redesign and continuous experimentation; delivered 400%+ ROI within six months for ET Prime’s structured assisted-conversion funnel.</w:t>
-      </w:r>
-    </w:p>
-    <w:p>
-      <w:pPr>
-        <w:pStyle w:val="ListBullet"/>
-        <w:spacing w:after="80"/>
-      </w:pPr>
-      <w:r>
-        <w:t>Built AI TeleSuite for call transcription, quality scoring and pitch assistance to support conversion consistency across high-intent traffic.</w:t>
-      </w:r>
-    </w:p>
-    <w:p>
-      <w:pPr>
-        <w:pStyle w:val="ListBullet"/>
-        <w:spacing w:after="80"/>
-      </w:pPr>
-      <w:r>
-        <w:t>Introduced Assisted Buying features, increasing qualified leads from approximately 30 to 150+ per day; improved subscriber retention by 10% through onboarding and engagement experiments.</w:t>
-      </w:r>
-    </w:p>
-    <w:p>
-      <w:pPr>
-        <w:pStyle w:val="Heading2"/>
-      </w:pPr>
-      <w:r>
-        <w:t>Consumer platforms and new product launches</w:t>
-      </w:r>
-    </w:p>
-    <w:p>
-      <w:pPr>
-        <w:pStyle w:val="ListBullet"/>
-        <w:spacing w:after="80"/>
-      </w:pPr>
-      <w:r>
-        <w:t>Led the ET Markets web and mobile-web revamp, improving engagement by 27% and unlocking INR 3 crore+ in incremental annual revenue.</w:t>
-      </w:r>
-    </w:p>
-    <w:p>
-      <w:pPr>
-        <w:pStyle w:val="ListBullet"/>
-        <w:spacing w:after="80"/>
-      </w:pPr>
-      <w:r>
-        <w:t>Revamped ET Markets Android and iOS apps, increasing daily active users by 25% and average session duration by 15%.</w:t>
-      </w:r>
-    </w:p>
-    <w:p>
-      <w:pPr>
-        <w:pStyle w:val="ListBullet"/>
-        <w:spacing w:after="80"/>
-      </w:pPr>
-      <w:r>
-        <w:t>Launched paid wellness subscriptions for Times Health Plus and led discovery, registration and acquisition journeys for the Times Internet Half Marathon.</w:t>
-      </w:r>
-    </w:p>
-    <w:p>
-      <w:r>
-        <w:br w:type="page"/>
-      </w:r>
-    </w:p>
-    <w:p>
-      <w:pPr>
-        <w:pStyle w:val="Heading1"/>
-      </w:pPr>
-      <w:r>
-        <w:t>Anchit Tandon</w:t>
-      </w:r>
-    </w:p>
-    <w:p>
-      <w:r>
-        <w:t>Technical Product and Growth Builder | anchit.tandon@gmail.com</w:t>
-      </w:r>
-    </w:p>
-    <w:p>
-      <w:pPr>
-        <w:pStyle w:val="Heading1"/>
-      </w:pPr>
-      <w:r>
-        <w:t>Earlier experience</w:t>
-      </w:r>
-    </w:p>
-    <w:p>
-      <w:pPr>
-        <w:keepNext/>
+        <w:ind w:left="144"/>
       </w:pPr>
       <w:r>
         <w:rPr>
           <w:b/>
         </w:rPr>
-        <w:t>Citymall — Software Engineer</w:t>
-      </w:r>
-      <w:r>
-        <w:t xml:space="preserve"> | Mar 2022 – Jun 2022</w:t>
+        <w:t>Times Internet | APM → PM → Senior PM | Jun 2022–Apr 2026</w:t>
       </w:r>
     </w:p>
     <w:p>
       <w:pPr>
-        <w:pStyle w:val="ListBullet"/>
-        <w:spacing w:after="80"/>
+        <w:ind w:left="144"/>
       </w:pPr>
       <w:r>
-        <w:t>Supported data pipelines and backend systems for consumer commerce platforms.</w:t>
+        <w:t>Scaled ET Prime assisted-sales monthly revenue from ₹15L to ₹80L and built an AI telesuite for call quality and conversion support. The assisted conversion funnel delivered 400%+ ROI within six months.</w:t>
       </w:r>
     </w:p>
     <w:p>
       <w:pPr>
-        <w:keepNext/>
+        <w:ind w:left="144"/>
+      </w:pPr>
+      <w:r>
+        <w:t>Led ET Markets web and mobile product improvements: +27% engagement, +25% mobile DAU and ₹3Cr+ incremental annual revenue. Launched paid Times Health+ subscriptions and helped launch the 2026 Times Internet Delhi Half Marathon for 15,000+ participants.</w:t>
+      </w:r>
+    </w:p>
+    <w:p>
+      <w:pPr>
+        <w:ind w:left="144"/>
       </w:pPr>
       <w:r>
         <w:rPr>
           <w:b/>
         </w:rPr>
-        <w:t>Tuple Technologies — Software Engineer</w:t>
-      </w:r>
-      <w:r>
-        <w:t xml:space="preserve"> | Apr 2020 – Mar 2022</w:t>
+        <w:t>Citymall | Software Engineer | 2022 — Consumer commerce backend and data pipelines.</w:t>
       </w:r>
     </w:p>
     <w:p>
       <w:pPr>
-        <w:pStyle w:val="ListBullet"/>
-        <w:spacing w:after="80"/>
-      </w:pPr>
-      <w:r>
-        <w:t>Built and scaled backend services for consumer-facing applications.</w:t>
-      </w:r>
-    </w:p>
-    <w:p>
-      <w:pPr>
-        <w:pStyle w:val="ListBullet"/>
-        <w:spacing w:after="80"/>
-      </w:pPr>
-      <w:r>
-        <w:t>Owned an early live sports commentary product, connecting product decisions with technical delivery.</w:t>
-      </w:r>
-    </w:p>
-    <w:p>
-      <w:pPr>
-        <w:pStyle w:val="Heading1"/>
-      </w:pPr>
-      <w:r>
-        <w:t>Selected independent product builds</w:t>
-      </w:r>
-    </w:p>
-    <w:p>
-      <w:r>
-        <w:t>AI-assisted development across personal products and prototypes, with scope spanning product design, application workflows and integrations.</w:t>
-      </w:r>
-    </w:p>
-    <w:p>
-      <w:pPr>
-        <w:pStyle w:val="Heading2"/>
-      </w:pPr>
-      <w:r>
-        <w:t>Third Eye — Personal AI assistant</w:t>
-      </w:r>
-    </w:p>
-    <w:p>
-      <w:pPr>
-        <w:pStyle w:val="ListBullet"/>
-        <w:spacing w:after="80"/>
-      </w:pPr>
-      <w:r>
-        <w:t>Built a Next.js and Supabase application with tool calling, memory, tasks and Google integration, exploring how a personal assistant can connect information with actions.</w:t>
-      </w:r>
-    </w:p>
-    <w:p>
-      <w:pPr>
-        <w:pStyle w:val="Heading2"/>
-      </w:pPr>
-      <w:r>
-        <w:t>Lifecycle OS — Marketing workflow application</w:t>
-      </w:r>
-    </w:p>
-    <w:p>
-      <w:pPr>
-        <w:pStyle w:val="ListBullet"/>
-        <w:spacing w:after="80"/>
-      </w:pPr>
-      <w:r>
-        <w:t>Developed multi-brand workspace and campaign workflows, including publishing and dispatch code. Focused on connecting planning, content and operational execution.</w:t>
-      </w:r>
-    </w:p>
-    <w:p>
-      <w:pPr>
-        <w:pStyle w:val="Heading2"/>
-      </w:pPr>
-      <w:r>
-        <w:t>Parwah — Family coordination and care</w:t>
-      </w:r>
-    </w:p>
-    <w:p>
-      <w:pPr>
-        <w:pStyle w:val="ListBullet"/>
-        <w:spacing w:after="80"/>
-      </w:pPr>
-      <w:r>
-        <w:t>Designed and built workflows for shared memory, care requests, reminders and family coordination, with permission-aware product requirements.</w:t>
-      </w:r>
-    </w:p>
-    <w:p>
-      <w:pPr>
-        <w:pStyle w:val="Heading2"/>
-      </w:pPr>
-      <w:r>
-        <w:t>The Passion Table — Subscription and ordering product</w:t>
-      </w:r>
-    </w:p>
-    <w:p>
-      <w:pPr>
-        <w:pStyle w:val="ListBullet"/>
-        <w:spacing w:after="80"/>
-      </w:pPr>
-      <w:r>
-        <w:t>Developed subscription, ordering and operational workflows for a food-service concept, including a test-mode payment journey. Independent product in development.</w:t>
-      </w:r>
-    </w:p>
-    <w:p>
-      <w:pPr>
-        <w:pStyle w:val="Heading1"/>
-      </w:pPr>
-      <w:r>
-        <w:t>Engagement focus</w:t>
-      </w:r>
-    </w:p>
-    <w:p>
-      <w:pPr>
-        <w:pStyle w:val="ListBullet"/>
-        <w:spacing w:after="80"/>
-      </w:pPr>
-      <w:r>
-        <w:t>AI workflows and internal tools: call review, knowledge assistants, reporting dashboards and scoped integrations with human review.</w:t>
-      </w:r>
-    </w:p>
-    <w:p>
-      <w:pPr>
-        <w:pStyle w:val="ListBullet"/>
-        <w:spacing w:after="80"/>
-      </w:pPr>
-      <w:r>
-        <w:t>Conversion-focused websites: offer clarity, enquiry or purchase journeys, integrations and measurement.</w:t>
-      </w:r>
-    </w:p>
-    <w:p>
-      <w:pPr>
-        <w:pStyle w:val="ListBullet"/>
-        <w:spacing w:after="80"/>
-      </w:pPr>
-      <w:r>
-        <w:t>Fractional product and growth: prioritisation, launches, conversion experiments and subscription or ecommerce retention.</w:t>
-      </w:r>
-    </w:p>
-    <w:p>
-      <w:pPr>
-        <w:pStyle w:val="ListBullet"/>
-        <w:spacing w:after="80"/>
-      </w:pPr>
-      <w:r>
-        <w:t>Focused web MVPs: one core customer journey, agreed acceptance criteria and a usable handover.</w:t>
-      </w:r>
-    </w:p>
-    <w:p>
-      <w:pPr>
-        <w:pStyle w:val="Heading1"/>
-      </w:pPr>
-      <w:r>
-        <w:t>Education</w:t>
-      </w:r>
-    </w:p>
-    <w:p>
-      <w:pPr>
-        <w:keepNext/>
+        <w:ind w:left="144"/>
       </w:pPr>
       <w:r>
         <w:rPr>
           <w:b/>
         </w:rPr>
-        <w:t>B.Tech in Computer Science and Engineering</w:t>
-      </w:r>
-      <w:r>
-        <w:t xml:space="preserve"> | 2016 – 2020</w:t>
+        <w:t>Tuple Technologies | Software Engineer | 2020–2022 — Backend services and live sports product ownership.</w:t>
       </w:r>
     </w:p>
     <w:p>
       <w:r>
-        <w:t>Vellore Institute of Technology, Vellore</w:t>
+        <w:rPr>
+          <w:b/>
+          <w:color w:val="1B5048"/>
+          <w:sz w:val="20"/>
+        </w:rPr>
+        <w:t>SELECTED INDEPENDENT BUILDS</w:t>
+      </w:r>
+    </w:p>
+    <w:p>
+      <w:pPr>
+        <w:ind w:left="144"/>
+      </w:pPr>
+      <w:r>
+        <w:t>Lifecycle OS — Customer lifecycle and retention planning workflows.</w:t>
+      </w:r>
+    </w:p>
+    <w:p>
+      <w:pPr>
+        <w:ind w:left="144"/>
+      </w:pPr>
+      <w:r>
+        <w:t>The Third Eye — Context-aware AI assistant with memory, tasks and voice.</w:t>
+      </w:r>
+    </w:p>
+    <w:p>
+      <w:pPr>
+        <w:ind w:left="144"/>
+      </w:pPr>
+      <w:r>
+        <w:t>Hey Yaara — Voice-first companion designed for older adults.</w:t>
+      </w:r>
+    </w:p>
+    <w:p>
+      <w:pPr>
+        <w:ind w:left="144"/>
+      </w:pPr>
+      <w:r>
+        <w:t>MusicGenAI — Text-to-music product with inspectable generation steps.</w:t>
+      </w:r>
+    </w:p>
+    <w:p>
+      <w:r>
+        <w:rPr>
+          <w:b/>
+          <w:color w:val="1B5048"/>
+          <w:sz w:val="20"/>
+        </w:rPr>
+        <w:t>SKILLS &amp; EDUCATION</w:t>
+      </w:r>
+    </w:p>
+    <w:p>
+      <w:pPr>
+        <w:ind w:left="144"/>
+      </w:pPr>
+      <w:r>
+        <w:t>Product strategy, growth funnels, subscription monetisation, lifecycle and retention, experimentation, AI workflows, React, TypeScript, Python, SQL, Shopify, Klaviyo and WebEngage.</w:t>
+      </w:r>
+    </w:p>
+    <w:p>
+      <w:pPr>
+        <w:ind w:left="144"/>
+      </w:pPr>
+      <w:r>
+        <w:t>B.Tech, Computer Science &amp; Engineering | VIT Vellore | 2016–2020</w:t>
       </w:r>
     </w:p>
     <w:sectPr>
-      <w:pgSz w:w="11909" w:h="16834"/>
-      <w:pgMar w:top="893" w:right="1008" w:bottom="864" w:left="1008" w:header="720" w:footer="720" w:gutter="0"/>
+      <w:pgSz w:w="12240" w:h="15840"/>
+      <w:pgMar w:top="936" w:right="1800" w:bottom="864" w:left="1800" w:header="720" w:footer="720" w:gutter="0"/>
       <w:cols w:space="720"/>
       <w:docGrid w:linePitch="360"/>
     </w:sectPr>
@@ -794,12 +589,11 @@
     <w:qFormat/>
     <w:rsid w:val="00FC693F"/>
     <w:pPr>
-      <w:spacing w:after="100" w:line="259" w:lineRule="auto"/>
+      <w:spacing w:after="100"/>
     </w:pPr>
     <w:rPr>
-      <w:rFonts w:ascii="Arial" w:hAnsi="Arial"/>
-      <w:color w:val="000000"/>
-      <w:sz w:val="21"/>
+      <w:rFonts w:ascii="Aptos" w:hAnsi="Aptos"/>
+      <w:sz w:val="18"/>
     </w:rPr>
   </w:style>
   <w:style w:type="paragraph" w:styleId="Header">
@@ -857,15 +651,15 @@
     <w:pPr>
       <w:keepNext/>
       <w:keepLines/>
-      <w:spacing w:before="240" w:after="100"/>
+      <w:spacing w:before="480" w:after="0"/>
       <w:outlineLvl w:val="0"/>
     </w:pPr>
     <w:rPr>
-      <w:rFonts w:asciiTheme="majorHAnsi" w:eastAsiaTheme="majorEastAsia" w:hAnsiTheme="majorHAnsi" w:cstheme="majorBidi" w:ascii="Arial" w:hAnsi="Arial"/>
+      <w:rFonts w:asciiTheme="majorHAnsi" w:eastAsiaTheme="majorEastAsia" w:hAnsiTheme="majorHAnsi" w:cstheme="majorBidi"/>
       <w:b/>
       <w:bCs/>
-      <w:color w:val="000000"/>
-      <w:sz w:val="24"/>
+      <w:color w:val="365F91" w:themeColor="accent1" w:themeShade="BF"/>
+      <w:sz w:val="28"/>
       <w:szCs w:val="28"/>
     </w:rPr>
   </w:style>
@@ -881,15 +675,15 @@
     <w:pPr>
       <w:keepNext/>
       <w:keepLines/>
-      <w:spacing w:before="140" w:after="100"/>
+      <w:spacing w:before="200" w:after="0"/>
       <w:outlineLvl w:val="1"/>
     </w:pPr>
     <w:rPr>
-      <w:rFonts w:asciiTheme="majorHAnsi" w:eastAsiaTheme="majorEastAsia" w:hAnsiTheme="majorHAnsi" w:cstheme="majorBidi" w:ascii="Arial" w:hAnsi="Arial"/>
+      <w:rFonts w:asciiTheme="majorHAnsi" w:eastAsiaTheme="majorEastAsia" w:hAnsiTheme="majorHAnsi" w:cstheme="majorBidi"/>
       <w:b/>
       <w:bCs/>
-      <w:color w:val="000000"/>
-      <w:sz w:val="22"/>
+      <w:color w:val="4F81BD" w:themeColor="accent1"/>
+      <w:sz w:val="26"/>
       <w:szCs w:val="26"/>
     </w:rPr>
   </w:style>
@@ -1143,13 +937,15 @@
     <w:qFormat/>
     <w:rsid w:val="00FC693F"/>
     <w:pPr>
-      <w:spacing w:after="100" w:line="240" w:lineRule="auto"/>
+      <w:pBdr>
+        <w:bottom w:val="single" w:sz="8" w:space="4" w:color="4F81BD" w:themeColor="accent1"/>
+      </w:pBdr>
+      <w:spacing w:after="300" w:line="240" w:lineRule="auto"/>
       <w:contextualSpacing/>
     </w:pPr>
     <w:rPr>
-      <w:rFonts w:asciiTheme="majorHAnsi" w:eastAsiaTheme="majorEastAsia" w:hAnsiTheme="majorHAnsi" w:cstheme="majorBidi" w:ascii="Arial" w:hAnsi="Arial"/>
-      <w:b/>
-      <w:color w:val="000000"/>
+      <w:rFonts w:asciiTheme="majorHAnsi" w:eastAsiaTheme="majorEastAsia" w:hAnsiTheme="majorHAnsi" w:cstheme="majorBidi"/>
+      <w:color w:val="17365D" w:themeColor="text2" w:themeShade="BF"/>
       <w:spacing w:val="5"/>
       <w:kern w:val="28"/>
       <w:sz w:val="52"/>
@@ -1183,15 +979,14 @@
       <w:numPr>
         <w:ilvl w:val="1"/>
       </w:numPr>
-      <w:spacing w:after="100"/>
     </w:pPr>
     <w:rPr>
-      <w:rFonts w:asciiTheme="majorHAnsi" w:eastAsiaTheme="majorEastAsia" w:hAnsiTheme="majorHAnsi" w:cstheme="majorBidi" w:ascii="Arial" w:hAnsi="Arial"/>
+      <w:rFonts w:asciiTheme="majorHAnsi" w:eastAsiaTheme="majorEastAsia" w:hAnsiTheme="majorHAnsi" w:cstheme="majorBidi"/>
       <w:i/>
       <w:iCs/>
-      <w:color w:val="000000"/>
+      <w:color w:val="4F81BD" w:themeColor="accent1"/>
       <w:spacing w:val="15"/>
-      <w:sz w:val="21"/>
+      <w:sz w:val="24"/>
       <w:szCs w:val="24"/>
     </w:rPr>
   </w:style>
@@ -1327,14 +1122,8 @@
       <w:numPr>
         <w:numId w:val="1"/>
       </w:numPr>
-      <w:spacing w:after="100"/>
       <w:contextualSpacing/>
     </w:pPr>
-    <w:rPr>
-      <w:rFonts w:ascii="Arial" w:hAnsi="Arial"/>
-      <w:color w:val="000000"/>
-      <w:sz w:val="21"/>
-    </w:rPr>
   </w:style>
   <w:style w:type="paragraph" w:styleId="ListBullet2">
     <w:name w:val="List Bullet 2"/>
@@ -1635,6 +1424,9 @@
     <w:qFormat/>
     <w:rsid w:val="00FC693F"/>
     <w:pPr>
+      <w:pBdr>
+        <w:bottom w:val="single" w:sz="4" w:space="4" w:color="4F81BD" w:themeColor="accent1"/>
+      </w:pBdr>
       <w:spacing w:before="200" w:after="280"/>
       <w:ind w:left="936" w:right="936"/>
     </w:pPr>

</xml_diff>

<commit_message>
Update the résumé: Parwah current, Vahdam Apr to Sep 2026, no em dashes
The résumé PDFs still listed Vahdam as the current role ("2026") and
Parwah as a side build. They now match the site:
- Parwah, family care for India, Sep 2026 to Present, as the current role
- Vahdam India, AGM, Product Management and D2C Growth, Apr to Sep 2026,
  with the lifecycle OS and UK revenue line the site already states
- profile names Parwah; Parwah removed from the side-build list
- no em dashes

Edited in the .docx and exported with LibreOffice, so resume.pdf and the
freelance PDF stay identical to the Word file.

Co-Authored-By: Claude Opus 5.5 <noreply@anthropic.com>
Claude-Session: https://claude.ai/code/session_016FVNHrhHTDcKbXYRWtCNxb
</commit_message>
<xml_diff>
--- a/assets/anchit-tandon-freelance-resume.docx
+++ b/assets/anchit-tandon-freelance-resume.docx
@@ -42,7 +42,7 @@
         <w:ind w:left="144"/>
       </w:pPr>
       <w:r>
-        <w:t xml:space="preserve">Engineer turned product leader with experience across consumer platforms, subscriptions, sales operations and international ecommerce. Connects problem definition, customer journeys, AI-assisted development and experimentation to deliver useful products and improve conversion, retention and operational efficiency. Available for freelance builds and fractional product and growth engagements.</w:t>
+        <w:t xml:space="preserve">Engineer turned product leader with experience across consumer platforms, subscriptions, sales operations and international ecommerce. Connects problem definition, customer journeys, AI-assisted development and experimentation to deliver useful products and improve conversion, retention and operational efficiency. Currently building Parwah, a family care product for India, and available for freelance builds and fractional product and growth engagements.</w:t>
       </w:r>
     </w:p>
     <w:p>
@@ -81,7 +81,34 @@
         <w:rPr>
           <w:b/>
         </w:rPr>
-        <w:t xml:space="preserve">Vahdam India — Assistant General Manager, Product Management  |  2026</w:t>
+        <w:t xml:space="preserve">Parwah, family care for India  |  Sep 2026 – Present</w:t>
+      </w:r>
+    </w:p>
+    <w:p>
+      <w:pPr>
+        <w:ind w:left="360"/>
+      </w:pPr>
+      <w:r>
+        <w:t xml:space="preserve">•  Building one app for the whole family with parents at the centre: daily check-in, SOS, booking anything for them, sending money safely. Designed senior-first, with every share chosen by the parent, visible to them and revocable in one tap.</w:t>
+      </w:r>
+    </w:p>
+    <w:p>
+      <w:pPr>
+        <w:ind w:left="360"/>
+      </w:pPr>
+      <w:r>
+        <w:t xml:space="preserve">•  Working website live at parwah-hq.anchit-tandon.com; taking select freelance and consulting work alongside it.</w:t>
+      </w:r>
+    </w:p>
+    <w:p>
+      <w:pPr>
+        <w:ind w:left="144"/>
+      </w:pPr>
+      <w:r>
+        <w:rPr>
+          <w:b/>
+        </w:rPr>
+        <w:t xml:space="preserve">Vahdam India, AGM, Product Management and D2C Growth  |  Apr 2026 – Sep 2026</w:t>
       </w:r>
     </w:p>
     <w:p>
@@ -98,6 +125,14 @@
       </w:pPr>
       <w:r>
         <w:t xml:space="preserve">•  Designed and executed product and CRM experiments, including lifecycle campaigns through Klaviyo and WebEngage and customer-rating improvement initiatives.</w:t>
+      </w:r>
+    </w:p>
+    <w:p>
+      <w:pPr>
+        <w:ind w:left="360"/>
+      </w:pPr>
+      <w:r>
+        <w:t xml:space="preserve">•  Helped build a customer lifecycle and retention OS that links analytics, planning, segmentation and mailer generation in one loop, and helped lift UK marketing revenue in the first two months.</w:t>
       </w:r>
     </w:p>
     <w:p>
@@ -223,7 +258,7 @@
         <w:rPr>
           <w:b/>
         </w:rPr>
-        <w:t xml:space="preserve">Citymall — Software Engineer  |  Mar 2022 – Jun 2022</w:t>
+        <w:t xml:space="preserve">Citymall, Software Engineer  |  Mar 2022 – Jun 2022</w:t>
       </w:r>
     </w:p>
     <w:p>
@@ -242,7 +277,7 @@
         <w:rPr>
           <w:b/>
         </w:rPr>
-        <w:t xml:space="preserve">Tuple Technologies — Software Engineer  |  Apr 2020 – Mar 2022</w:t>
+        <w:t xml:space="preserve">Tuple Technologies, Software Engineer  |  Apr 2020 – Mar 2022</w:t>
       </w:r>
     </w:p>
     <w:p>
@@ -287,7 +322,7 @@
         <w:rPr>
           <w:b/>
         </w:rPr>
-        <w:t xml:space="preserve">Third Eye — Personal AI assistant</w:t>
+        <w:t xml:space="preserve">Third Eye, Personal AI assistant</w:t>
       </w:r>
     </w:p>
     <w:p>
@@ -306,7 +341,7 @@
         <w:rPr>
           <w:b/>
         </w:rPr>
-        <w:t xml:space="preserve">Lifecycle OS — Marketing workflow application</w:t>
+        <w:t xml:space="preserve">Lifecycle OS, Marketing workflow application</w:t>
       </w:r>
     </w:p>
     <w:p>
@@ -325,26 +360,7 @@
         <w:rPr>
           <w:b/>
         </w:rPr>
-        <w:t xml:space="preserve">Parwah — Family coordination and care</w:t>
-      </w:r>
-    </w:p>
-    <w:p>
-      <w:pPr>
-        <w:ind w:left="360"/>
-      </w:pPr>
-      <w:r>
-        <w:t xml:space="preserve">•  Designed and built workflows for shared memory, care requests, reminders and family coordination, with permission-aware product requirements.</w:t>
-      </w:r>
-    </w:p>
-    <w:p>
-      <w:pPr>
-        <w:ind w:left="144"/>
-      </w:pPr>
-      <w:r>
-        <w:rPr>
-          <w:b/>
-        </w:rPr>
-        <w:t xml:space="preserve">The Passion Table — Subscription and ordering product</w:t>
+        <w:t xml:space="preserve">The Passion Table, Subscription and ordering product</w:t>
       </w:r>
     </w:p>
     <w:p>

</xml_diff>

<commit_message>
Update the résumé: Parwah current, Vahdam Apr to Sep 2026, no em dashes (#244)
The résumé PDFs still listed Vahdam as the current role ("2026") and
Parwah as a side build. They now match the site:
- Parwah, family care for India, Sep 2026 to Present, as the current role
- Vahdam India, AGM, Product Management and D2C Growth, Apr to Sep 2026,
  with the lifecycle OS and UK revenue line the site already states
- profile names Parwah; Parwah removed from the side-build list
- no em dashes

Edited in the .docx and exported with LibreOffice, so resume.pdf and the
freelance PDF stay identical to the Word file.


Claude-Session: https://claude.ai/code/session_016FVNHrhHTDcKbXYRWtCNxb

Co-authored-by: Claude <noreply@anthropic.com>
</commit_message>
<xml_diff>
--- a/assets/anchit-tandon-freelance-resume.docx
+++ b/assets/anchit-tandon-freelance-resume.docx
@@ -42,7 +42,7 @@
         <w:ind w:left="144"/>
       </w:pPr>
       <w:r>
-        <w:t xml:space="preserve">Engineer turned product leader with experience across consumer platforms, subscriptions, sales operations and international ecommerce. Connects problem definition, customer journeys, AI-assisted development and experimentation to deliver useful products and improve conversion, retention and operational efficiency. Available for freelance builds and fractional product and growth engagements.</w:t>
+        <w:t xml:space="preserve">Engineer turned product leader with experience across consumer platforms, subscriptions, sales operations and international ecommerce. Connects problem definition, customer journeys, AI-assisted development and experimentation to deliver useful products and improve conversion, retention and operational efficiency. Currently building Parwah, a family care product for India, and available for freelance builds and fractional product and growth engagements.</w:t>
       </w:r>
     </w:p>
     <w:p>
@@ -81,7 +81,34 @@
         <w:rPr>
           <w:b/>
         </w:rPr>
-        <w:t xml:space="preserve">Vahdam India — Assistant General Manager, Product Management  |  2026</w:t>
+        <w:t xml:space="preserve">Parwah, family care for India  |  Sep 2026 – Present</w:t>
+      </w:r>
+    </w:p>
+    <w:p>
+      <w:pPr>
+        <w:ind w:left="360"/>
+      </w:pPr>
+      <w:r>
+        <w:t xml:space="preserve">•  Building one app for the whole family with parents at the centre: daily check-in, SOS, booking anything for them, sending money safely. Designed senior-first, with every share chosen by the parent, visible to them and revocable in one tap.</w:t>
+      </w:r>
+    </w:p>
+    <w:p>
+      <w:pPr>
+        <w:ind w:left="360"/>
+      </w:pPr>
+      <w:r>
+        <w:t xml:space="preserve">•  Working website live at parwah-hq.anchit-tandon.com; taking select freelance and consulting work alongside it.</w:t>
+      </w:r>
+    </w:p>
+    <w:p>
+      <w:pPr>
+        <w:ind w:left="144"/>
+      </w:pPr>
+      <w:r>
+        <w:rPr>
+          <w:b/>
+        </w:rPr>
+        <w:t xml:space="preserve">Vahdam India, AGM, Product Management and D2C Growth  |  Apr 2026 – Sep 2026</w:t>
       </w:r>
     </w:p>
     <w:p>
@@ -98,6 +125,14 @@
       </w:pPr>
       <w:r>
         <w:t xml:space="preserve">•  Designed and executed product and CRM experiments, including lifecycle campaigns through Klaviyo and WebEngage and customer-rating improvement initiatives.</w:t>
+      </w:r>
+    </w:p>
+    <w:p>
+      <w:pPr>
+        <w:ind w:left="360"/>
+      </w:pPr>
+      <w:r>
+        <w:t xml:space="preserve">•  Helped build a customer lifecycle and retention OS that links analytics, planning, segmentation and mailer generation in one loop, and helped lift UK marketing revenue in the first two months.</w:t>
       </w:r>
     </w:p>
     <w:p>
@@ -223,7 +258,7 @@
         <w:rPr>
           <w:b/>
         </w:rPr>
-        <w:t xml:space="preserve">Citymall — Software Engineer  |  Mar 2022 – Jun 2022</w:t>
+        <w:t xml:space="preserve">Citymall, Software Engineer  |  Mar 2022 – Jun 2022</w:t>
       </w:r>
     </w:p>
     <w:p>
@@ -242,7 +277,7 @@
         <w:rPr>
           <w:b/>
         </w:rPr>
-        <w:t xml:space="preserve">Tuple Technologies — Software Engineer  |  Apr 2020 – Mar 2022</w:t>
+        <w:t xml:space="preserve">Tuple Technologies, Software Engineer  |  Apr 2020 – Mar 2022</w:t>
       </w:r>
     </w:p>
     <w:p>
@@ -287,7 +322,7 @@
         <w:rPr>
           <w:b/>
         </w:rPr>
-        <w:t xml:space="preserve">Third Eye — Personal AI assistant</w:t>
+        <w:t xml:space="preserve">Third Eye, Personal AI assistant</w:t>
       </w:r>
     </w:p>
     <w:p>
@@ -306,7 +341,7 @@
         <w:rPr>
           <w:b/>
         </w:rPr>
-        <w:t xml:space="preserve">Lifecycle OS — Marketing workflow application</w:t>
+        <w:t xml:space="preserve">Lifecycle OS, Marketing workflow application</w:t>
       </w:r>
     </w:p>
     <w:p>
@@ -325,26 +360,7 @@
         <w:rPr>
           <w:b/>
         </w:rPr>
-        <w:t xml:space="preserve">Parwah — Family coordination and care</w:t>
-      </w:r>
-    </w:p>
-    <w:p>
-      <w:pPr>
-        <w:ind w:left="360"/>
-      </w:pPr>
-      <w:r>
-        <w:t xml:space="preserve">•  Designed and built workflows for shared memory, care requests, reminders and family coordination, with permission-aware product requirements.</w:t>
-      </w:r>
-    </w:p>
-    <w:p>
-      <w:pPr>
-        <w:ind w:left="144"/>
-      </w:pPr>
-      <w:r>
-        <w:rPr>
-          <w:b/>
-        </w:rPr>
-        <w:t xml:space="preserve">The Passion Table — Subscription and ordering product</w:t>
+        <w:t xml:space="preserve">The Passion Table, Subscription and ordering product</w:t>
       </w:r>
     </w:p>
     <w:p>

</xml_diff>

<commit_message>
Résumé: back each engagement offer with a number
"Engagement focus" listed what I offer with no evidence. Each line now
ends with a bold "Proof:" taken from results the site already states:
AI TeleSuite behind INR 15 lakh to 80 lakh a month, the ET Markets
revamp's +27% engagement and INR 3 crore+, 400%+ ROI and +10%
retention, and leads from about 30 to 150+ a day with +25% app DAU.
No new figures.

Co-Authored-By: Claude Opus 5.5 <noreply@anthropic.com>
Claude-Session: https://claude.ai/code/session_016FVNHrhHTDcKbXYRWtCNxb
</commit_message>
<xml_diff>
--- a/assets/anchit-tandon-freelance-resume.docx
+++ b/assets/anchit-tandon-freelance-resume.docx
@@ -47,7 +47,7 @@
         </w:rPr>
         <w:t xml:space="preserve">Delhi, India  |  +91 9873945238  |  </w:t>
       </w:r>
-      <w:hyperlink w:history="1" r:id="rIdxx57bc3wuqgsvj5rnxemv">
+      <w:hyperlink w:history="1" r:id="rId3tcycaoeyad3yemfvv48h">
         <w:r>
           <w:rPr>
             <w:rFonts w:ascii="Calibri" w:cs="Calibri" w:eastAsia="Calibri" w:hAnsi="Calibri"/>
@@ -67,7 +67,7 @@
         </w:rPr>
         <w:t xml:space="preserve">  |  </w:t>
       </w:r>
-      <w:hyperlink w:history="1" r:id="rIdlut16swgj_rk-d97zosma">
+      <w:hyperlink w:history="1" r:id="rIdzqahqfy0upd-hp0qq8zgt">
         <w:r>
           <w:rPr>
             <w:rFonts w:ascii="Calibri" w:cs="Calibri" w:eastAsia="Calibri" w:hAnsi="Calibri"/>
@@ -87,7 +87,7 @@
         </w:rPr>
         <w:t xml:space="preserve">  |  </w:t>
       </w:r>
-      <w:hyperlink w:history="1" r:id="rIdvvptbu_nsot7epzh8rzrw">
+      <w:hyperlink w:history="1" r:id="rIdrzjyrgu_llrdwkkbfs8vu">
         <w:r>
           <w:rPr>
             <w:rFonts w:ascii="Calibri" w:cs="Calibri" w:eastAsia="Calibri" w:hAnsi="Calibri"/>
@@ -1056,73 +1056,153 @@
           <w:ilvl w:val="0"/>
           <w:numId w:val="2"/>
         </w:numPr>
-        <w:spacing w:after="30" w:before="0" w:line="264"/>
-      </w:pPr>
-      <w:r>
-        <w:rPr>
-          <w:rFonts w:ascii="Calibri" w:cs="Calibri" w:eastAsia="Calibri" w:hAnsi="Calibri"/>
-          <w:color w:val="161312"/>
-          <w:sz w:val="20"/>
-          <w:szCs w:val="20"/>
-        </w:rPr>
-        <w:t xml:space="preserve">AI workflows and internal tools: call review, knowledge assistants, reporting dashboards and scoped integrations with human review.</w:t>
-      </w:r>
-    </w:p>
-    <w:p>
-      <w:pPr>
-        <w:pStyle w:val="ListParagraph"/>
-        <w:numPr>
-          <w:ilvl w:val="0"/>
-          <w:numId w:val="2"/>
-        </w:numPr>
-        <w:spacing w:after="30" w:before="0" w:line="264"/>
-      </w:pPr>
-      <w:r>
-        <w:rPr>
-          <w:rFonts w:ascii="Calibri" w:cs="Calibri" w:eastAsia="Calibri" w:hAnsi="Calibri"/>
-          <w:color w:val="161312"/>
-          <w:sz w:val="20"/>
-          <w:szCs w:val="20"/>
-        </w:rPr>
-        <w:t xml:space="preserve">Conversion-focused websites: clear offer positioning, enquiry or purchase journeys, CRM integrations and full-funnel measurement.</w:t>
-      </w:r>
-    </w:p>
-    <w:p>
-      <w:pPr>
-        <w:pStyle w:val="ListParagraph"/>
-        <w:numPr>
-          <w:ilvl w:val="0"/>
-          <w:numId w:val="2"/>
-        </w:numPr>
-        <w:spacing w:after="30" w:before="0" w:line="264"/>
-      </w:pPr>
-      <w:r>
-        <w:rPr>
-          <w:rFonts w:ascii="Calibri" w:cs="Calibri" w:eastAsia="Calibri" w:hAnsi="Calibri"/>
-          <w:color w:val="161312"/>
-          <w:sz w:val="20"/>
-          <w:szCs w:val="20"/>
-        </w:rPr>
-        <w:t xml:space="preserve">Fractional product and growth: roadmap prioritisation, zero-to-one launches, conversion experiments and subscription or ecommerce retention.</w:t>
-      </w:r>
-    </w:p>
-    <w:p>
-      <w:pPr>
-        <w:pStyle w:val="ListParagraph"/>
-        <w:numPr>
-          <w:ilvl w:val="0"/>
-          <w:numId w:val="2"/>
-        </w:numPr>
-        <w:spacing w:after="30" w:before="0" w:line="264"/>
-      </w:pPr>
-      <w:r>
-        <w:rPr>
-          <w:rFonts w:ascii="Calibri" w:cs="Calibri" w:eastAsia="Calibri" w:hAnsi="Calibri"/>
-          <w:color w:val="161312"/>
-          <w:sz w:val="20"/>
-          <w:szCs w:val="20"/>
-        </w:rPr>
-        <w:t xml:space="preserve">Focused web MVPs: one core customer journey shipped end to end, with agreed acceptance criteria and a clean handover.</w:t>
+        <w:spacing w:after="40" w:before="0" w:line="264"/>
+      </w:pPr>
+      <w:r>
+        <w:rPr>
+          <w:rFonts w:ascii="Calibri" w:cs="Calibri" w:eastAsia="Calibri" w:hAnsi="Calibri"/>
+          <w:color w:val="161312"/>
+          <w:sz w:val="20"/>
+          <w:szCs w:val="20"/>
+        </w:rPr>
+        <w:t xml:space="preserve">AI workflows and internal tools: call review, knowledge assistants, reporting dashboards and scoped integrations with human review. </w:t>
+      </w:r>
+      <w:r>
+        <w:rPr>
+          <w:rFonts w:ascii="Calibri" w:cs="Calibri" w:eastAsia="Calibri" w:hAnsi="Calibri"/>
+          <w:b/>
+          <w:bCs/>
+          <w:color w:val="8A6D2F"/>
+          <w:sz w:val="20"/>
+          <w:szCs w:val="20"/>
+        </w:rPr>
+        <w:t xml:space="preserve">Proof: </w:t>
+      </w:r>
+      <w:r>
+        <w:rPr>
+          <w:rFonts w:ascii="Calibri" w:cs="Calibri" w:eastAsia="Calibri" w:hAnsi="Calibri"/>
+          <w:color w:val="161312"/>
+          <w:sz w:val="20"/>
+          <w:szCs w:val="20"/>
+        </w:rPr>
+        <w:t xml:space="preserve">AI TeleSuite helped scale assisted-sales revenue from INR 15 lakh to INR 80 lakh a month.</w:t>
+      </w:r>
+    </w:p>
+    <w:p>
+      <w:pPr>
+        <w:pStyle w:val="ListParagraph"/>
+        <w:numPr>
+          <w:ilvl w:val="0"/>
+          <w:numId w:val="2"/>
+        </w:numPr>
+        <w:spacing w:after="40" w:before="0" w:line="264"/>
+      </w:pPr>
+      <w:r>
+        <w:rPr>
+          <w:rFonts w:ascii="Calibri" w:cs="Calibri" w:eastAsia="Calibri" w:hAnsi="Calibri"/>
+          <w:color w:val="161312"/>
+          <w:sz w:val="20"/>
+          <w:szCs w:val="20"/>
+        </w:rPr>
+        <w:t xml:space="preserve">Conversion-focused websites: clear offer positioning, enquiry or purchase journeys, CRM integrations and full-funnel measurement. </w:t>
+      </w:r>
+      <w:r>
+        <w:rPr>
+          <w:rFonts w:ascii="Calibri" w:cs="Calibri" w:eastAsia="Calibri" w:hAnsi="Calibri"/>
+          <w:b/>
+          <w:bCs/>
+          <w:color w:val="8A6D2F"/>
+          <w:sz w:val="20"/>
+          <w:szCs w:val="20"/>
+        </w:rPr>
+        <w:t xml:space="preserve">Proof: </w:t>
+      </w:r>
+      <w:r>
+        <w:rPr>
+          <w:rFonts w:ascii="Calibri" w:cs="Calibri" w:eastAsia="Calibri" w:hAnsi="Calibri"/>
+          <w:color w:val="161312"/>
+          <w:sz w:val="20"/>
+          <w:szCs w:val="20"/>
+        </w:rPr>
+        <w:t xml:space="preserve">The ET Markets web revamp lifted engagement 27% and unlocked INR 3 crore+ in incremental annual revenue.</w:t>
+      </w:r>
+    </w:p>
+    <w:p>
+      <w:pPr>
+        <w:pStyle w:val="ListParagraph"/>
+        <w:numPr>
+          <w:ilvl w:val="0"/>
+          <w:numId w:val="2"/>
+        </w:numPr>
+        <w:spacing w:after="40" w:before="0" w:line="264"/>
+      </w:pPr>
+      <w:r>
+        <w:rPr>
+          <w:rFonts w:ascii="Calibri" w:cs="Calibri" w:eastAsia="Calibri" w:hAnsi="Calibri"/>
+          <w:color w:val="161312"/>
+          <w:sz w:val="20"/>
+          <w:szCs w:val="20"/>
+        </w:rPr>
+        <w:t xml:space="preserve">Fractional product and growth: roadmap prioritisation, zero-to-one launches, conversion experiments and subscription or ecommerce retention. </w:t>
+      </w:r>
+      <w:r>
+        <w:rPr>
+          <w:rFonts w:ascii="Calibri" w:cs="Calibri" w:eastAsia="Calibri" w:hAnsi="Calibri"/>
+          <w:b/>
+          <w:bCs/>
+          <w:color w:val="8A6D2F"/>
+          <w:sz w:val="20"/>
+          <w:szCs w:val="20"/>
+        </w:rPr>
+        <w:t xml:space="preserve">Proof: </w:t>
+      </w:r>
+      <w:r>
+        <w:rPr>
+          <w:rFonts w:ascii="Calibri" w:cs="Calibri" w:eastAsia="Calibri" w:hAnsi="Calibri"/>
+          <w:color w:val="161312"/>
+          <w:sz w:val="20"/>
+          <w:szCs w:val="20"/>
+        </w:rPr>
+        <w:t xml:space="preserve">400%+ ROI within six months on an assisted-conversion funnel; subscriber retention up 10%.</w:t>
+      </w:r>
+    </w:p>
+    <w:p>
+      <w:pPr>
+        <w:pStyle w:val="ListParagraph"/>
+        <w:numPr>
+          <w:ilvl w:val="0"/>
+          <w:numId w:val="2"/>
+        </w:numPr>
+        <w:spacing w:after="40" w:before="0" w:line="264"/>
+      </w:pPr>
+      <w:r>
+        <w:rPr>
+          <w:rFonts w:ascii="Calibri" w:cs="Calibri" w:eastAsia="Calibri" w:hAnsi="Calibri"/>
+          <w:color w:val="161312"/>
+          <w:sz w:val="20"/>
+          <w:szCs w:val="20"/>
+        </w:rPr>
+        <w:t xml:space="preserve">Focused web MVPs and journeys: one core customer journey shipped end to end, with agreed acceptance criteria and a clean handover. </w:t>
+      </w:r>
+      <w:r>
+        <w:rPr>
+          <w:rFonts w:ascii="Calibri" w:cs="Calibri" w:eastAsia="Calibri" w:hAnsi="Calibri"/>
+          <w:b/>
+          <w:bCs/>
+          <w:color w:val="8A6D2F"/>
+          <w:sz w:val="20"/>
+          <w:szCs w:val="20"/>
+        </w:rPr>
+        <w:t xml:space="preserve">Proof: </w:t>
+      </w:r>
+      <w:r>
+        <w:rPr>
+          <w:rFonts w:ascii="Calibri" w:cs="Calibri" w:eastAsia="Calibri" w:hAnsi="Calibri"/>
+          <w:color w:val="161312"/>
+          <w:sz w:val="20"/>
+          <w:szCs w:val="20"/>
+        </w:rPr>
+        <w:t xml:space="preserve">Assisted Buying took qualified leads from about 30 to 150+ a day; the app revamp grew daily active users 25%.</w:t>
       </w:r>
     </w:p>
     <w:p>

</xml_diff>

<commit_message>
Résumé: describe Parwah and the side builds as the 20-products posts do
The Parwah entry came from an old site card (daily check-in, SOS,
sending money). The owner's Day 3 post describes the product as built:
a family-care task app for siblings sharing their ageing parents' care,
where every need moves open, assigned, claimed, done, tasks can be
handed back with history kept, and every action is permission-checked.

Also aligned with the same posts: The Third Eye (personal AI OS, 24
tools plus 76 linked apps, four modes, Razorpay credit packs, apps),
LifeCycle-OS (plan in seconds, missing facts marked rather than
invented, tested brand isolation), The Passion Table (neighbourhood
kitchens; subscription, on-demand with live tracking, or a reserved
table), and the inaugural Delhi Half Marathon's 18K+ runners.

Co-Authored-By: Claude Opus 5.5 <noreply@anthropic.com>
Claude-Session: https://claude.ai/code/session_016FVNHrhHTDcKbXYRWtCNxb
</commit_message>
<xml_diff>
--- a/assets/anchit-tandon-freelance-resume.docx
+++ b/assets/anchit-tandon-freelance-resume.docx
@@ -47,7 +47,7 @@
         </w:rPr>
         <w:t xml:space="preserve">Delhi, India  |  +91 9873945238  |  </w:t>
       </w:r>
-      <w:hyperlink w:history="1" r:id="rId3tcycaoeyad3yemfvv48h">
+      <w:hyperlink w:history="1" r:id="rId4muqldq5wbfdhjzsb47s6">
         <w:r>
           <w:rPr>
             <w:rFonts w:ascii="Calibri" w:cs="Calibri" w:eastAsia="Calibri" w:hAnsi="Calibri"/>
@@ -67,7 +67,7 @@
         </w:rPr>
         <w:t xml:space="preserve">  |  </w:t>
       </w:r>
-      <w:hyperlink w:history="1" r:id="rIdzqahqfy0upd-hp0qq8zgt">
+      <w:hyperlink w:history="1" r:id="rId2yzcm8q5w66qpvq5gjljq">
         <w:r>
           <w:rPr>
             <w:rFonts w:ascii="Calibri" w:cs="Calibri" w:eastAsia="Calibri" w:hAnsi="Calibri"/>
@@ -87,7 +87,7 @@
         </w:rPr>
         <w:t xml:space="preserve">  |  </w:t>
       </w:r>
-      <w:hyperlink w:history="1" r:id="rIdrzjyrgu_llrdwkkbfs8vu">
+      <w:hyperlink w:history="1" r:id="rId9gpnirje5pejaphl6yag7">
         <w:r>
           <w:rPr>
             <w:rFonts w:ascii="Calibri" w:cs="Calibri" w:eastAsia="Calibri" w:hAnsi="Calibri"/>
@@ -131,7 +131,7 @@
           <w:sz w:val="20"/>
           <w:szCs w:val="20"/>
         </w:rPr>
-        <w:t xml:space="preserve">Engineer turned product leader across consumer platforms, subscriptions, sales operations and international ecommerce. I connect problem definition, customer journeys, AI-assisted development and experimentation to ship products that lift conversion, retention and operational efficiency. Currently building Parwah, a family care product for India, and available for freelance builds and fractional product and growth engagements.</w:t>
+        <w:t xml:space="preserve">Engineer turned product leader across consumer platforms, subscriptions, sales operations and international ecommerce. I connect problem definition, customer journeys, AI-assisted development and experimentation to ship products that lift conversion, retention and operational efficiency. Currently building Parwah, a family-care app for Indian families looking after ageing parents, and available for freelance builds and fractional product and growth engagements.</w:t>
       </w:r>
     </w:p>
     <w:p>
@@ -207,7 +207,7 @@
           <w:sz w:val="21"/>
           <w:szCs w:val="21"/>
         </w:rPr>
-        <w:t xml:space="preserve">Parwah, family care for India</w:t>
+        <w:t xml:space="preserve">Parwah, family-care app for India</w:t>
       </w:r>
       <w:r>
         <w:rPr>
@@ -235,7 +235,7 @@
           <w:sz w:val="20"/>
           <w:szCs w:val="20"/>
         </w:rPr>
-        <w:t xml:space="preserve">Designing and building one app for the whole family with parents at the centre: daily check-in, SOS, booking anything for them and sending money safely.</w:t>
+        <w:t xml:space="preserve">Building a family-care app for Indian families looking after ageing parents, so siblings in different cities can share their parents’ care without anything slipping.</w:t>
       </w:r>
     </w:p>
     <w:p>
@@ -254,7 +254,7 @@
           <w:sz w:val="20"/>
           <w:szCs w:val="20"/>
         </w:rPr>
-        <w:t xml:space="preserve">Built senior-first (big type, voice-first, three actions per screen) with consent as the product: every share is chosen by the parent, visible to them and revocable in one tap.</w:t>
+        <w:t xml:space="preserve">Treated care as a task problem, not a chat problem: every need moves from open to assigned, claimed and done, with one tap to say “I’m on it”, ending the family WhatsApp group’s “I thought you did”.</w:t>
       </w:r>
     </w:p>
     <w:p>
@@ -273,7 +273,7 @@
           <w:sz w:val="20"/>
           <w:szCs w:val="20"/>
         </w:rPr>
-        <w:t xml:space="preserve">Working website live at parwah-hq.anchit-tandon.com, with a real person to talk to on WhatsApp.</w:t>
+        <w:t xml:space="preserve">Made handing a task back normal: anyone can reopen a need with its full history kept, and every action checks that the right family member is making the change. Live at parwah-hq.anchit-tandon.com.</w:t>
       </w:r>
     </w:p>
     <w:p>
@@ -652,7 +652,7 @@
           <w:sz w:val="20"/>
           <w:szCs w:val="20"/>
         </w:rPr>
-        <w:t xml:space="preserve">Launched paid wellness subscriptions for Times Health Plus, and drove discovery, registration and acquisition journeys for the Times Internet Half Marathon.</w:t>
+        <w:t xml:space="preserve">Launched paid wellness subscriptions for Times Health Plus, and led discovery, registration and acquisition journeys for the inaugural Times Internet Delhi Half Marathon (18K+ runners).</w:t>
       </w:r>
     </w:p>
     <w:p>
@@ -901,7 +901,7 @@
           <w:sz w:val="21"/>
           <w:szCs w:val="21"/>
         </w:rPr>
-        <w:t xml:space="preserve">Third Eye, personal AI assistant</w:t>
+        <w:t xml:space="preserve">The Third Eye, personal AI operating system</w:t>
       </w:r>
       <w:r>
         <w:rPr>
@@ -929,7 +929,7 @@
           <w:sz w:val="20"/>
           <w:szCs w:val="20"/>
         </w:rPr>
-        <w:t xml:space="preserve">Built a full-stack Next.js and Supabase assistant with tool calling, memory, tasks and Google integration, connecting personal context with actions it can take.</w:t>
+        <w:t xml:space="preserve">One assistant across tasks, notes, goals, calendar and email that acts by voice and camera and checks a personal knowledge base before answering: 24 tools built plus 76 linked apps, four assistant modes and Razorpay credit packs. Web and Android/iPhone apps.</w:t>
       </w:r>
     </w:p>
     <w:p>
@@ -949,7 +949,7 @@
           <w:sz w:val="21"/>
           <w:szCs w:val="21"/>
         </w:rPr>
-        <w:t xml:space="preserve">Lifecycle OS, marketing workflow application</w:t>
+        <w:t xml:space="preserve">LifeCycle-OS, lifecycle marketing platform</w:t>
       </w:r>
       <w:r>
         <w:rPr>
@@ -977,7 +977,7 @@
           <w:sz w:val="20"/>
           <w:szCs w:val="20"/>
         </w:rPr>
-        <w:t xml:space="preserve">Built a multi-brand workspace and campaign workflow that links planning, segmentation, content and dispatch in one pipeline.</w:t>
+        <w:t xml:space="preserve">Enter any brand and get a full lifecycle plan in seconds, then turn real customer data into on-brand mailers, ads and landing pages. Missing facts are marked “data required” instead of invented, and brand isolation is enforced in code and tested on every change.</w:t>
       </w:r>
     </w:p>
     <w:p>
@@ -997,7 +997,7 @@
           <w:sz w:val="21"/>
           <w:szCs w:val="21"/>
         </w:rPr>
-        <w:t xml:space="preserve">The Passion Table, subscription and ordering product</w:t>
+        <w:t xml:space="preserve">The Passion Table, home-style food service</w:t>
       </w:r>
       <w:r>
         <w:rPr>
@@ -1025,7 +1025,7 @@
           <w:sz w:val="20"/>
           <w:szCs w:val="20"/>
         </w:rPr>
-        <w:t xml:space="preserve">Built subscription, ordering and fulfilment workflows for a food-service concept, including a test-mode payment journey.</w:t>
+        <w:t xml:space="preserve">Daily home-style meals from neighbourhood kitchens, with three ways to eat from one kitchen: a meal subscription you can pause or change, on-demand ordering with live tracking, or a reserved table.</w:t>
       </w:r>
     </w:p>
     <w:p>

</xml_diff>

<commit_message>
Résumé: make each number in the top band explain itself
The band led with bare figures ("₹15L → ₹80L", "20") that needed the
small print to make sense. Each cell now reads as a headline with one
short line of context: 5× revenue (₹15L → ₹80L a month), 400%+ ROI (ET
Prime, in 6 months), ₹3Cr+ a year (ET Markets revamp), 18K+ runners
(Delhi Half Marathon), 20 AI products (built in 5-6 months).

Co-Authored-By: Claude Opus 5.5 <noreply@anthropic.com>
Claude-Session: https://claude.ai/code/session_016FVNHrhHTDcKbXYRWtCNxb
</commit_message>
<xml_diff>
--- a/assets/anchit-tandon-freelance-resume.docx
+++ b/assets/anchit-tandon-freelance-resume.docx
@@ -56,7 +56,7 @@
         </w:rPr>
         <w:t xml:space="preserve">Delhi, India  |  +91 9873945238  |  </w:t>
       </w:r>
-      <w:hyperlink w:history="1" r:id="rIdtykdznyxpmyyzmnowmn1b">
+      <w:hyperlink w:history="1" r:id="rIdbqdze-oimkmytqmqolad0">
         <w:r>
           <w:rPr>
             <w:rFonts w:ascii="Calibri" w:cs="Calibri" w:eastAsia="Calibri" w:hAnsi="Calibri"/>
@@ -76,7 +76,7 @@
         </w:rPr>
         <w:t xml:space="preserve">  |  </w:t>
       </w:r>
-      <w:hyperlink w:history="1" r:id="rId7ggnrzdgyizxfdexmawc9">
+      <w:hyperlink w:history="1" r:id="rId5ujtu7i26wcdgqyuk6f7p">
         <w:r>
           <w:rPr>
             <w:rFonts w:ascii="Calibri" w:cs="Calibri" w:eastAsia="Calibri" w:hAnsi="Calibri"/>
@@ -96,7 +96,7 @@
         </w:rPr>
         <w:t xml:space="preserve">  |  </w:t>
       </w:r>
-      <w:hyperlink w:history="1" r:id="rIdgrtraxd2_xjyimis07hbj">
+      <w:hyperlink w:history="1" r:id="rIdylyzngttif6jbdisztp9q">
         <w:r>
           <w:rPr>
             <w:rFonts w:ascii="Calibri" w:cs="Calibri" w:eastAsia="Calibri" w:hAnsi="Calibri"/>
@@ -151,10 +151,10 @@
                 <w:b/>
                 <w:bCs/>
                 <w:color w:val="8A6D2F"/>
-                <w:sz w:val="27"/>
-                <w:szCs w:val="27"/>
+                <w:sz w:val="24"/>
+                <w:szCs w:val="24"/>
               </w:rPr>
-              <w:t xml:space="preserve">₹15L → ₹80L</w:t>
+              <w:t xml:space="preserve">5× revenue</w:t>
             </w:r>
           </w:p>
           <w:p>
@@ -169,7 +169,7 @@
                 <w:sz w:val="16"/>
                 <w:szCs w:val="16"/>
               </w:rPr>
-              <w:t xml:space="preserve">monthly assisted-sales revenue</w:t>
+              <w:t xml:space="preserve">₹15L → ₹80L a month</w:t>
             </w:r>
           </w:p>
         </w:tc>
@@ -196,10 +196,10 @@
                 <w:b/>
                 <w:bCs/>
                 <w:color w:val="8A6D2F"/>
-                <w:sz w:val="27"/>
-                <w:szCs w:val="27"/>
+                <w:sz w:val="24"/>
+                <w:szCs w:val="24"/>
               </w:rPr>
-              <w:t xml:space="preserve">400%+</w:t>
+              <w:t xml:space="preserve">400%+ ROI</w:t>
             </w:r>
           </w:p>
           <w:p>
@@ -214,7 +214,7 @@
                 <w:sz w:val="16"/>
                 <w:szCs w:val="16"/>
               </w:rPr>
-              <w:t xml:space="preserve">ROI within six months</w:t>
+              <w:t xml:space="preserve">ET Prime, in 6 months</w:t>
             </w:r>
           </w:p>
         </w:tc>
@@ -241,10 +241,10 @@
                 <w:b/>
                 <w:bCs/>
                 <w:color w:val="8A6D2F"/>
-                <w:sz w:val="27"/>
-                <w:szCs w:val="27"/>
+                <w:sz w:val="24"/>
+                <w:szCs w:val="24"/>
               </w:rPr>
-              <w:t xml:space="preserve">₹3Cr+</w:t>
+              <w:t xml:space="preserve">₹3Cr+ a year</w:t>
             </w:r>
           </w:p>
           <w:p>
@@ -259,7 +259,7 @@
                 <w:sz w:val="16"/>
                 <w:szCs w:val="16"/>
               </w:rPr>
-              <w:t xml:space="preserve">new annual revenue, ET Markets</w:t>
+              <w:t xml:space="preserve">ET Markets revamp</w:t>
             </w:r>
           </w:p>
         </w:tc>
@@ -286,10 +286,10 @@
                 <w:b/>
                 <w:bCs/>
                 <w:color w:val="8A6D2F"/>
-                <w:sz w:val="27"/>
-                <w:szCs w:val="27"/>
+                <w:sz w:val="24"/>
+                <w:szCs w:val="24"/>
               </w:rPr>
-              <w:t xml:space="preserve">18K+</w:t>
+              <w:t xml:space="preserve">18K+ runners</w:t>
             </w:r>
           </w:p>
           <w:p>
@@ -304,7 +304,7 @@
                 <w:sz w:val="16"/>
                 <w:szCs w:val="16"/>
               </w:rPr>
-              <w:t xml:space="preserve">runners, Delhi Half Marathon</w:t>
+              <w:t xml:space="preserve">Delhi Half Marathon</w:t>
             </w:r>
           </w:p>
         </w:tc>
@@ -331,10 +331,10 @@
                 <w:b/>
                 <w:bCs/>
                 <w:color w:val="8A6D2F"/>
-                <w:sz w:val="27"/>
-                <w:szCs w:val="27"/>
+                <w:sz w:val="24"/>
+                <w:szCs w:val="24"/>
               </w:rPr>
-              <w:t xml:space="preserve">20</w:t>
+              <w:t xml:space="preserve">20 AI products</w:t>
             </w:r>
           </w:p>
           <w:p>
@@ -349,7 +349,7 @@
                 <w:sz w:val="16"/>
                 <w:szCs w:val="16"/>
               </w:rPr>
-              <w:t xml:space="preserve">products built in 5‑6 months</w:t>
+              <w:t xml:space="preserve">built in 5‑6 months</w:t>
             </w:r>
           </w:p>
         </w:tc>

</xml_diff>

<commit_message>
Résumé: make each number in the top band explain itself (#249)
The band led with bare figures ("₹15L → ₹80L", "20") that needed the
small print to make sense. Each cell now reads as a headline with one
short line of context: 5× revenue (₹15L → ₹80L a month), 400%+ ROI (ET
Prime, in 6 months), ₹3Cr+ a year (ET Markets revamp), 18K+ runners
(Delhi Half Marathon), 20 AI products (built in 5-6 months).


Claude-Session: https://claude.ai/code/session_016FVNHrhHTDcKbXYRWtCNxb

Co-authored-by: Claude <noreply@anthropic.com>
</commit_message>
<xml_diff>
--- a/assets/anchit-tandon-freelance-resume.docx
+++ b/assets/anchit-tandon-freelance-resume.docx
@@ -56,7 +56,7 @@
         </w:rPr>
         <w:t xml:space="preserve">Delhi, India  |  +91 9873945238  |  </w:t>
       </w:r>
-      <w:hyperlink w:history="1" r:id="rIdtykdznyxpmyyzmnowmn1b">
+      <w:hyperlink w:history="1" r:id="rIdbqdze-oimkmytqmqolad0">
         <w:r>
           <w:rPr>
             <w:rFonts w:ascii="Calibri" w:cs="Calibri" w:eastAsia="Calibri" w:hAnsi="Calibri"/>
@@ -76,7 +76,7 @@
         </w:rPr>
         <w:t xml:space="preserve">  |  </w:t>
       </w:r>
-      <w:hyperlink w:history="1" r:id="rId7ggnrzdgyizxfdexmawc9">
+      <w:hyperlink w:history="1" r:id="rId5ujtu7i26wcdgqyuk6f7p">
         <w:r>
           <w:rPr>
             <w:rFonts w:ascii="Calibri" w:cs="Calibri" w:eastAsia="Calibri" w:hAnsi="Calibri"/>
@@ -96,7 +96,7 @@
         </w:rPr>
         <w:t xml:space="preserve">  |  </w:t>
       </w:r>
-      <w:hyperlink w:history="1" r:id="rIdgrtraxd2_xjyimis07hbj">
+      <w:hyperlink w:history="1" r:id="rIdylyzngttif6jbdisztp9q">
         <w:r>
           <w:rPr>
             <w:rFonts w:ascii="Calibri" w:cs="Calibri" w:eastAsia="Calibri" w:hAnsi="Calibri"/>
@@ -151,10 +151,10 @@
                 <w:b/>
                 <w:bCs/>
                 <w:color w:val="8A6D2F"/>
-                <w:sz w:val="27"/>
-                <w:szCs w:val="27"/>
+                <w:sz w:val="24"/>
+                <w:szCs w:val="24"/>
               </w:rPr>
-              <w:t xml:space="preserve">₹15L → ₹80L</w:t>
+              <w:t xml:space="preserve">5× revenue</w:t>
             </w:r>
           </w:p>
           <w:p>
@@ -169,7 +169,7 @@
                 <w:sz w:val="16"/>
                 <w:szCs w:val="16"/>
               </w:rPr>
-              <w:t xml:space="preserve">monthly assisted-sales revenue</w:t>
+              <w:t xml:space="preserve">₹15L → ₹80L a month</w:t>
             </w:r>
           </w:p>
         </w:tc>
@@ -196,10 +196,10 @@
                 <w:b/>
                 <w:bCs/>
                 <w:color w:val="8A6D2F"/>
-                <w:sz w:val="27"/>
-                <w:szCs w:val="27"/>
+                <w:sz w:val="24"/>
+                <w:szCs w:val="24"/>
               </w:rPr>
-              <w:t xml:space="preserve">400%+</w:t>
+              <w:t xml:space="preserve">400%+ ROI</w:t>
             </w:r>
           </w:p>
           <w:p>
@@ -214,7 +214,7 @@
                 <w:sz w:val="16"/>
                 <w:szCs w:val="16"/>
               </w:rPr>
-              <w:t xml:space="preserve">ROI within six months</w:t>
+              <w:t xml:space="preserve">ET Prime, in 6 months</w:t>
             </w:r>
           </w:p>
         </w:tc>
@@ -241,10 +241,10 @@
                 <w:b/>
                 <w:bCs/>
                 <w:color w:val="8A6D2F"/>
-                <w:sz w:val="27"/>
-                <w:szCs w:val="27"/>
+                <w:sz w:val="24"/>
+                <w:szCs w:val="24"/>
               </w:rPr>
-              <w:t xml:space="preserve">₹3Cr+</w:t>
+              <w:t xml:space="preserve">₹3Cr+ a year</w:t>
             </w:r>
           </w:p>
           <w:p>
@@ -259,7 +259,7 @@
                 <w:sz w:val="16"/>
                 <w:szCs w:val="16"/>
               </w:rPr>
-              <w:t xml:space="preserve">new annual revenue, ET Markets</w:t>
+              <w:t xml:space="preserve">ET Markets revamp</w:t>
             </w:r>
           </w:p>
         </w:tc>
@@ -286,10 +286,10 @@
                 <w:b/>
                 <w:bCs/>
                 <w:color w:val="8A6D2F"/>
-                <w:sz w:val="27"/>
-                <w:szCs w:val="27"/>
+                <w:sz w:val="24"/>
+                <w:szCs w:val="24"/>
               </w:rPr>
-              <w:t xml:space="preserve">18K+</w:t>
+              <w:t xml:space="preserve">18K+ runners</w:t>
             </w:r>
           </w:p>
           <w:p>
@@ -304,7 +304,7 @@
                 <w:sz w:val="16"/>
                 <w:szCs w:val="16"/>
               </w:rPr>
-              <w:t xml:space="preserve">runners, Delhi Half Marathon</w:t>
+              <w:t xml:space="preserve">Delhi Half Marathon</w:t>
             </w:r>
           </w:p>
         </w:tc>
@@ -331,10 +331,10 @@
                 <w:b/>
                 <w:bCs/>
                 <w:color w:val="8A6D2F"/>
-                <w:sz w:val="27"/>
-                <w:szCs w:val="27"/>
+                <w:sz w:val="24"/>
+                <w:szCs w:val="24"/>
               </w:rPr>
-              <w:t xml:space="preserve">20</w:t>
+              <w:t xml:space="preserve">20 AI products</w:t>
             </w:r>
           </w:p>
           <w:p>
@@ -349,7 +349,7 @@
                 <w:sz w:val="16"/>
                 <w:szCs w:val="16"/>
               </w:rPr>
-              <w:t xml:space="preserve">products built in 5‑6 months</w:t>
+              <w:t xml:space="preserve">built in 5‑6 months</w:t>
             </w:r>
           </w:p>
         </w:tc>

</xml_diff>

<commit_message>
Résumé: list all 20 products, clearer top band
- Band: 5× revenue in 4 months, marathon as a new revenue stream,
  "20 products" (the wording of the Day 0 post), and books + music in
  place of the ET Markets revamp (the revamp stays in experience).
- Hire version lists all 20 products from the series: 8 with a short
  description (adds ANCHOR and the book engine with their Instagram
  handles) and 12 on one line each. The three with live blockers say
  "being fixed" instead of linking; AI TeleSuite says "demo on request".
- Still 2 pages; Education moves above the product list.

Co-Authored-By: Claude Opus 5.5 <noreply@anthropic.com>
Claude-Session: https://claude.ai/code/session_016FVNHrhHTDcKbXYRWtCNxb
</commit_message>
<xml_diff>
--- a/assets/anchit-tandon-freelance-resume.docx
+++ b/assets/anchit-tandon-freelance-resume.docx
@@ -56,7 +56,7 @@
         </w:rPr>
         <w:t xml:space="preserve">Delhi, India  |  +91 9873945238  |  </w:t>
       </w:r>
-      <w:hyperlink w:history="1" r:id="rIdbqdze-oimkmytqmqolad0">
+      <w:hyperlink w:history="1" r:id="rIdwplhivaynoyk5bpp-9kxm">
         <w:r>
           <w:rPr>
             <w:rFonts w:ascii="Calibri" w:cs="Calibri" w:eastAsia="Calibri" w:hAnsi="Calibri"/>
@@ -76,7 +76,7 @@
         </w:rPr>
         <w:t xml:space="preserve">  |  </w:t>
       </w:r>
-      <w:hyperlink w:history="1" r:id="rId5ujtu7i26wcdgqyuk6f7p">
+      <w:hyperlink w:history="1" r:id="rId9isl6eybjrmu2_soyqku3">
         <w:r>
           <w:rPr>
             <w:rFonts w:ascii="Calibri" w:cs="Calibri" w:eastAsia="Calibri" w:hAnsi="Calibri"/>
@@ -96,7 +96,7 @@
         </w:rPr>
         <w:t xml:space="preserve">  |  </w:t>
       </w:r>
-      <w:hyperlink w:history="1" r:id="rIdylyzngttif6jbdisztp9q">
+      <w:hyperlink w:history="1" r:id="rIddfkwdwhoob1zfkl6t52he">
         <w:r>
           <w:rPr>
             <w:rFonts w:ascii="Calibri" w:cs="Calibri" w:eastAsia="Calibri" w:hAnsi="Calibri"/>
@@ -110,7 +110,7 @@
     </w:p>
     <w:tbl>
       <w:tblPr>
-        <w:tblW w:type="dxa" w:w="10280"/>
+        <w:tblW w:type="dxa" w:w="10282"/>
         <w:tblBorders>
           <w:top w:val="none" w:color="FFFFFF" w:sz="0"/>
           <w:left w:val="none" w:color="FFFFFF" w:sz="0"/>
@@ -121,22 +121,22 @@
         </w:tblBorders>
       </w:tblPr>
       <w:tblGrid>
-        <w:gridCol w:w="2056"/>
-        <w:gridCol w:w="2056"/>
-        <w:gridCol w:w="2056"/>
-        <w:gridCol w:w="2056"/>
-        <w:gridCol w:w="2056"/>
+        <w:gridCol w:w="2100"/>
+        <w:gridCol w:w="1650"/>
+        <w:gridCol w:w="2450"/>
+        <w:gridCol w:w="1750"/>
+        <w:gridCol w:w="2332"/>
       </w:tblGrid>
       <w:tr>
         <w:tc>
           <w:tcPr>
-            <w:tcW w:type="dxa" w:w="2056"/>
+            <w:tcW w:type="dxa" w:w="2100"/>
             <w:shd w:fill="F6F1E7" w:color="auto" w:val="clear"/>
             <w:tcMar>
-              <w:top w:type="dxa" w:w="90"/>
-              <w:left w:type="dxa" w:w="80"/>
-              <w:bottom w:type="dxa" w:w="90"/>
-              <w:right w:type="dxa" w:w="80"/>
+              <w:top w:type="dxa" w:w="80"/>
+              <w:left w:type="dxa" w:w="40"/>
+              <w:bottom w:type="dxa" w:w="80"/>
+              <w:right w:type="dxa" w:w="40"/>
             </w:tcMar>
             <w:vAlign w:val="center"/>
           </w:tcPr>
@@ -151,8 +151,8 @@
                 <w:b/>
                 <w:bCs/>
                 <w:color w:val="8A6D2F"/>
-                <w:sz w:val="24"/>
-                <w:szCs w:val="24"/>
+                <w:sz w:val="23"/>
+                <w:szCs w:val="23"/>
               </w:rPr>
               <w:t xml:space="preserve">5× revenue</w:t>
             </w:r>
@@ -166,22 +166,22 @@
               <w:rPr>
                 <w:rFonts w:ascii="Calibri" w:cs="Calibri" w:eastAsia="Calibri" w:hAnsi="Calibri"/>
                 <w:color w:val="5A554E"/>
-                <w:sz w:val="16"/>
-                <w:szCs w:val="16"/>
+                <w:sz w:val="15"/>
+                <w:szCs w:val="15"/>
               </w:rPr>
-              <w:t xml:space="preserve">₹15L → ₹80L a month</w:t>
+              <w:t xml:space="preserve">₹15L → ₹80L/mo in 4 months</w:t>
             </w:r>
           </w:p>
         </w:tc>
         <w:tc>
           <w:tcPr>
-            <w:tcW w:type="dxa" w:w="2056"/>
+            <w:tcW w:type="dxa" w:w="1650"/>
             <w:shd w:fill="F6F1E7" w:color="auto" w:val="clear"/>
             <w:tcMar>
-              <w:top w:type="dxa" w:w="90"/>
-              <w:left w:type="dxa" w:w="80"/>
-              <w:bottom w:type="dxa" w:w="90"/>
-              <w:right w:type="dxa" w:w="80"/>
+              <w:top w:type="dxa" w:w="80"/>
+              <w:left w:type="dxa" w:w="40"/>
+              <w:bottom w:type="dxa" w:w="80"/>
+              <w:right w:type="dxa" w:w="40"/>
             </w:tcMar>
             <w:vAlign w:val="center"/>
           </w:tcPr>
@@ -196,8 +196,8 @@
                 <w:b/>
                 <w:bCs/>
                 <w:color w:val="8A6D2F"/>
-                <w:sz w:val="24"/>
-                <w:szCs w:val="24"/>
+                <w:sz w:val="23"/>
+                <w:szCs w:val="23"/>
               </w:rPr>
               <w:t xml:space="preserve">400%+ ROI</w:t>
             </w:r>
@@ -211,8 +211,8 @@
               <w:rPr>
                 <w:rFonts w:ascii="Calibri" w:cs="Calibri" w:eastAsia="Calibri" w:hAnsi="Calibri"/>
                 <w:color w:val="5A554E"/>
-                <w:sz w:val="16"/>
-                <w:szCs w:val="16"/>
+                <w:sz w:val="15"/>
+                <w:szCs w:val="15"/>
               </w:rPr>
               <w:t xml:space="preserve">ET Prime, in 6 months</w:t>
             </w:r>
@@ -220,13 +220,13 @@
         </w:tc>
         <w:tc>
           <w:tcPr>
-            <w:tcW w:type="dxa" w:w="2056"/>
+            <w:tcW w:type="dxa" w:w="2450"/>
             <w:shd w:fill="F6F1E7" w:color="auto" w:val="clear"/>
             <w:tcMar>
-              <w:top w:type="dxa" w:w="90"/>
-              <w:left w:type="dxa" w:w="80"/>
-              <w:bottom w:type="dxa" w:w="90"/>
-              <w:right w:type="dxa" w:w="80"/>
+              <w:top w:type="dxa" w:w="80"/>
+              <w:left w:type="dxa" w:w="40"/>
+              <w:bottom w:type="dxa" w:w="80"/>
+              <w:right w:type="dxa" w:w="40"/>
             </w:tcMar>
             <w:vAlign w:val="center"/>
           </w:tcPr>
@@ -241,10 +241,10 @@
                 <w:b/>
                 <w:bCs/>
                 <w:color w:val="8A6D2F"/>
-                <w:sz w:val="24"/>
-                <w:szCs w:val="24"/>
+                <w:sz w:val="23"/>
+                <w:szCs w:val="23"/>
               </w:rPr>
-              <w:t xml:space="preserve">₹3Cr+ a year</w:t>
+              <w:t xml:space="preserve">New revenue stream</w:t>
             </w:r>
           </w:p>
           <w:p>
@@ -256,22 +256,22 @@
               <w:rPr>
                 <w:rFonts w:ascii="Calibri" w:cs="Calibri" w:eastAsia="Calibri" w:hAnsi="Calibri"/>
                 <w:color w:val="5A554E"/>
-                <w:sz w:val="16"/>
-                <w:szCs w:val="16"/>
+                <w:sz w:val="15"/>
+                <w:szCs w:val="15"/>
               </w:rPr>
-              <w:t xml:space="preserve">ET Markets revamp</w:t>
+              <w:t xml:space="preserve">Half Marathon, 18K+ runners</w:t>
             </w:r>
           </w:p>
         </w:tc>
         <w:tc>
           <w:tcPr>
-            <w:tcW w:type="dxa" w:w="2056"/>
+            <w:tcW w:type="dxa" w:w="1750"/>
             <w:shd w:fill="F6F1E7" w:color="auto" w:val="clear"/>
             <w:tcMar>
-              <w:top w:type="dxa" w:w="90"/>
-              <w:left w:type="dxa" w:w="80"/>
-              <w:bottom w:type="dxa" w:w="90"/>
-              <w:right w:type="dxa" w:w="80"/>
+              <w:top w:type="dxa" w:w="80"/>
+              <w:left w:type="dxa" w:w="40"/>
+              <w:bottom w:type="dxa" w:w="80"/>
+              <w:right w:type="dxa" w:w="40"/>
             </w:tcMar>
             <w:vAlign w:val="center"/>
           </w:tcPr>
@@ -286,10 +286,10 @@
                 <w:b/>
                 <w:bCs/>
                 <w:color w:val="8A6D2F"/>
-                <w:sz w:val="24"/>
-                <w:szCs w:val="24"/>
+                <w:sz w:val="23"/>
+                <w:szCs w:val="23"/>
               </w:rPr>
-              <w:t xml:space="preserve">18K+ runners</w:t>
+              <w:t xml:space="preserve">20 products</w:t>
             </w:r>
           </w:p>
           <w:p>
@@ -301,22 +301,22 @@
               <w:rPr>
                 <w:rFonts w:ascii="Calibri" w:cs="Calibri" w:eastAsia="Calibri" w:hAnsi="Calibri"/>
                 <w:color w:val="5A554E"/>
-                <w:sz w:val="16"/>
-                <w:szCs w:val="16"/>
+                <w:sz w:val="15"/>
+                <w:szCs w:val="15"/>
               </w:rPr>
-              <w:t xml:space="preserve">Delhi Half Marathon</w:t>
+              <w:t xml:space="preserve">built in 5‑6 months</w:t>
             </w:r>
           </w:p>
         </w:tc>
         <w:tc>
           <w:tcPr>
-            <w:tcW w:type="dxa" w:w="2056"/>
+            <w:tcW w:type="dxa" w:w="2332"/>
             <w:shd w:fill="F6F1E7" w:color="auto" w:val="clear"/>
             <w:tcMar>
-              <w:top w:type="dxa" w:w="90"/>
-              <w:left w:type="dxa" w:w="80"/>
-              <w:bottom w:type="dxa" w:w="90"/>
-              <w:right w:type="dxa" w:w="80"/>
+              <w:top w:type="dxa" w:w="80"/>
+              <w:left w:type="dxa" w:w="40"/>
+              <w:bottom w:type="dxa" w:w="80"/>
+              <w:right w:type="dxa" w:w="40"/>
             </w:tcMar>
             <w:vAlign w:val="center"/>
           </w:tcPr>
@@ -331,10 +331,10 @@
                 <w:b/>
                 <w:bCs/>
                 <w:color w:val="8A6D2F"/>
-                <w:sz w:val="24"/>
-                <w:szCs w:val="24"/>
+                <w:sz w:val="23"/>
+                <w:szCs w:val="23"/>
               </w:rPr>
-              <w:t xml:space="preserve">20 AI products</w:t>
+              <w:t xml:space="preserve">Books + music</w:t>
             </w:r>
           </w:p>
           <w:p>
@@ -346,10 +346,10 @@
               <w:rPr>
                 <w:rFonts w:ascii="Calibri" w:cs="Calibri" w:eastAsia="Calibri" w:hAnsi="Calibri"/>
                 <w:color w:val="5A554E"/>
-                <w:sz w:val="16"/>
-                <w:szCs w:val="16"/>
+                <w:sz w:val="15"/>
+                <w:szCs w:val="15"/>
               </w:rPr>
-              <w:t xml:space="preserve">built in 5‑6 months</w:t>
+              <w:t xml:space="preserve">4 books, a new track daily</w:t>
             </w:r>
           </w:p>
         </w:tc>
@@ -999,7 +999,7 @@
           <w:sz w:val="20"/>
           <w:szCs w:val="20"/>
         </w:rPr>
-        <w:t xml:space="preserve">5×, from INR 15 lakh to INR 80 lakh</w:t>
+        <w:t xml:space="preserve">5× within 4 months, from INR 15 lakh to INR 80 lakh</w:t>
       </w:r>
       <w:r>
         <w:rPr>
@@ -1320,6 +1320,26 @@
           <w:sz w:val="20"/>
           <w:szCs w:val="20"/>
         </w:rPr>
+        <w:t xml:space="preserve">, setting up a </w:t>
+      </w:r>
+      <w:r>
+        <w:rPr>
+          <w:rFonts w:ascii="Calibri" w:cs="Calibri" w:eastAsia="Calibri" w:hAnsi="Calibri"/>
+          <w:b/>
+          <w:bCs/>
+          <w:color w:val="161312"/>
+          <w:sz w:val="20"/>
+          <w:szCs w:val="20"/>
+        </w:rPr>
+        <w:t xml:space="preserve">new revenue stream</w:t>
+      </w:r>
+      <w:r>
+        <w:rPr>
+          <w:rFonts w:ascii="Calibri" w:cs="Calibri" w:eastAsia="Calibri" w:hAnsi="Calibri"/>
+          <w:color w:val="161312"/>
+          <w:sz w:val="20"/>
+          <w:szCs w:val="20"/>
+        </w:rPr>
         <w:t xml:space="preserve">.</w:t>
       </w:r>
     </w:p>
@@ -1389,7 +1409,7 @@
           <w:sz w:val="20"/>
           <w:szCs w:val="20"/>
         </w:rPr>
-        <w:t xml:space="preserve">Built and scaled backend services for consumer-facing applications, and owned an early </w:t>
+        <w:t xml:space="preserve">Built backend services for consumer apps and owned an early </w:t>
       </w:r>
       <w:r>
         <w:rPr>
@@ -1409,7 +1429,7 @@
           <w:sz w:val="20"/>
           <w:szCs w:val="20"/>
         </w:rPr>
-        <w:t xml:space="preserve">, connecting product decisions with technical delivery.</w:t>
+        <w:t xml:space="preserve">.</w:t>
       </w:r>
     </w:p>
     <w:p>
@@ -1478,7 +1498,7 @@
           <w:sz w:val="21"/>
           <w:szCs w:val="21"/>
         </w:rPr>
-        <w:t xml:space="preserve">SELECTED INDEPENDENT PRODUCT BUILDS</w:t>
+        <w:t xml:space="preserve">EDUCATION</w:t>
       </w:r>
     </w:p>
     <w:p>
@@ -1487,62 +1507,48 @@
         <w:tabs>
           <w:tab w:val="right" w:pos="10282"/>
         </w:tabs>
-        <w:spacing w:after="10" w:before="30"/>
-      </w:pPr>
-      <w:r>
-        <w:rPr>
-          <w:rFonts w:ascii="Calibri" w:cs="Calibri" w:eastAsia="Calibri" w:hAnsi="Calibri"/>
-          <w:b/>
-          <w:bCs/>
-          <w:color w:val="161312"/>
-          <w:sz w:val="20"/>
-          <w:szCs w:val="20"/>
-        </w:rPr>
-        <w:t xml:space="preserve">LifeCycle-OS, lifecycle marketing platform</w:t>
+        <w:spacing w:after="20" w:before="40"/>
+      </w:pPr>
+      <w:r>
+        <w:rPr>
+          <w:rFonts w:ascii="Calibri" w:cs="Calibri" w:eastAsia="Calibri" w:hAnsi="Calibri"/>
+          <w:b/>
+          <w:bCs/>
+          <w:color w:val="161312"/>
+          <w:sz w:val="21"/>
+          <w:szCs w:val="21"/>
+        </w:rPr>
+        <w:t xml:space="preserve">B.Tech, Computer Science and Engineering, Vellore Institute of Technology</w:t>
       </w:r>
       <w:r>
         <w:rPr>
           <w:rFonts w:ascii="Calibri" w:cs="Calibri" w:eastAsia="Calibri" w:hAnsi="Calibri"/>
           <w:color w:val="5A554E"/>
-          <w:sz w:val="18"/>
-          <w:szCs w:val="18"/>
-        </w:rPr>
-        <w:t xml:space="preserve">	lifecycle-os.anchit-tandon.com</w:t>
-      </w:r>
-    </w:p>
-    <w:p>
-      <w:pPr>
-        <w:spacing w:after="20" w:before="0" w:line="259"/>
-        <w:ind w:left="0"/>
-      </w:pPr>
-      <w:r>
-        <w:rPr>
-          <w:rFonts w:ascii="Calibri" w:cs="Calibri" w:eastAsia="Calibri" w:hAnsi="Calibri"/>
-          <w:color w:val="161312"/>
-          <w:sz w:val="19"/>
-          <w:szCs w:val="19"/>
-        </w:rPr>
-        <w:t xml:space="preserve">Any brand in, a full lifecycle plan out in seconds, then on-brand mailers, ads and landing pages from real customer data. </w:t>
-      </w:r>
-      <w:r>
-        <w:rPr>
-          <w:rFonts w:ascii="Calibri" w:cs="Calibri" w:eastAsia="Calibri" w:hAnsi="Calibri"/>
-          <w:b/>
-          <w:bCs/>
-          <w:color w:val="161312"/>
-          <w:sz w:val="19"/>
-          <w:szCs w:val="19"/>
-        </w:rPr>
-        <w:t xml:space="preserve">Missing facts are marked “data required”, never invented</w:t>
-      </w:r>
-      <w:r>
-        <w:rPr>
-          <w:rFonts w:ascii="Calibri" w:cs="Calibri" w:eastAsia="Calibri" w:hAnsi="Calibri"/>
-          <w:color w:val="161312"/>
-          <w:sz w:val="19"/>
-          <w:szCs w:val="19"/>
-        </w:rPr>
-        <w:t xml:space="preserve">; brand isolation is tested on every change.</w:t>
+          <w:sz w:val="19"/>
+          <w:szCs w:val="19"/>
+        </w:rPr>
+        <w:t xml:space="preserve">	2016 to 2020</w:t>
+      </w:r>
+    </w:p>
+    <w:p>
+      <w:pPr>
+        <w:keepNext/>
+        <w:pBdr>
+          <w:bottom w:val="single" w:color="8A6D2F" w:sz="6" w:space="2"/>
+        </w:pBdr>
+        <w:spacing w:after="70" w:before="190"/>
+      </w:pPr>
+      <w:r>
+        <w:rPr>
+          <w:rFonts w:ascii="Calibri" w:cs="Calibri" w:eastAsia="Calibri" w:hAnsi="Calibri"/>
+          <w:b/>
+          <w:bCs/>
+          <w:color w:val="161312"/>
+          <w:spacing w:val="30"/>
+          <w:sz w:val="21"/>
+          <w:szCs w:val="21"/>
+        </w:rPr>
+        <w:t xml:space="preserve">SELECTED INDEPENDENT PRODUCT BUILDS</w:t>
       </w:r>
     </w:p>
     <w:p>
@@ -1551,18 +1557,18 @@
         <w:tabs>
           <w:tab w:val="right" w:pos="10282"/>
         </w:tabs>
-        <w:spacing w:after="10" w:before="70"/>
-      </w:pPr>
-      <w:r>
-        <w:rPr>
-          <w:rFonts w:ascii="Calibri" w:cs="Calibri" w:eastAsia="Calibri" w:hAnsi="Calibri"/>
-          <w:b/>
-          <w:bCs/>
-          <w:color w:val="161312"/>
-          <w:sz w:val="20"/>
-          <w:szCs w:val="20"/>
-        </w:rPr>
-        <w:t xml:space="preserve">The Third Eye, personal AI operating system</w:t>
+        <w:spacing w:after="0" w:before="30"/>
+      </w:pPr>
+      <w:r>
+        <w:rPr>
+          <w:rFonts w:ascii="Calibri" w:cs="Calibri" w:eastAsia="Calibri" w:hAnsi="Calibri"/>
+          <w:b/>
+          <w:bCs/>
+          <w:color w:val="161312"/>
+          <w:sz w:val="20"/>
+          <w:szCs w:val="20"/>
+        </w:rPr>
+        <w:t xml:space="preserve">LifeCycle-OS, lifecycle marketing platform</w:t>
       </w:r>
       <w:r>
         <w:rPr>
@@ -1571,7 +1577,7 @@
           <w:sz w:val="18"/>
           <w:szCs w:val="18"/>
         </w:rPr>
-        <w:t xml:space="preserve">	the-third-eye.anchit-tandon.com</w:t>
+        <w:t xml:space="preserve">	lifecycle-os.anchit-tandon.com</w:t>
       </w:r>
     </w:p>
     <w:p>
@@ -1586,27 +1592,27 @@
           <w:sz w:val="19"/>
           <w:szCs w:val="19"/>
         </w:rPr>
-        <w:t xml:space="preserve">One assistant across tasks, notes, goals, calendar and email, by voice and camera: </w:t>
-      </w:r>
-      <w:r>
-        <w:rPr>
-          <w:rFonts w:ascii="Calibri" w:cs="Calibri" w:eastAsia="Calibri" w:hAnsi="Calibri"/>
-          <w:b/>
-          <w:bCs/>
-          <w:color w:val="161312"/>
-          <w:sz w:val="19"/>
-          <w:szCs w:val="19"/>
-        </w:rPr>
-        <w:t xml:space="preserve">24 tools plus 76 linked apps</w:t>
-      </w:r>
-      <w:r>
-        <w:rPr>
-          <w:rFonts w:ascii="Calibri" w:cs="Calibri" w:eastAsia="Calibri" w:hAnsi="Calibri"/>
-          <w:color w:val="161312"/>
-          <w:sz w:val="19"/>
-          <w:szCs w:val="19"/>
-        </w:rPr>
-        <w:t xml:space="preserve">, four assistant modes and Razorpay credit packs, on web, Android and iPhone.</w:t>
+        <w:t xml:space="preserve">Any brand in, a full lifecycle plan out in seconds, then on-brand mailers, ads and landing pages from real customer data. </w:t>
+      </w:r>
+      <w:r>
+        <w:rPr>
+          <w:rFonts w:ascii="Calibri" w:cs="Calibri" w:eastAsia="Calibri" w:hAnsi="Calibri"/>
+          <w:b/>
+          <w:bCs/>
+          <w:color w:val="161312"/>
+          <w:sz w:val="19"/>
+          <w:szCs w:val="19"/>
+        </w:rPr>
+        <w:t xml:space="preserve">Missing facts are marked “data required”, never invented</w:t>
+      </w:r>
+      <w:r>
+        <w:rPr>
+          <w:rFonts w:ascii="Calibri" w:cs="Calibri" w:eastAsia="Calibri" w:hAnsi="Calibri"/>
+          <w:color w:val="161312"/>
+          <w:sz w:val="19"/>
+          <w:szCs w:val="19"/>
+        </w:rPr>
+        <w:t xml:space="preserve">; brand isolation is tested on every change.</w:t>
       </w:r>
     </w:p>
     <w:p>
@@ -1615,18 +1621,18 @@
         <w:tabs>
           <w:tab w:val="right" w:pos="10282"/>
         </w:tabs>
-        <w:spacing w:after="10" w:before="70"/>
-      </w:pPr>
-      <w:r>
-        <w:rPr>
-          <w:rFonts w:ascii="Calibri" w:cs="Calibri" w:eastAsia="Calibri" w:hAnsi="Calibri"/>
-          <w:b/>
-          <w:bCs/>
-          <w:color w:val="161312"/>
-          <w:sz w:val="20"/>
-          <w:szCs w:val="20"/>
-        </w:rPr>
-        <w:t xml:space="preserve">Predict Natural Disasters, live global hazard map</w:t>
+        <w:spacing w:after="0" w:before="50"/>
+      </w:pPr>
+      <w:r>
+        <w:rPr>
+          <w:rFonts w:ascii="Calibri" w:cs="Calibri" w:eastAsia="Calibri" w:hAnsi="Calibri"/>
+          <w:b/>
+          <w:bCs/>
+          <w:color w:val="161312"/>
+          <w:sz w:val="20"/>
+          <w:szCs w:val="20"/>
+        </w:rPr>
+        <w:t xml:space="preserve">The Third Eye, personal AI operating system</w:t>
       </w:r>
       <w:r>
         <w:rPr>
@@ -1635,7 +1641,7 @@
           <w:sz w:val="18"/>
           <w:szCs w:val="18"/>
         </w:rPr>
-        <w:t xml:space="preserve">	predict-natural-disasters.anchit-tandon.com</w:t>
+        <w:t xml:space="preserve">	the-third-eye.anchit-tandon.com</w:t>
       </w:r>
     </w:p>
     <w:p>
@@ -1650,47 +1656,27 @@
           <w:sz w:val="19"/>
           <w:szCs w:val="19"/>
         </w:rPr>
-        <w:t xml:space="preserve">One map across </w:t>
-      </w:r>
-      <w:r>
-        <w:rPr>
-          <w:rFonts w:ascii="Calibri" w:cs="Calibri" w:eastAsia="Calibri" w:hAnsi="Calibri"/>
-          <w:b/>
-          <w:bCs/>
-          <w:color w:val="161312"/>
-          <w:sz w:val="19"/>
-          <w:szCs w:val="19"/>
-        </w:rPr>
-        <w:t xml:space="preserve">8 official data sources</w:t>
-      </w:r>
-      <w:r>
-        <w:rPr>
-          <w:rFonts w:ascii="Calibri" w:cs="Calibri" w:eastAsia="Calibri" w:hAnsi="Calibri"/>
-          <w:color w:val="161312"/>
-          <w:sz w:val="19"/>
-          <w:szCs w:val="19"/>
-        </w:rPr>
-        <w:t xml:space="preserve"> (USGS, NASA, GDACS, NOAA and more). </w:t>
-      </w:r>
-      <w:r>
-        <w:rPr>
-          <w:rFonts w:ascii="Calibri" w:cs="Calibri" w:eastAsia="Calibri" w:hAnsi="Calibri"/>
-          <w:b/>
-          <w:bCs/>
-          <w:color w:val="161312"/>
-          <w:sz w:val="19"/>
-          <w:szCs w:val="19"/>
-        </w:rPr>
-        <w:t xml:space="preserve">Every forecast states its evidence and is graded afterwards</w:t>
-      </w:r>
-      <w:r>
-        <w:rPr>
-          <w:rFonts w:ascii="Calibri" w:cs="Calibri" w:eastAsia="Calibri" w:hAnsi="Calibri"/>
-          <w:color w:val="161312"/>
-          <w:sz w:val="19"/>
-          <w:szCs w:val="19"/>
-        </w:rPr>
-        <w:t xml:space="preserve">, and uncovered regions say “not covered”, never “all clear”.</w:t>
+        <w:t xml:space="preserve">One assistant across tasks, notes, goals, calendar and email, by voice and camera: </w:t>
+      </w:r>
+      <w:r>
+        <w:rPr>
+          <w:rFonts w:ascii="Calibri" w:cs="Calibri" w:eastAsia="Calibri" w:hAnsi="Calibri"/>
+          <w:b/>
+          <w:bCs/>
+          <w:color w:val="161312"/>
+          <w:sz w:val="19"/>
+          <w:szCs w:val="19"/>
+        </w:rPr>
+        <w:t xml:space="preserve">24 tools plus 76 linked apps</w:t>
+      </w:r>
+      <w:r>
+        <w:rPr>
+          <w:rFonts w:ascii="Calibri" w:cs="Calibri" w:eastAsia="Calibri" w:hAnsi="Calibri"/>
+          <w:color w:val="161312"/>
+          <w:sz w:val="19"/>
+          <w:szCs w:val="19"/>
+        </w:rPr>
+        <w:t xml:space="preserve">, four assistant modes and Razorpay credit packs, on web, Android and iPhone.</w:t>
       </w:r>
     </w:p>
     <w:p>
@@ -1699,7 +1685,91 @@
         <w:tabs>
           <w:tab w:val="right" w:pos="10282"/>
         </w:tabs>
-        <w:spacing w:after="10" w:before="70"/>
+        <w:spacing w:after="0" w:before="50"/>
+      </w:pPr>
+      <w:r>
+        <w:rPr>
+          <w:rFonts w:ascii="Calibri" w:cs="Calibri" w:eastAsia="Calibri" w:hAnsi="Calibri"/>
+          <w:b/>
+          <w:bCs/>
+          <w:color w:val="161312"/>
+          <w:sz w:val="20"/>
+          <w:szCs w:val="20"/>
+        </w:rPr>
+        <w:t xml:space="preserve">Predict Natural Disasters, live global hazard map</w:t>
+      </w:r>
+      <w:r>
+        <w:rPr>
+          <w:rFonts w:ascii="Calibri" w:cs="Calibri" w:eastAsia="Calibri" w:hAnsi="Calibri"/>
+          <w:color w:val="5A554E"/>
+          <w:sz w:val="18"/>
+          <w:szCs w:val="18"/>
+        </w:rPr>
+        <w:t xml:space="preserve">	predict-natural-disasters.anchit-tandon.com</w:t>
+      </w:r>
+    </w:p>
+    <w:p>
+      <w:pPr>
+        <w:spacing w:after="20" w:before="0" w:line="259"/>
+        <w:ind w:left="0"/>
+      </w:pPr>
+      <w:r>
+        <w:rPr>
+          <w:rFonts w:ascii="Calibri" w:cs="Calibri" w:eastAsia="Calibri" w:hAnsi="Calibri"/>
+          <w:color w:val="161312"/>
+          <w:sz w:val="19"/>
+          <w:szCs w:val="19"/>
+        </w:rPr>
+        <w:t xml:space="preserve">One map across </w:t>
+      </w:r>
+      <w:r>
+        <w:rPr>
+          <w:rFonts w:ascii="Calibri" w:cs="Calibri" w:eastAsia="Calibri" w:hAnsi="Calibri"/>
+          <w:b/>
+          <w:bCs/>
+          <w:color w:val="161312"/>
+          <w:sz w:val="19"/>
+          <w:szCs w:val="19"/>
+        </w:rPr>
+        <w:t xml:space="preserve">8 official data sources</w:t>
+      </w:r>
+      <w:r>
+        <w:rPr>
+          <w:rFonts w:ascii="Calibri" w:cs="Calibri" w:eastAsia="Calibri" w:hAnsi="Calibri"/>
+          <w:color w:val="161312"/>
+          <w:sz w:val="19"/>
+          <w:szCs w:val="19"/>
+        </w:rPr>
+        <w:t xml:space="preserve"> (USGS, NASA, GDACS, NOAA and more). </w:t>
+      </w:r>
+      <w:r>
+        <w:rPr>
+          <w:rFonts w:ascii="Calibri" w:cs="Calibri" w:eastAsia="Calibri" w:hAnsi="Calibri"/>
+          <w:b/>
+          <w:bCs/>
+          <w:color w:val="161312"/>
+          <w:sz w:val="19"/>
+          <w:szCs w:val="19"/>
+        </w:rPr>
+        <w:t xml:space="preserve">Every forecast states its evidence and is graded afterwards</w:t>
+      </w:r>
+      <w:r>
+        <w:rPr>
+          <w:rFonts w:ascii="Calibri" w:cs="Calibri" w:eastAsia="Calibri" w:hAnsi="Calibri"/>
+          <w:color w:val="161312"/>
+          <w:sz w:val="19"/>
+          <w:szCs w:val="19"/>
+        </w:rPr>
+        <w:t xml:space="preserve">, and uncovered regions say “not covered”, never “all clear”.</w:t>
+      </w:r>
+    </w:p>
+    <w:p>
+      <w:pPr>
+        <w:keepNext/>
+        <w:tabs>
+          <w:tab w:val="right" w:pos="10282"/>
+        </w:tabs>
+        <w:spacing w:after="0" w:before="50"/>
       </w:pPr>
       <w:r>
         <w:rPr>
@@ -2063,56 +2133,6 @@
           <w:szCs w:val="20"/>
         </w:rPr>
         <w:t xml:space="preserve">.</w:t>
-      </w:r>
-    </w:p>
-    <w:p>
-      <w:pPr>
-        <w:keepNext/>
-        <w:pBdr>
-          <w:bottom w:val="single" w:color="8A6D2F" w:sz="6" w:space="2"/>
-        </w:pBdr>
-        <w:spacing w:after="70" w:before="190"/>
-      </w:pPr>
-      <w:r>
-        <w:rPr>
-          <w:rFonts w:ascii="Calibri" w:cs="Calibri" w:eastAsia="Calibri" w:hAnsi="Calibri"/>
-          <w:b/>
-          <w:bCs/>
-          <w:color w:val="161312"/>
-          <w:spacing w:val="30"/>
-          <w:sz w:val="21"/>
-          <w:szCs w:val="21"/>
-        </w:rPr>
-        <w:t xml:space="preserve">EDUCATION</w:t>
-      </w:r>
-    </w:p>
-    <w:p>
-      <w:pPr>
-        <w:keepNext/>
-        <w:tabs>
-          <w:tab w:val="right" w:pos="10282"/>
-        </w:tabs>
-        <w:spacing w:after="20" w:before="40"/>
-      </w:pPr>
-      <w:r>
-        <w:rPr>
-          <w:rFonts w:ascii="Calibri" w:cs="Calibri" w:eastAsia="Calibri" w:hAnsi="Calibri"/>
-          <w:b/>
-          <w:bCs/>
-          <w:color w:val="161312"/>
-          <w:sz w:val="21"/>
-          <w:szCs w:val="21"/>
-        </w:rPr>
-        <w:t xml:space="preserve">B.Tech, Computer Science and Engineering, Vellore Institute of Technology</w:t>
-      </w:r>
-      <w:r>
-        <w:rPr>
-          <w:rFonts w:ascii="Calibri" w:cs="Calibri" w:eastAsia="Calibri" w:hAnsi="Calibri"/>
-          <w:color w:val="5A554E"/>
-          <w:sz w:val="19"/>
-          <w:szCs w:val="19"/>
-        </w:rPr>
-        <w:t xml:space="preserve">	2016 to 2020</w:t>
       </w:r>
     </w:p>
     <w:sectPr>

</xml_diff>

<commit_message>
Résumé: need and benefit for every product; Citymall before Tuple
- Each featured product now reads "Need: … How it helps: …", taken
  from the need / who-it's-for lines of the 20-products posts.
- The 12 one-line products say who it helps and how.
- Earlier experience is newest first: Citymall (2022), then Tuple
  (2020 to 2022).

Co-Authored-By: Claude Opus 5.5 <noreply@anthropic.com>
Claude-Session: https://claude.ai/code/session_016FVNHrhHTDcKbXYRWtCNxb
</commit_message>
<xml_diff>
--- a/assets/anchit-tandon-freelance-resume.docx
+++ b/assets/anchit-tandon-freelance-resume.docx
@@ -56,7 +56,7 @@
         </w:rPr>
         <w:t xml:space="preserve">Delhi, India  |  +91 9873945238  |  </w:t>
       </w:r>
-      <w:hyperlink w:history="1" r:id="rIdwplhivaynoyk5bpp-9kxm">
+      <w:hyperlink w:history="1" r:id="rIdclgim-9g3znduo_pvj8ur">
         <w:r>
           <w:rPr>
             <w:rFonts w:ascii="Calibri" w:cs="Calibri" w:eastAsia="Calibri" w:hAnsi="Calibri"/>
@@ -76,7 +76,7 @@
         </w:rPr>
         <w:t xml:space="preserve">  |  </w:t>
       </w:r>
-      <w:hyperlink w:history="1" r:id="rId9isl6eybjrmu2_soyqku3">
+      <w:hyperlink w:history="1" r:id="rIdqwa1htjhsnxhpxt_2zatc">
         <w:r>
           <w:rPr>
             <w:rFonts w:ascii="Calibri" w:cs="Calibri" w:eastAsia="Calibri" w:hAnsi="Calibri"/>
@@ -96,7 +96,7 @@
         </w:rPr>
         <w:t xml:space="preserve">  |  </w:t>
       </w:r>
-      <w:hyperlink w:history="1" r:id="rIddfkwdwhoob1zfkl6t52he">
+      <w:hyperlink w:history="1" r:id="rIdabvquvlpblrb4f1hdb8en">
         <w:r>
           <w:rPr>
             <w:rFonts w:ascii="Calibri" w:cs="Calibri" w:eastAsia="Calibri" w:hAnsi="Calibri"/>
@@ -1381,7 +1381,7 @@
           <w:sz w:val="21"/>
           <w:szCs w:val="21"/>
         </w:rPr>
-        <w:t xml:space="preserve">Tuple Technologies, Software Engineer</w:t>
+        <w:t xml:space="preserve">Citymall, Software Engineer</w:t>
       </w:r>
       <w:r>
         <w:rPr>
@@ -1390,7 +1390,7 @@
           <w:sz w:val="19"/>
           <w:szCs w:val="19"/>
         </w:rPr>
-        <w:t xml:space="preserve">	Apr 2020 to Mar 2022</w:t>
+        <w:t xml:space="preserve">	Mar 2022 to Jun 2022</w:t>
       </w:r>
     </w:p>
     <w:p>
@@ -1409,27 +1409,7 @@
           <w:sz w:val="20"/>
           <w:szCs w:val="20"/>
         </w:rPr>
-        <w:t xml:space="preserve">Built backend services for consumer apps and owned an early </w:t>
-      </w:r>
-      <w:r>
-        <w:rPr>
-          <w:rFonts w:ascii="Calibri" w:cs="Calibri" w:eastAsia="Calibri" w:hAnsi="Calibri"/>
-          <w:b/>
-          <w:bCs/>
-          <w:color w:val="161312"/>
-          <w:sz w:val="20"/>
-          <w:szCs w:val="20"/>
-        </w:rPr>
-        <w:t xml:space="preserve">live sports commentary product</w:t>
-      </w:r>
-      <w:r>
-        <w:rPr>
-          <w:rFonts w:ascii="Calibri" w:cs="Calibri" w:eastAsia="Calibri" w:hAnsi="Calibri"/>
-          <w:color w:val="161312"/>
-          <w:sz w:val="20"/>
-          <w:szCs w:val="20"/>
-        </w:rPr>
-        <w:t xml:space="preserve">.</w:t>
+        <w:t xml:space="preserve">Supported data pipelines and backend systems for consumer commerce platforms.</w:t>
       </w:r>
     </w:p>
     <w:p>
@@ -1449,7 +1429,7 @@
           <w:sz w:val="21"/>
           <w:szCs w:val="21"/>
         </w:rPr>
-        <w:t xml:space="preserve">Citymall, Software Engineer</w:t>
+        <w:t xml:space="preserve">Tuple Technologies, Software Engineer</w:t>
       </w:r>
       <w:r>
         <w:rPr>
@@ -1458,7 +1438,7 @@
           <w:sz w:val="19"/>
           <w:szCs w:val="19"/>
         </w:rPr>
-        <w:t xml:space="preserve">	Mar 2022 to Jun 2022</w:t>
+        <w:t xml:space="preserve">	Apr 2020 to Mar 2022</w:t>
       </w:r>
     </w:p>
     <w:p>
@@ -1477,7 +1457,27 @@
           <w:sz w:val="20"/>
           <w:szCs w:val="20"/>
         </w:rPr>
-        <w:t xml:space="preserve">Supported data pipelines and backend systems for consumer commerce platforms.</w:t>
+        <w:t xml:space="preserve">Built backend services for consumer apps and owned an early </w:t>
+      </w:r>
+      <w:r>
+        <w:rPr>
+          <w:rFonts w:ascii="Calibri" w:cs="Calibri" w:eastAsia="Calibri" w:hAnsi="Calibri"/>
+          <w:b/>
+          <w:bCs/>
+          <w:color w:val="161312"/>
+          <w:sz w:val="20"/>
+          <w:szCs w:val="20"/>
+        </w:rPr>
+        <w:t xml:space="preserve">live sports commentary product</w:t>
+      </w:r>
+      <w:r>
+        <w:rPr>
+          <w:rFonts w:ascii="Calibri" w:cs="Calibri" w:eastAsia="Calibri" w:hAnsi="Calibri"/>
+          <w:color w:val="161312"/>
+          <w:sz w:val="20"/>
+          <w:szCs w:val="20"/>
+        </w:rPr>
+        <w:t xml:space="preserve">.</w:t>
       </w:r>
     </w:p>
     <w:p>
@@ -1588,31 +1588,62 @@
       <w:r>
         <w:rPr>
           <w:rFonts w:ascii="Calibri" w:cs="Calibri" w:eastAsia="Calibri" w:hAnsi="Calibri"/>
-          <w:color w:val="161312"/>
-          <w:sz w:val="19"/>
-          <w:szCs w:val="19"/>
-        </w:rPr>
-        <w:t xml:space="preserve">Any brand in, a full lifecycle plan out in seconds, then on-brand mailers, ads and landing pages from real customer data. </w:t>
-      </w:r>
-      <w:r>
-        <w:rPr>
-          <w:rFonts w:ascii="Calibri" w:cs="Calibri" w:eastAsia="Calibri" w:hAnsi="Calibri"/>
-          <w:b/>
-          <w:bCs/>
-          <w:color w:val="161312"/>
-          <w:sz w:val="19"/>
-          <w:szCs w:val="19"/>
-        </w:rPr>
-        <w:t xml:space="preserve">Missing facts are marked “data required”, never invented</w:t>
-      </w:r>
-      <w:r>
-        <w:rPr>
-          <w:rFonts w:ascii="Calibri" w:cs="Calibri" w:eastAsia="Calibri" w:hAnsi="Calibri"/>
-          <w:color w:val="161312"/>
-          <w:sz w:val="19"/>
-          <w:szCs w:val="19"/>
-        </w:rPr>
-        <w:t xml:space="preserve">; brand isolation is tested on every change.</w:t>
+          <w:b/>
+          <w:bCs/>
+          <w:color w:val="8A6D2F"/>
+          <w:sz w:val="19"/>
+          <w:szCs w:val="19"/>
+        </w:rPr>
+        <w:t xml:space="preserve">Need: </w:t>
+      </w:r>
+      <w:r>
+        <w:rPr>
+          <w:rFonts w:ascii="Calibri" w:cs="Calibri" w:eastAsia="Calibri" w:hAnsi="Calibri"/>
+          <w:color w:val="161312"/>
+          <w:sz w:val="19"/>
+          <w:szCs w:val="19"/>
+        </w:rPr>
+        <w:t xml:space="preserve">D2C growth teams must ship emails, ads and landing pages for every cohort, every week, and AI makes up facts. </w:t>
+      </w:r>
+      <w:r>
+        <w:rPr>
+          <w:rFonts w:ascii="Calibri" w:cs="Calibri" w:eastAsia="Calibri" w:hAnsi="Calibri"/>
+          <w:b/>
+          <w:bCs/>
+          <w:color w:val="8A6D2F"/>
+          <w:sz w:val="19"/>
+          <w:szCs w:val="19"/>
+        </w:rPr>
+        <w:t xml:space="preserve">How it helps: </w:t>
+      </w:r>
+      <w:r>
+        <w:rPr>
+          <w:rFonts w:ascii="Calibri" w:cs="Calibri" w:eastAsia="Calibri" w:hAnsi="Calibri"/>
+          <w:color w:val="161312"/>
+          <w:sz w:val="19"/>
+          <w:szCs w:val="19"/>
+        </w:rPr>
+        <w:t xml:space="preserve">any brand in, a full lifecycle plan and on-brand content out in seconds, with missing facts marked </w:t>
+      </w:r>
+      <w:r>
+        <w:rPr>
+          <w:rFonts w:ascii="Calibri" w:cs="Calibri" w:eastAsia="Calibri" w:hAnsi="Calibri"/>
+          <w:b/>
+          <w:bCs/>
+          <w:color w:val="161312"/>
+          <w:sz w:val="19"/>
+          <w:szCs w:val="19"/>
+        </w:rPr>
+        <w:t xml:space="preserve">“data required”, never invented</w:t>
+      </w:r>
+      <w:r>
+        <w:rPr>
+          <w:rFonts w:ascii="Calibri" w:cs="Calibri" w:eastAsia="Calibri" w:hAnsi="Calibri"/>
+          <w:color w:val="161312"/>
+          <w:sz w:val="19"/>
+          <w:szCs w:val="19"/>
+        </w:rPr>
+        <w:t xml:space="preserve">.</w:t>
       </w:r>
     </w:p>
     <w:p>
@@ -1652,31 +1683,62 @@
       <w:r>
         <w:rPr>
           <w:rFonts w:ascii="Calibri" w:cs="Calibri" w:eastAsia="Calibri" w:hAnsi="Calibri"/>
-          <w:color w:val="161312"/>
-          <w:sz w:val="19"/>
-          <w:szCs w:val="19"/>
-        </w:rPr>
-        <w:t xml:space="preserve">One assistant across tasks, notes, goals, calendar and email, by voice and camera: </w:t>
-      </w:r>
-      <w:r>
-        <w:rPr>
-          <w:rFonts w:ascii="Calibri" w:cs="Calibri" w:eastAsia="Calibri" w:hAnsi="Calibri"/>
-          <w:b/>
-          <w:bCs/>
-          <w:color w:val="161312"/>
-          <w:sz w:val="19"/>
-          <w:szCs w:val="19"/>
-        </w:rPr>
-        <w:t xml:space="preserve">24 tools plus 76 linked apps</w:t>
-      </w:r>
-      <w:r>
-        <w:rPr>
-          <w:rFonts w:ascii="Calibri" w:cs="Calibri" w:eastAsia="Calibri" w:hAnsi="Calibri"/>
-          <w:color w:val="161312"/>
-          <w:sz w:val="19"/>
-          <w:szCs w:val="19"/>
-        </w:rPr>
-        <w:t xml:space="preserve">, four assistant modes and Razorpay credit packs, on web, Android and iPhone.</w:t>
+          <w:b/>
+          <w:bCs/>
+          <w:color w:val="8A6D2F"/>
+          <w:sz w:val="19"/>
+          <w:szCs w:val="19"/>
+        </w:rPr>
+        <w:t xml:space="preserve">Need: </w:t>
+      </w:r>
+      <w:r>
+        <w:rPr>
+          <w:rFonts w:ascii="Calibri" w:cs="Calibri" w:eastAsia="Calibri" w:hAnsi="Calibri"/>
+          <w:color w:val="161312"/>
+          <w:sz w:val="19"/>
+          <w:szCs w:val="19"/>
+        </w:rPr>
+        <w:t xml:space="preserve">tasks, notes, email and calendar live in separate apps, and no assistant sees all of it. </w:t>
+      </w:r>
+      <w:r>
+        <w:rPr>
+          <w:rFonts w:ascii="Calibri" w:cs="Calibri" w:eastAsia="Calibri" w:hAnsi="Calibri"/>
+          <w:b/>
+          <w:bCs/>
+          <w:color w:val="8A6D2F"/>
+          <w:sz w:val="19"/>
+          <w:szCs w:val="19"/>
+        </w:rPr>
+        <w:t xml:space="preserve">How it helps: </w:t>
+      </w:r>
+      <w:r>
+        <w:rPr>
+          <w:rFonts w:ascii="Calibri" w:cs="Calibri" w:eastAsia="Calibri" w:hAnsi="Calibri"/>
+          <w:color w:val="161312"/>
+          <w:sz w:val="19"/>
+          <w:szCs w:val="19"/>
+        </w:rPr>
+        <w:t xml:space="preserve">one assistant, by voice and camera, plans, remembers and acts across them with </w:t>
+      </w:r>
+      <w:r>
+        <w:rPr>
+          <w:rFonts w:ascii="Calibri" w:cs="Calibri" w:eastAsia="Calibri" w:hAnsi="Calibri"/>
+          <w:b/>
+          <w:bCs/>
+          <w:color w:val="161312"/>
+          <w:sz w:val="19"/>
+          <w:szCs w:val="19"/>
+        </w:rPr>
+        <w:t xml:space="preserve">24 tools and 76 linked apps</w:t>
+      </w:r>
+      <w:r>
+        <w:rPr>
+          <w:rFonts w:ascii="Calibri" w:cs="Calibri" w:eastAsia="Calibri" w:hAnsi="Calibri"/>
+          <w:color w:val="161312"/>
+          <w:sz w:val="19"/>
+          <w:szCs w:val="19"/>
+        </w:rPr>
+        <w:t xml:space="preserve">, on web, Android and iPhone.</w:t>
       </w:r>
     </w:p>
     <w:p>
@@ -1716,51 +1778,82 @@
       <w:r>
         <w:rPr>
           <w:rFonts w:ascii="Calibri" w:cs="Calibri" w:eastAsia="Calibri" w:hAnsi="Calibri"/>
-          <w:color w:val="161312"/>
-          <w:sz w:val="19"/>
-          <w:szCs w:val="19"/>
-        </w:rPr>
-        <w:t xml:space="preserve">One map across </w:t>
-      </w:r>
-      <w:r>
-        <w:rPr>
-          <w:rFonts w:ascii="Calibri" w:cs="Calibri" w:eastAsia="Calibri" w:hAnsi="Calibri"/>
-          <w:b/>
-          <w:bCs/>
-          <w:color w:val="161312"/>
-          <w:sz w:val="19"/>
-          <w:szCs w:val="19"/>
-        </w:rPr>
-        <w:t xml:space="preserve">8 official data sources</w:t>
-      </w:r>
-      <w:r>
-        <w:rPr>
-          <w:rFonts w:ascii="Calibri" w:cs="Calibri" w:eastAsia="Calibri" w:hAnsi="Calibri"/>
-          <w:color w:val="161312"/>
-          <w:sz w:val="19"/>
-          <w:szCs w:val="19"/>
-        </w:rPr>
-        <w:t xml:space="preserve"> (USGS, NASA, GDACS, NOAA and more). </w:t>
-      </w:r>
-      <w:r>
-        <w:rPr>
-          <w:rFonts w:ascii="Calibri" w:cs="Calibri" w:eastAsia="Calibri" w:hAnsi="Calibri"/>
-          <w:b/>
-          <w:bCs/>
-          <w:color w:val="161312"/>
-          <w:sz w:val="19"/>
-          <w:szCs w:val="19"/>
-        </w:rPr>
-        <w:t xml:space="preserve">Every forecast states its evidence and is graded afterwards</w:t>
-      </w:r>
-      <w:r>
-        <w:rPr>
-          <w:rFonts w:ascii="Calibri" w:cs="Calibri" w:eastAsia="Calibri" w:hAnsi="Calibri"/>
-          <w:color w:val="161312"/>
-          <w:sz w:val="19"/>
-          <w:szCs w:val="19"/>
-        </w:rPr>
-        <w:t xml:space="preserve">, and uncovered regions say “not covered”, never “all clear”.</w:t>
+          <w:b/>
+          <w:bCs/>
+          <w:color w:val="8A6D2F"/>
+          <w:sz w:val="19"/>
+          <w:szCs w:val="19"/>
+        </w:rPr>
+        <w:t xml:space="preserve">Need: </w:t>
+      </w:r>
+      <w:r>
+        <w:rPr>
+          <w:rFonts w:ascii="Calibri" w:cs="Calibri" w:eastAsia="Calibri" w:hAnsi="Calibri"/>
+          <w:color w:val="161312"/>
+          <w:sz w:val="19"/>
+          <w:szCs w:val="19"/>
+        </w:rPr>
+        <w:t xml:space="preserve">newsrooms, NGOs and operations teams need one trustworthy view when disaster strikes. </w:t>
+      </w:r>
+      <w:r>
+        <w:rPr>
+          <w:rFonts w:ascii="Calibri" w:cs="Calibri" w:eastAsia="Calibri" w:hAnsi="Calibri"/>
+          <w:b/>
+          <w:bCs/>
+          <w:color w:val="8A6D2F"/>
+          <w:sz w:val="19"/>
+          <w:szCs w:val="19"/>
+        </w:rPr>
+        <w:t xml:space="preserve">How it helps: </w:t>
+      </w:r>
+      <w:r>
+        <w:rPr>
+          <w:rFonts w:ascii="Calibri" w:cs="Calibri" w:eastAsia="Calibri" w:hAnsi="Calibri"/>
+          <w:color w:val="161312"/>
+          <w:sz w:val="19"/>
+          <w:szCs w:val="19"/>
+        </w:rPr>
+        <w:t xml:space="preserve">one map across </w:t>
+      </w:r>
+      <w:r>
+        <w:rPr>
+          <w:rFonts w:ascii="Calibri" w:cs="Calibri" w:eastAsia="Calibri" w:hAnsi="Calibri"/>
+          <w:b/>
+          <w:bCs/>
+          <w:color w:val="161312"/>
+          <w:sz w:val="19"/>
+          <w:szCs w:val="19"/>
+        </w:rPr>
+        <w:t xml:space="preserve">8 official sources</w:t>
+      </w:r>
+      <w:r>
+        <w:rPr>
+          <w:rFonts w:ascii="Calibri" w:cs="Calibri" w:eastAsia="Calibri" w:hAnsi="Calibri"/>
+          <w:color w:val="161312"/>
+          <w:sz w:val="19"/>
+          <w:szCs w:val="19"/>
+        </w:rPr>
+        <w:t xml:space="preserve"> (USGS, NASA, GDACS, NOAA and more); every forecast shows its evidence and is </w:t>
+      </w:r>
+      <w:r>
+        <w:rPr>
+          <w:rFonts w:ascii="Calibri" w:cs="Calibri" w:eastAsia="Calibri" w:hAnsi="Calibri"/>
+          <w:b/>
+          <w:bCs/>
+          <w:color w:val="161312"/>
+          <w:sz w:val="19"/>
+          <w:szCs w:val="19"/>
+        </w:rPr>
+        <w:t xml:space="preserve">graded afterwards</w:t>
+      </w:r>
+      <w:r>
+        <w:rPr>
+          <w:rFonts w:ascii="Calibri" w:cs="Calibri" w:eastAsia="Calibri" w:hAnsi="Calibri"/>
+          <w:color w:val="161312"/>
+          <w:sz w:val="19"/>
+          <w:szCs w:val="19"/>
+        </w:rPr>
+        <w:t xml:space="preserve">.</w:t>
       </w:r>
     </w:p>
     <w:p>
@@ -1800,31 +1893,62 @@
       <w:r>
         <w:rPr>
           <w:rFonts w:ascii="Calibri" w:cs="Calibri" w:eastAsia="Calibri" w:hAnsi="Calibri"/>
-          <w:color w:val="161312"/>
-          <w:sz w:val="19"/>
-          <w:szCs w:val="19"/>
-        </w:rPr>
-        <w:t xml:space="preserve">A 2-minute guided break with a before-and-after </w:t>
-      </w:r>
-      <w:r>
-        <w:rPr>
-          <w:rFonts w:ascii="Calibri" w:cs="Calibri" w:eastAsia="Calibri" w:hAnsi="Calibri"/>
-          <w:b/>
-          <w:bCs/>
-          <w:color w:val="161312"/>
-          <w:sz w:val="19"/>
-          <w:szCs w:val="19"/>
-        </w:rPr>
-        <w:t xml:space="preserve">Calm gain</w:t>
-      </w:r>
-      <w:r>
-        <w:rPr>
-          <w:rFonts w:ascii="Calibri" w:cs="Calibri" w:eastAsia="Calibri" w:hAnsi="Calibri"/>
-          <w:color w:val="161312"/>
-          <w:sz w:val="19"/>
-          <w:szCs w:val="19"/>
-        </w:rPr>
-        <w:t xml:space="preserve">; an SOS on every screen (Tele-MANAS 14416, a trusted contact, 112); no account needed, and it works offline.</w:t>
+          <w:b/>
+          <w:bCs/>
+          <w:color w:val="8A6D2F"/>
+          <w:sz w:val="19"/>
+          <w:szCs w:val="19"/>
+        </w:rPr>
+        <w:t xml:space="preserve">Need: </w:t>
+      </w:r>
+      <w:r>
+        <w:rPr>
+          <w:rFonts w:ascii="Calibri" w:cs="Calibri" w:eastAsia="Calibri" w:hAnsi="Calibri"/>
+          <w:color w:val="161312"/>
+          <w:sz w:val="19"/>
+          <w:szCs w:val="19"/>
+        </w:rPr>
+        <w:t xml:space="preserve">relief in the tense moment, not a 20-minute programme with a sign-up. </w:t>
+      </w:r>
+      <w:r>
+        <w:rPr>
+          <w:rFonts w:ascii="Calibri" w:cs="Calibri" w:eastAsia="Calibri" w:hAnsi="Calibri"/>
+          <w:b/>
+          <w:bCs/>
+          <w:color w:val="8A6D2F"/>
+          <w:sz w:val="19"/>
+          <w:szCs w:val="19"/>
+        </w:rPr>
+        <w:t xml:space="preserve">How it helps: </w:t>
+      </w:r>
+      <w:r>
+        <w:rPr>
+          <w:rFonts w:ascii="Calibri" w:cs="Calibri" w:eastAsia="Calibri" w:hAnsi="Calibri"/>
+          <w:color w:val="161312"/>
+          <w:sz w:val="19"/>
+          <w:szCs w:val="19"/>
+        </w:rPr>
+        <w:t xml:space="preserve">a </w:t>
+      </w:r>
+      <w:r>
+        <w:rPr>
+          <w:rFonts w:ascii="Calibri" w:cs="Calibri" w:eastAsia="Calibri" w:hAnsi="Calibri"/>
+          <w:b/>
+          <w:bCs/>
+          <w:color w:val="161312"/>
+          <w:sz w:val="19"/>
+          <w:szCs w:val="19"/>
+        </w:rPr>
+        <w:t xml:space="preserve">2-minute</w:t>
+      </w:r>
+      <w:r>
+        <w:rPr>
+          <w:rFonts w:ascii="Calibri" w:cs="Calibri" w:eastAsia="Calibri" w:hAnsi="Calibri"/>
+          <w:color w:val="161312"/>
+          <w:sz w:val="19"/>
+          <w:szCs w:val="19"/>
+        </w:rPr>
+        <w:t xml:space="preserve"> guided break with a before-and-after Calm gain, no account, works offline, and an SOS on every screen (Tele-MANAS 14416, 112).</w:t>
       </w:r>
     </w:p>
     <w:p>

</xml_diff>

<commit_message>
Résumé: real counts for books, tracks and YouTube views
- Books: 9 on Amazon (The Watermark Files, 4; Doodle Lane drawing
  books, 5), checked on amazon.in.
- Tracks: 62 released 4 Sep to 31 Oct 2026, from ANCHOR's live
  catalogue.
- YouTube @ANCHOR_AT: 7.7K+ views (7,749 public count).
- Band cell now reads "9 books, 62 tracks / 7.7K+ YouTube views".

Co-Authored-By: Claude Opus 5.5 <noreply@anthropic.com>
Claude-Session: https://claude.ai/code/session_016FVNHrhHTDcKbXYRWtCNxb
</commit_message>
<xml_diff>
--- a/assets/anchit-tandon-freelance-resume.docx
+++ b/assets/anchit-tandon-freelance-resume.docx
@@ -56,7 +56,7 @@
         </w:rPr>
         <w:t xml:space="preserve">Delhi, India  |  +91 9873945238  |  </w:t>
       </w:r>
-      <w:hyperlink w:history="1" r:id="rIdclgim-9g3znduo_pvj8ur">
+      <w:hyperlink w:history="1" r:id="rIdghegijwt7jsdwelf0on55">
         <w:r>
           <w:rPr>
             <w:rFonts w:ascii="Calibri" w:cs="Calibri" w:eastAsia="Calibri" w:hAnsi="Calibri"/>
@@ -76,7 +76,7 @@
         </w:rPr>
         <w:t xml:space="preserve">  |  </w:t>
       </w:r>
-      <w:hyperlink w:history="1" r:id="rIdqwa1htjhsnxhpxt_2zatc">
+      <w:hyperlink w:history="1" r:id="rId7d9wrmjscklxgifkatxmq">
         <w:r>
           <w:rPr>
             <w:rFonts w:ascii="Calibri" w:cs="Calibri" w:eastAsia="Calibri" w:hAnsi="Calibri"/>
@@ -96,7 +96,7 @@
         </w:rPr>
         <w:t xml:space="preserve">  |  </w:t>
       </w:r>
-      <w:hyperlink w:history="1" r:id="rIdabvquvlpblrb4f1hdb8en">
+      <w:hyperlink w:history="1" r:id="rIdkagnbstzx76xam_kewb1a">
         <w:r>
           <w:rPr>
             <w:rFonts w:ascii="Calibri" w:cs="Calibri" w:eastAsia="Calibri" w:hAnsi="Calibri"/>
@@ -334,7 +334,7 @@
                 <w:sz w:val="23"/>
                 <w:szCs w:val="23"/>
               </w:rPr>
-              <w:t xml:space="preserve">Books + music</w:t>
+              <w:t xml:space="preserve">9 books, 62 tracks</w:t>
             </w:r>
           </w:p>
           <w:p>
@@ -349,7 +349,7 @@
                 <w:sz w:val="15"/>
                 <w:szCs w:val="15"/>
               </w:rPr>
-              <w:t xml:space="preserve">4 books, a new track daily</w:t>
+              <w:t xml:space="preserve">7.7K+ YouTube views</w:t>
             </w:r>
           </w:p>
         </w:tc>

</xml_diff>

<commit_message>
Résumé: real counts for books, tracks and YouTube views (#251)
- Books: 9 on Amazon (The Watermark Files, 4; Doodle Lane drawing
  books, 5), checked on amazon.in.
- Tracks: 62 released 4 Sep to 31 Oct 2026, from ANCHOR's live
  catalogue.
- YouTube @ANCHOR_AT: 7.7K+ views (7,749 public count).
- Band cell now reads "9 books, 62 tracks / 7.7K+ YouTube views".


Claude-Session: https://claude.ai/code/session_016FVNHrhHTDcKbXYRWtCNxb

Co-authored-by: Claude <noreply@anthropic.com>
</commit_message>
<xml_diff>
--- a/assets/anchit-tandon-freelance-resume.docx
+++ b/assets/anchit-tandon-freelance-resume.docx
@@ -56,7 +56,7 @@
         </w:rPr>
         <w:t xml:space="preserve">Delhi, India  |  +91 9873945238  |  </w:t>
       </w:r>
-      <w:hyperlink w:history="1" r:id="rIdclgim-9g3znduo_pvj8ur">
+      <w:hyperlink w:history="1" r:id="rIdghegijwt7jsdwelf0on55">
         <w:r>
           <w:rPr>
             <w:rFonts w:ascii="Calibri" w:cs="Calibri" w:eastAsia="Calibri" w:hAnsi="Calibri"/>
@@ -76,7 +76,7 @@
         </w:rPr>
         <w:t xml:space="preserve">  |  </w:t>
       </w:r>
-      <w:hyperlink w:history="1" r:id="rIdqwa1htjhsnxhpxt_2zatc">
+      <w:hyperlink w:history="1" r:id="rId7d9wrmjscklxgifkatxmq">
         <w:r>
           <w:rPr>
             <w:rFonts w:ascii="Calibri" w:cs="Calibri" w:eastAsia="Calibri" w:hAnsi="Calibri"/>
@@ -96,7 +96,7 @@
         </w:rPr>
         <w:t xml:space="preserve">  |  </w:t>
       </w:r>
-      <w:hyperlink w:history="1" r:id="rIdabvquvlpblrb4f1hdb8en">
+      <w:hyperlink w:history="1" r:id="rIdkagnbstzx76xam_kewb1a">
         <w:r>
           <w:rPr>
             <w:rFonts w:ascii="Calibri" w:cs="Calibri" w:eastAsia="Calibri" w:hAnsi="Calibri"/>
@@ -334,7 +334,7 @@
                 <w:sz w:val="23"/>
                 <w:szCs w:val="23"/>
               </w:rPr>
-              <w:t xml:space="preserve">Books + music</w:t>
+              <w:t xml:space="preserve">9 books, 62 tracks</w:t>
             </w:r>
           </w:p>
           <w:p>
@@ -349,7 +349,7 @@
                 <w:sz w:val="15"/>
                 <w:szCs w:val="15"/>
               </w:rPr>
-              <w:t xml:space="preserve">4 books, a new track daily</w:t>
+              <w:t xml:space="preserve">7.7K+ YouTube views</w:t>
             </w:r>
           </w:p>
         </w:tc>

</xml_diff>

<commit_message>
Résumé: one sentence per product, no Need / How it helps labels
The labels repeated eight times and cost space. Each product now reads
as one sentence: who it is for, then what it does, numbers in bold.
Still 2 pages.

Co-Authored-By: Claude Opus 5.5 <noreply@anthropic.com>
Claude-Session: https://claude.ai/code/session_016FVNHrhHTDcKbXYRWtCNxb
</commit_message>
<xml_diff>
--- a/assets/anchit-tandon-freelance-resume.docx
+++ b/assets/anchit-tandon-freelance-resume.docx
@@ -56,7 +56,7 @@
         </w:rPr>
         <w:t xml:space="preserve">Delhi, India  |  +91 9873945238  |  </w:t>
       </w:r>
-      <w:hyperlink w:history="1" r:id="rIdghegijwt7jsdwelf0on55">
+      <w:hyperlink w:history="1" r:id="rIdx42sjtgh_pjbenv9obbsc">
         <w:r>
           <w:rPr>
             <w:rFonts w:ascii="Calibri" w:cs="Calibri" w:eastAsia="Calibri" w:hAnsi="Calibri"/>
@@ -76,7 +76,7 @@
         </w:rPr>
         <w:t xml:space="preserve">  |  </w:t>
       </w:r>
-      <w:hyperlink w:history="1" r:id="rId7d9wrmjscklxgifkatxmq">
+      <w:hyperlink w:history="1" r:id="rIdscd-zllk1bkfc_txeb65q">
         <w:r>
           <w:rPr>
             <w:rFonts w:ascii="Calibri" w:cs="Calibri" w:eastAsia="Calibri" w:hAnsi="Calibri"/>
@@ -96,7 +96,7 @@
         </w:rPr>
         <w:t xml:space="preserve">  |  </w:t>
       </w:r>
-      <w:hyperlink w:history="1" r:id="rIdkagnbstzx76xam_kewb1a">
+      <w:hyperlink w:history="1" r:id="rIdpe6hfa4fg_miobtmlxeds">
         <w:r>
           <w:rPr>
             <w:rFonts w:ascii="Calibri" w:cs="Calibri" w:eastAsia="Calibri" w:hAnsi="Calibri"/>
@@ -1588,42 +1588,11 @@
       <w:r>
         <w:rPr>
           <w:rFonts w:ascii="Calibri" w:cs="Calibri" w:eastAsia="Calibri" w:hAnsi="Calibri"/>
-          <w:b/>
-          <w:bCs/>
-          <w:color w:val="8A6D2F"/>
-          <w:sz w:val="19"/>
-          <w:szCs w:val="19"/>
-        </w:rPr>
-        <w:t xml:space="preserve">Need: </w:t>
-      </w:r>
-      <w:r>
-        <w:rPr>
-          <w:rFonts w:ascii="Calibri" w:cs="Calibri" w:eastAsia="Calibri" w:hAnsi="Calibri"/>
-          <w:color w:val="161312"/>
-          <w:sz w:val="19"/>
-          <w:szCs w:val="19"/>
-        </w:rPr>
-        <w:t xml:space="preserve">D2C growth teams must ship emails, ads and landing pages for every cohort, every week, and AI makes up facts. </w:t>
-      </w:r>
-      <w:r>
-        <w:rPr>
-          <w:rFonts w:ascii="Calibri" w:cs="Calibri" w:eastAsia="Calibri" w:hAnsi="Calibri"/>
-          <w:b/>
-          <w:bCs/>
-          <w:color w:val="8A6D2F"/>
-          <w:sz w:val="19"/>
-          <w:szCs w:val="19"/>
-        </w:rPr>
-        <w:t xml:space="preserve">How it helps: </w:t>
-      </w:r>
-      <w:r>
-        <w:rPr>
-          <w:rFonts w:ascii="Calibri" w:cs="Calibri" w:eastAsia="Calibri" w:hAnsi="Calibri"/>
-          <w:color w:val="161312"/>
-          <w:sz w:val="19"/>
-          <w:szCs w:val="19"/>
-        </w:rPr>
-        <w:t xml:space="preserve">any brand in, a full lifecycle plan and on-brand content out in seconds, with missing facts marked </w:t>
+          <w:color w:val="161312"/>
+          <w:sz w:val="19"/>
+          <w:szCs w:val="19"/>
+        </w:rPr>
+        <w:t xml:space="preserve">For D2C growth teams shipping emails, ads and landing pages for every cohort, every week: any brand in, a full lifecycle plan and on-brand content out in seconds, with missing facts marked </w:t>
       </w:r>
       <w:r>
         <w:rPr>
@@ -1683,42 +1652,11 @@
       <w:r>
         <w:rPr>
           <w:rFonts w:ascii="Calibri" w:cs="Calibri" w:eastAsia="Calibri" w:hAnsi="Calibri"/>
-          <w:b/>
-          <w:bCs/>
-          <w:color w:val="8A6D2F"/>
-          <w:sz w:val="19"/>
-          <w:szCs w:val="19"/>
-        </w:rPr>
-        <w:t xml:space="preserve">Need: </w:t>
-      </w:r>
-      <w:r>
-        <w:rPr>
-          <w:rFonts w:ascii="Calibri" w:cs="Calibri" w:eastAsia="Calibri" w:hAnsi="Calibri"/>
-          <w:color w:val="161312"/>
-          <w:sz w:val="19"/>
-          <w:szCs w:val="19"/>
-        </w:rPr>
-        <w:t xml:space="preserve">tasks, notes, email and calendar live in separate apps, and no assistant sees all of it. </w:t>
-      </w:r>
-      <w:r>
-        <w:rPr>
-          <w:rFonts w:ascii="Calibri" w:cs="Calibri" w:eastAsia="Calibri" w:hAnsi="Calibri"/>
-          <w:b/>
-          <w:bCs/>
-          <w:color w:val="8A6D2F"/>
-          <w:sz w:val="19"/>
-          <w:szCs w:val="19"/>
-        </w:rPr>
-        <w:t xml:space="preserve">How it helps: </w:t>
-      </w:r>
-      <w:r>
-        <w:rPr>
-          <w:rFonts w:ascii="Calibri" w:cs="Calibri" w:eastAsia="Calibri" w:hAnsi="Calibri"/>
-          <w:color w:val="161312"/>
-          <w:sz w:val="19"/>
-          <w:szCs w:val="19"/>
-        </w:rPr>
-        <w:t xml:space="preserve">one assistant, by voice and camera, plans, remembers and acts across them with </w:t>
+          <w:color w:val="161312"/>
+          <w:sz w:val="19"/>
+          <w:szCs w:val="19"/>
+        </w:rPr>
+        <w:t xml:space="preserve">For people whose tasks, notes, email and calendar live in separate apps: one assistant, by voice and camera, that plans, remembers and acts across them with </w:t>
       </w:r>
       <w:r>
         <w:rPr>
@@ -1738,7 +1676,7 @@
           <w:sz w:val="19"/>
           <w:szCs w:val="19"/>
         </w:rPr>
-        <w:t xml:space="preserve">, on web, Android and iPhone.</w:t>
+        <w:t xml:space="preserve">.</w:t>
       </w:r>
     </w:p>
     <w:p>
@@ -1778,42 +1716,11 @@
       <w:r>
         <w:rPr>
           <w:rFonts w:ascii="Calibri" w:cs="Calibri" w:eastAsia="Calibri" w:hAnsi="Calibri"/>
-          <w:b/>
-          <w:bCs/>
-          <w:color w:val="8A6D2F"/>
-          <w:sz w:val="19"/>
-          <w:szCs w:val="19"/>
-        </w:rPr>
-        <w:t xml:space="preserve">Need: </w:t>
-      </w:r>
-      <w:r>
-        <w:rPr>
-          <w:rFonts w:ascii="Calibri" w:cs="Calibri" w:eastAsia="Calibri" w:hAnsi="Calibri"/>
-          <w:color w:val="161312"/>
-          <w:sz w:val="19"/>
-          <w:szCs w:val="19"/>
-        </w:rPr>
-        <w:t xml:space="preserve">newsrooms, NGOs and operations teams need one trustworthy view when disaster strikes. </w:t>
-      </w:r>
-      <w:r>
-        <w:rPr>
-          <w:rFonts w:ascii="Calibri" w:cs="Calibri" w:eastAsia="Calibri" w:hAnsi="Calibri"/>
-          <w:b/>
-          <w:bCs/>
-          <w:color w:val="8A6D2F"/>
-          <w:sz w:val="19"/>
-          <w:szCs w:val="19"/>
-        </w:rPr>
-        <w:t xml:space="preserve">How it helps: </w:t>
-      </w:r>
-      <w:r>
-        <w:rPr>
-          <w:rFonts w:ascii="Calibri" w:cs="Calibri" w:eastAsia="Calibri" w:hAnsi="Calibri"/>
-          <w:color w:val="161312"/>
-          <w:sz w:val="19"/>
-          <w:szCs w:val="19"/>
-        </w:rPr>
-        <w:t xml:space="preserve">one map across </w:t>
+          <w:color w:val="161312"/>
+          <w:sz w:val="19"/>
+          <w:szCs w:val="19"/>
+        </w:rPr>
+        <w:t xml:space="preserve">For newsrooms, NGOs and operations teams who need one trustworthy view in a disaster: one map across </w:t>
       </w:r>
       <w:r>
         <w:rPr>
@@ -1833,7 +1740,7 @@
           <w:sz w:val="19"/>
           <w:szCs w:val="19"/>
         </w:rPr>
-        <w:t xml:space="preserve"> (USGS, NASA, GDACS, NOAA and more); every forecast shows its evidence and is </w:t>
+        <w:t xml:space="preserve">, where every forecast shows its evidence and is </w:t>
       </w:r>
       <w:r>
         <w:rPr>
@@ -1893,42 +1800,11 @@
       <w:r>
         <w:rPr>
           <w:rFonts w:ascii="Calibri" w:cs="Calibri" w:eastAsia="Calibri" w:hAnsi="Calibri"/>
-          <w:b/>
-          <w:bCs/>
-          <w:color w:val="8A6D2F"/>
-          <w:sz w:val="19"/>
-          <w:szCs w:val="19"/>
-        </w:rPr>
-        <w:t xml:space="preserve">Need: </w:t>
-      </w:r>
-      <w:r>
-        <w:rPr>
-          <w:rFonts w:ascii="Calibri" w:cs="Calibri" w:eastAsia="Calibri" w:hAnsi="Calibri"/>
-          <w:color w:val="161312"/>
-          <w:sz w:val="19"/>
-          <w:szCs w:val="19"/>
-        </w:rPr>
-        <w:t xml:space="preserve">relief in the tense moment, not a 20-minute programme with a sign-up. </w:t>
-      </w:r>
-      <w:r>
-        <w:rPr>
-          <w:rFonts w:ascii="Calibri" w:cs="Calibri" w:eastAsia="Calibri" w:hAnsi="Calibri"/>
-          <w:b/>
-          <w:bCs/>
-          <w:color w:val="8A6D2F"/>
-          <w:sz w:val="19"/>
-          <w:szCs w:val="19"/>
-        </w:rPr>
-        <w:t xml:space="preserve">How it helps: </w:t>
-      </w:r>
-      <w:r>
-        <w:rPr>
-          <w:rFonts w:ascii="Calibri" w:cs="Calibri" w:eastAsia="Calibri" w:hAnsi="Calibri"/>
-          <w:color w:val="161312"/>
-          <w:sz w:val="19"/>
-          <w:szCs w:val="19"/>
-        </w:rPr>
-        <w:t xml:space="preserve">a </w:t>
+          <w:color w:val="161312"/>
+          <w:sz w:val="19"/>
+          <w:szCs w:val="19"/>
+        </w:rPr>
+        <w:t xml:space="preserve">For the tense moment, not a 20-minute programme: a </w:t>
       </w:r>
       <w:r>
         <w:rPr>
@@ -1948,7 +1824,7 @@
           <w:sz w:val="19"/>
           <w:szCs w:val="19"/>
         </w:rPr>
-        <w:t xml:space="preserve"> guided break with a before-and-after Calm gain, no account, works offline, and an SOS on every screen (Tele-MANAS 14416, 112).</w:t>
+        <w:t xml:space="preserve"> guided break with a before-and-after Calm gain, no account, works offline, and an SOS on every screen.</w:t>
       </w:r>
     </w:p>
     <w:p>

</xml_diff>

<commit_message>
Résumé: one sentence per product, no Need / How it helps labels (#252)
The labels repeated eight times and cost space. Each product now reads
as one sentence: who it is for, then what it does, numbers in bold.
Still 2 pages.


Claude-Session: https://claude.ai/code/session_016FVNHrhHTDcKbXYRWtCNxb

Co-authored-by: Claude <noreply@anthropic.com>
</commit_message>
<xml_diff>
--- a/assets/anchit-tandon-freelance-resume.docx
+++ b/assets/anchit-tandon-freelance-resume.docx
@@ -56,7 +56,7 @@
         </w:rPr>
         <w:t xml:space="preserve">Delhi, India  |  +91 9873945238  |  </w:t>
       </w:r>
-      <w:hyperlink w:history="1" r:id="rIdghegijwt7jsdwelf0on55">
+      <w:hyperlink w:history="1" r:id="rIdx42sjtgh_pjbenv9obbsc">
         <w:r>
           <w:rPr>
             <w:rFonts w:ascii="Calibri" w:cs="Calibri" w:eastAsia="Calibri" w:hAnsi="Calibri"/>
@@ -76,7 +76,7 @@
         </w:rPr>
         <w:t xml:space="preserve">  |  </w:t>
       </w:r>
-      <w:hyperlink w:history="1" r:id="rId7d9wrmjscklxgifkatxmq">
+      <w:hyperlink w:history="1" r:id="rIdscd-zllk1bkfc_txeb65q">
         <w:r>
           <w:rPr>
             <w:rFonts w:ascii="Calibri" w:cs="Calibri" w:eastAsia="Calibri" w:hAnsi="Calibri"/>
@@ -96,7 +96,7 @@
         </w:rPr>
         <w:t xml:space="preserve">  |  </w:t>
       </w:r>
-      <w:hyperlink w:history="1" r:id="rIdkagnbstzx76xam_kewb1a">
+      <w:hyperlink w:history="1" r:id="rIdpe6hfa4fg_miobtmlxeds">
         <w:r>
           <w:rPr>
             <w:rFonts w:ascii="Calibri" w:cs="Calibri" w:eastAsia="Calibri" w:hAnsi="Calibri"/>
@@ -1588,42 +1588,11 @@
       <w:r>
         <w:rPr>
           <w:rFonts w:ascii="Calibri" w:cs="Calibri" w:eastAsia="Calibri" w:hAnsi="Calibri"/>
-          <w:b/>
-          <w:bCs/>
-          <w:color w:val="8A6D2F"/>
-          <w:sz w:val="19"/>
-          <w:szCs w:val="19"/>
-        </w:rPr>
-        <w:t xml:space="preserve">Need: </w:t>
-      </w:r>
-      <w:r>
-        <w:rPr>
-          <w:rFonts w:ascii="Calibri" w:cs="Calibri" w:eastAsia="Calibri" w:hAnsi="Calibri"/>
-          <w:color w:val="161312"/>
-          <w:sz w:val="19"/>
-          <w:szCs w:val="19"/>
-        </w:rPr>
-        <w:t xml:space="preserve">D2C growth teams must ship emails, ads and landing pages for every cohort, every week, and AI makes up facts. </w:t>
-      </w:r>
-      <w:r>
-        <w:rPr>
-          <w:rFonts w:ascii="Calibri" w:cs="Calibri" w:eastAsia="Calibri" w:hAnsi="Calibri"/>
-          <w:b/>
-          <w:bCs/>
-          <w:color w:val="8A6D2F"/>
-          <w:sz w:val="19"/>
-          <w:szCs w:val="19"/>
-        </w:rPr>
-        <w:t xml:space="preserve">How it helps: </w:t>
-      </w:r>
-      <w:r>
-        <w:rPr>
-          <w:rFonts w:ascii="Calibri" w:cs="Calibri" w:eastAsia="Calibri" w:hAnsi="Calibri"/>
-          <w:color w:val="161312"/>
-          <w:sz w:val="19"/>
-          <w:szCs w:val="19"/>
-        </w:rPr>
-        <w:t xml:space="preserve">any brand in, a full lifecycle plan and on-brand content out in seconds, with missing facts marked </w:t>
+          <w:color w:val="161312"/>
+          <w:sz w:val="19"/>
+          <w:szCs w:val="19"/>
+        </w:rPr>
+        <w:t xml:space="preserve">For D2C growth teams shipping emails, ads and landing pages for every cohort, every week: any brand in, a full lifecycle plan and on-brand content out in seconds, with missing facts marked </w:t>
       </w:r>
       <w:r>
         <w:rPr>
@@ -1683,42 +1652,11 @@
       <w:r>
         <w:rPr>
           <w:rFonts w:ascii="Calibri" w:cs="Calibri" w:eastAsia="Calibri" w:hAnsi="Calibri"/>
-          <w:b/>
-          <w:bCs/>
-          <w:color w:val="8A6D2F"/>
-          <w:sz w:val="19"/>
-          <w:szCs w:val="19"/>
-        </w:rPr>
-        <w:t xml:space="preserve">Need: </w:t>
-      </w:r>
-      <w:r>
-        <w:rPr>
-          <w:rFonts w:ascii="Calibri" w:cs="Calibri" w:eastAsia="Calibri" w:hAnsi="Calibri"/>
-          <w:color w:val="161312"/>
-          <w:sz w:val="19"/>
-          <w:szCs w:val="19"/>
-        </w:rPr>
-        <w:t xml:space="preserve">tasks, notes, email and calendar live in separate apps, and no assistant sees all of it. </w:t>
-      </w:r>
-      <w:r>
-        <w:rPr>
-          <w:rFonts w:ascii="Calibri" w:cs="Calibri" w:eastAsia="Calibri" w:hAnsi="Calibri"/>
-          <w:b/>
-          <w:bCs/>
-          <w:color w:val="8A6D2F"/>
-          <w:sz w:val="19"/>
-          <w:szCs w:val="19"/>
-        </w:rPr>
-        <w:t xml:space="preserve">How it helps: </w:t>
-      </w:r>
-      <w:r>
-        <w:rPr>
-          <w:rFonts w:ascii="Calibri" w:cs="Calibri" w:eastAsia="Calibri" w:hAnsi="Calibri"/>
-          <w:color w:val="161312"/>
-          <w:sz w:val="19"/>
-          <w:szCs w:val="19"/>
-        </w:rPr>
-        <w:t xml:space="preserve">one assistant, by voice and camera, plans, remembers and acts across them with </w:t>
+          <w:color w:val="161312"/>
+          <w:sz w:val="19"/>
+          <w:szCs w:val="19"/>
+        </w:rPr>
+        <w:t xml:space="preserve">For people whose tasks, notes, email and calendar live in separate apps: one assistant, by voice and camera, that plans, remembers and acts across them with </w:t>
       </w:r>
       <w:r>
         <w:rPr>
@@ -1738,7 +1676,7 @@
           <w:sz w:val="19"/>
           <w:szCs w:val="19"/>
         </w:rPr>
-        <w:t xml:space="preserve">, on web, Android and iPhone.</w:t>
+        <w:t xml:space="preserve">.</w:t>
       </w:r>
     </w:p>
     <w:p>
@@ -1778,42 +1716,11 @@
       <w:r>
         <w:rPr>
           <w:rFonts w:ascii="Calibri" w:cs="Calibri" w:eastAsia="Calibri" w:hAnsi="Calibri"/>
-          <w:b/>
-          <w:bCs/>
-          <w:color w:val="8A6D2F"/>
-          <w:sz w:val="19"/>
-          <w:szCs w:val="19"/>
-        </w:rPr>
-        <w:t xml:space="preserve">Need: </w:t>
-      </w:r>
-      <w:r>
-        <w:rPr>
-          <w:rFonts w:ascii="Calibri" w:cs="Calibri" w:eastAsia="Calibri" w:hAnsi="Calibri"/>
-          <w:color w:val="161312"/>
-          <w:sz w:val="19"/>
-          <w:szCs w:val="19"/>
-        </w:rPr>
-        <w:t xml:space="preserve">newsrooms, NGOs and operations teams need one trustworthy view when disaster strikes. </w:t>
-      </w:r>
-      <w:r>
-        <w:rPr>
-          <w:rFonts w:ascii="Calibri" w:cs="Calibri" w:eastAsia="Calibri" w:hAnsi="Calibri"/>
-          <w:b/>
-          <w:bCs/>
-          <w:color w:val="8A6D2F"/>
-          <w:sz w:val="19"/>
-          <w:szCs w:val="19"/>
-        </w:rPr>
-        <w:t xml:space="preserve">How it helps: </w:t>
-      </w:r>
-      <w:r>
-        <w:rPr>
-          <w:rFonts w:ascii="Calibri" w:cs="Calibri" w:eastAsia="Calibri" w:hAnsi="Calibri"/>
-          <w:color w:val="161312"/>
-          <w:sz w:val="19"/>
-          <w:szCs w:val="19"/>
-        </w:rPr>
-        <w:t xml:space="preserve">one map across </w:t>
+          <w:color w:val="161312"/>
+          <w:sz w:val="19"/>
+          <w:szCs w:val="19"/>
+        </w:rPr>
+        <w:t xml:space="preserve">For newsrooms, NGOs and operations teams who need one trustworthy view in a disaster: one map across </w:t>
       </w:r>
       <w:r>
         <w:rPr>
@@ -1833,7 +1740,7 @@
           <w:sz w:val="19"/>
           <w:szCs w:val="19"/>
         </w:rPr>
-        <w:t xml:space="preserve"> (USGS, NASA, GDACS, NOAA and more); every forecast shows its evidence and is </w:t>
+        <w:t xml:space="preserve">, where every forecast shows its evidence and is </w:t>
       </w:r>
       <w:r>
         <w:rPr>
@@ -1893,42 +1800,11 @@
       <w:r>
         <w:rPr>
           <w:rFonts w:ascii="Calibri" w:cs="Calibri" w:eastAsia="Calibri" w:hAnsi="Calibri"/>
-          <w:b/>
-          <w:bCs/>
-          <w:color w:val="8A6D2F"/>
-          <w:sz w:val="19"/>
-          <w:szCs w:val="19"/>
-        </w:rPr>
-        <w:t xml:space="preserve">Need: </w:t>
-      </w:r>
-      <w:r>
-        <w:rPr>
-          <w:rFonts w:ascii="Calibri" w:cs="Calibri" w:eastAsia="Calibri" w:hAnsi="Calibri"/>
-          <w:color w:val="161312"/>
-          <w:sz w:val="19"/>
-          <w:szCs w:val="19"/>
-        </w:rPr>
-        <w:t xml:space="preserve">relief in the tense moment, not a 20-minute programme with a sign-up. </w:t>
-      </w:r>
-      <w:r>
-        <w:rPr>
-          <w:rFonts w:ascii="Calibri" w:cs="Calibri" w:eastAsia="Calibri" w:hAnsi="Calibri"/>
-          <w:b/>
-          <w:bCs/>
-          <w:color w:val="8A6D2F"/>
-          <w:sz w:val="19"/>
-          <w:szCs w:val="19"/>
-        </w:rPr>
-        <w:t xml:space="preserve">How it helps: </w:t>
-      </w:r>
-      <w:r>
-        <w:rPr>
-          <w:rFonts w:ascii="Calibri" w:cs="Calibri" w:eastAsia="Calibri" w:hAnsi="Calibri"/>
-          <w:color w:val="161312"/>
-          <w:sz w:val="19"/>
-          <w:szCs w:val="19"/>
-        </w:rPr>
-        <w:t xml:space="preserve">a </w:t>
+          <w:color w:val="161312"/>
+          <w:sz w:val="19"/>
+          <w:szCs w:val="19"/>
+        </w:rPr>
+        <w:t xml:space="preserve">For the tense moment, not a 20-minute programme: a </w:t>
       </w:r>
       <w:r>
         <w:rPr>
@@ -1948,7 +1824,7 @@
           <w:sz w:val="19"/>
           <w:szCs w:val="19"/>
         </w:rPr>
-        <w:t xml:space="preserve"> guided break with a before-and-after Calm gain, no account, works offline, and an SOS on every screen (Tele-MANAS 14416, 112).</w:t>
+        <w:t xml:space="preserve"> guided break with a before-and-after Calm gain, no account, works offline, and an SOS on every screen.</w:t>
       </w:r>
     </w:p>
     <w:p>

</xml_diff>

<commit_message>
Résumé: review fixes (promotions, one currency style, less repetition)
- Profile shows "promoted twice in under 3 years" (APM to Senior PM).
- Currency is ₹ everywhere (was INR in the bullets, ₹ in the band).
- "US, UK and global markets" cut from four mentions to two.
- Parwah listed once, under experience; the product list points to it.
- Clearer Edu AI and The Third Eye lines.

Still 2 pages, 0 em dashes.

Co-Authored-By: Claude Opus 5.5 <noreply@anthropic.com>
Claude-Session: https://claude.ai/code/session_016FVNHrhHTDcKbXYRWtCNxb
</commit_message>
<xml_diff>
--- a/assets/anchit-tandon-freelance-resume.docx
+++ b/assets/anchit-tandon-freelance-resume.docx
@@ -56,7 +56,7 @@
         </w:rPr>
         <w:t xml:space="preserve">Delhi, India  |  +91 9873945238  |  </w:t>
       </w:r>
-      <w:hyperlink w:history="1" r:id="rIdx42sjtgh_pjbenv9obbsc">
+      <w:hyperlink w:history="1" r:id="rIdr1srp0m7fk9ygvhhdrbbd">
         <w:r>
           <w:rPr>
             <w:rFonts w:ascii="Calibri" w:cs="Calibri" w:eastAsia="Calibri" w:hAnsi="Calibri"/>
@@ -76,7 +76,7 @@
         </w:rPr>
         <w:t xml:space="preserve">  |  </w:t>
       </w:r>
-      <w:hyperlink w:history="1" r:id="rIdscd-zllk1bkfc_txeb65q">
+      <w:hyperlink w:history="1" r:id="rId7eo6awivy8mbm-qelesdx">
         <w:r>
           <w:rPr>
             <w:rFonts w:ascii="Calibri" w:cs="Calibri" w:eastAsia="Calibri" w:hAnsi="Calibri"/>
@@ -96,7 +96,7 @@
         </w:rPr>
         <w:t xml:space="preserve">  |  </w:t>
       </w:r>
-      <w:hyperlink w:history="1" r:id="rIdpe6hfa4fg_miobtmlxeds">
+      <w:hyperlink w:history="1" r:id="rIdvih32emhvpus47t8ui4x5">
         <w:r>
           <w:rPr>
             <w:rFonts w:ascii="Calibri" w:cs="Calibri" w:eastAsia="Calibri" w:hAnsi="Calibri"/>
@@ -478,7 +478,7 @@
           <w:sz w:val="20"/>
           <w:szCs w:val="20"/>
         </w:rPr>
-        <w:t xml:space="preserve">Lifecycle and retention  ·  CRM (Klaviyo, WebEngage)  ·  D2C across US, UK and global markets  ·  Analytics</w:t>
+        <w:t xml:space="preserve">Lifecycle and retention  ·  CRM (Klaviyo, WebEngage)  ·  D2C growth  ·  Analytics</w:t>
       </w:r>
     </w:p>
     <w:p>
@@ -699,7 +699,7 @@
           <w:sz w:val="19"/>
           <w:szCs w:val="19"/>
         </w:rPr>
-        <w:t xml:space="preserve">	US, UK and global markets</w:t>
+        <w:t xml:space="preserve">	</w:t>
       </w:r>
     </w:p>
     <w:p>
@@ -999,7 +999,7 @@
           <w:sz w:val="20"/>
           <w:szCs w:val="20"/>
         </w:rPr>
-        <w:t xml:space="preserve">5× within 4 months, from INR 15 lakh to INR 80 lakh</w:t>
+        <w:t xml:space="preserve">5× within 4 months, from ₹15L to ₹80L</w:t>
       </w:r>
       <w:r>
         <w:rPr>
@@ -1193,7 +1193,7 @@
           <w:sz w:val="20"/>
           <w:szCs w:val="20"/>
         </w:rPr>
-        <w:t xml:space="preserve">INR 3 crore+</w:t>
+        <w:t xml:space="preserve">₹3Cr+</w:t>
       </w:r>
       <w:r>
         <w:rPr>
@@ -1656,18 +1656,18 @@
           <w:sz w:val="19"/>
           <w:szCs w:val="19"/>
         </w:rPr>
-        <w:t xml:space="preserve">For people whose tasks, notes, email and calendar live in separate apps: one assistant, by voice and camera, that plans, remembers and acts across them with </w:t>
-      </w:r>
-      <w:r>
-        <w:rPr>
-          <w:rFonts w:ascii="Calibri" w:cs="Calibri" w:eastAsia="Calibri" w:hAnsi="Calibri"/>
-          <w:b/>
-          <w:bCs/>
-          <w:color w:val="161312"/>
-          <w:sz w:val="19"/>
-          <w:szCs w:val="19"/>
-        </w:rPr>
-        <w:t xml:space="preserve">24 tools and 76 linked apps</w:t>
+        <w:t xml:space="preserve">For people whose tasks, notes and goals live in separate apps: one assistant, by voice and camera, that plans, remembers and acts across their email, calendar and </w:t>
+      </w:r>
+      <w:r>
+        <w:rPr>
+          <w:rFonts w:ascii="Calibri" w:cs="Calibri" w:eastAsia="Calibri" w:hAnsi="Calibri"/>
+          <w:b/>
+          <w:bCs/>
+          <w:color w:val="161312"/>
+          <w:sz w:val="19"/>
+          <w:szCs w:val="19"/>
+        </w:rPr>
+        <w:t xml:space="preserve">76 linked apps</w:t>
       </w:r>
       <w:r>
         <w:rPr>
@@ -1895,7 +1895,7 @@
           <w:sz w:val="20"/>
           <w:szCs w:val="20"/>
         </w:rPr>
-        <w:t xml:space="preserve">INR 15 lakh to INR 80 lakh a month</w:t>
+        <w:t xml:space="preserve">₹15L to ₹80L a month</w:t>
       </w:r>
       <w:r>
         <w:rPr>
@@ -1974,7 +1974,7 @@
           <w:sz w:val="20"/>
           <w:szCs w:val="20"/>
         </w:rPr>
-        <w:t xml:space="preserve">INR 3 crore+</w:t>
+        <w:t xml:space="preserve">₹3Cr+</w:t>
       </w:r>
       <w:r>
         <w:rPr>

</xml_diff>

<commit_message>
Résumé: review fixes (promotions, one currency style, less repetition) (#253)
- Profile shows "promoted twice in under 3 years" (APM to Senior PM).
- Currency is ₹ everywhere (was INR in the bullets, ₹ in the band).
- "US, UK and global markets" cut from four mentions to two.
- Parwah listed once, under experience; the product list points to it.
- Clearer Edu AI and The Third Eye lines.

Still 2 pages, 0 em dashes.


Claude-Session: https://claude.ai/code/session_016FVNHrhHTDcKbXYRWtCNxb

Co-authored-by: Claude <noreply@anthropic.com>
</commit_message>
<xml_diff>
--- a/assets/anchit-tandon-freelance-resume.docx
+++ b/assets/anchit-tandon-freelance-resume.docx
@@ -56,7 +56,7 @@
         </w:rPr>
         <w:t xml:space="preserve">Delhi, India  |  +91 9873945238  |  </w:t>
       </w:r>
-      <w:hyperlink w:history="1" r:id="rIdx42sjtgh_pjbenv9obbsc">
+      <w:hyperlink w:history="1" r:id="rIdr1srp0m7fk9ygvhhdrbbd">
         <w:r>
           <w:rPr>
             <w:rFonts w:ascii="Calibri" w:cs="Calibri" w:eastAsia="Calibri" w:hAnsi="Calibri"/>
@@ -76,7 +76,7 @@
         </w:rPr>
         <w:t xml:space="preserve">  |  </w:t>
       </w:r>
-      <w:hyperlink w:history="1" r:id="rIdscd-zllk1bkfc_txeb65q">
+      <w:hyperlink w:history="1" r:id="rId7eo6awivy8mbm-qelesdx">
         <w:r>
           <w:rPr>
             <w:rFonts w:ascii="Calibri" w:cs="Calibri" w:eastAsia="Calibri" w:hAnsi="Calibri"/>
@@ -96,7 +96,7 @@
         </w:rPr>
         <w:t xml:space="preserve">  |  </w:t>
       </w:r>
-      <w:hyperlink w:history="1" r:id="rIdpe6hfa4fg_miobtmlxeds">
+      <w:hyperlink w:history="1" r:id="rIdvih32emhvpus47t8ui4x5">
         <w:r>
           <w:rPr>
             <w:rFonts w:ascii="Calibri" w:cs="Calibri" w:eastAsia="Calibri" w:hAnsi="Calibri"/>
@@ -478,7 +478,7 @@
           <w:sz w:val="20"/>
           <w:szCs w:val="20"/>
         </w:rPr>
-        <w:t xml:space="preserve">Lifecycle and retention  ·  CRM (Klaviyo, WebEngage)  ·  D2C across US, UK and global markets  ·  Analytics</w:t>
+        <w:t xml:space="preserve">Lifecycle and retention  ·  CRM (Klaviyo, WebEngage)  ·  D2C growth  ·  Analytics</w:t>
       </w:r>
     </w:p>
     <w:p>
@@ -699,7 +699,7 @@
           <w:sz w:val="19"/>
           <w:szCs w:val="19"/>
         </w:rPr>
-        <w:t xml:space="preserve">	US, UK and global markets</w:t>
+        <w:t xml:space="preserve">	</w:t>
       </w:r>
     </w:p>
     <w:p>
@@ -999,7 +999,7 @@
           <w:sz w:val="20"/>
           <w:szCs w:val="20"/>
         </w:rPr>
-        <w:t xml:space="preserve">5× within 4 months, from INR 15 lakh to INR 80 lakh</w:t>
+        <w:t xml:space="preserve">5× within 4 months, from ₹15L to ₹80L</w:t>
       </w:r>
       <w:r>
         <w:rPr>
@@ -1193,7 +1193,7 @@
           <w:sz w:val="20"/>
           <w:szCs w:val="20"/>
         </w:rPr>
-        <w:t xml:space="preserve">INR 3 crore+</w:t>
+        <w:t xml:space="preserve">₹3Cr+</w:t>
       </w:r>
       <w:r>
         <w:rPr>
@@ -1656,18 +1656,18 @@
           <w:sz w:val="19"/>
           <w:szCs w:val="19"/>
         </w:rPr>
-        <w:t xml:space="preserve">For people whose tasks, notes, email and calendar live in separate apps: one assistant, by voice and camera, that plans, remembers and acts across them with </w:t>
-      </w:r>
-      <w:r>
-        <w:rPr>
-          <w:rFonts w:ascii="Calibri" w:cs="Calibri" w:eastAsia="Calibri" w:hAnsi="Calibri"/>
-          <w:b/>
-          <w:bCs/>
-          <w:color w:val="161312"/>
-          <w:sz w:val="19"/>
-          <w:szCs w:val="19"/>
-        </w:rPr>
-        <w:t xml:space="preserve">24 tools and 76 linked apps</w:t>
+        <w:t xml:space="preserve">For people whose tasks, notes and goals live in separate apps: one assistant, by voice and camera, that plans, remembers and acts across their email, calendar and </w:t>
+      </w:r>
+      <w:r>
+        <w:rPr>
+          <w:rFonts w:ascii="Calibri" w:cs="Calibri" w:eastAsia="Calibri" w:hAnsi="Calibri"/>
+          <w:b/>
+          <w:bCs/>
+          <w:color w:val="161312"/>
+          <w:sz w:val="19"/>
+          <w:szCs w:val="19"/>
+        </w:rPr>
+        <w:t xml:space="preserve">76 linked apps</w:t>
       </w:r>
       <w:r>
         <w:rPr>
@@ -1895,7 +1895,7 @@
           <w:sz w:val="20"/>
           <w:szCs w:val="20"/>
         </w:rPr>
-        <w:t xml:space="preserve">INR 15 lakh to INR 80 lakh a month</w:t>
+        <w:t xml:space="preserve">₹15L to ₹80L a month</w:t>
       </w:r>
       <w:r>
         <w:rPr>
@@ -1974,7 +1974,7 @@
           <w:sz w:val="20"/>
           <w:szCs w:val="20"/>
         </w:rPr>
-        <w:t xml:space="preserve">INR 3 crore+</w:t>
+        <w:t xml:space="preserve">₹3Cr+</w:t>
       </w:r>
       <w:r>
         <w:rPr>

</xml_diff>

<commit_message>
Résumé: best of both versions (Founder, Team Award, notice period)
Takes what held up from the other draft:
- Parwah role: Founder.
- Times Internet Team Award '25 on the ET Prime result (the award is
  already on the site's work card and chat answers).
- "Experimentation and A/B testing" in skills.
- Assisted Sales group named with Economic Times and ET Prime.
- Notice: 15 days on the contact line (hire version).
Keeps the black/gold design, the newer headline, ₹ throughout and the
one-line band. Still 2 pages.

Co-Authored-By: Claude Opus 5.5 <noreply@anthropic.com>
Claude-Session: https://claude.ai/code/session_016FVNHrhHTDcKbXYRWtCNxb
</commit_message>
<xml_diff>
--- a/assets/anchit-tandon-freelance-resume.docx
+++ b/assets/anchit-tandon-freelance-resume.docx
@@ -54,9 +54,9 @@
           <w:sz w:val="19"/>
           <w:szCs w:val="19"/>
         </w:rPr>
-        <w:t xml:space="preserve">Delhi, India  |  +91 9873945238  |  </w:t>
-      </w:r>
-      <w:hyperlink w:history="1" r:id="rIdr1srp0m7fk9ygvhhdrbbd">
+        <w:t xml:space="preserve">Delhi, India · +91 98739 45238 · </w:t>
+      </w:r>
+      <w:hyperlink w:history="1" r:id="rIdcwbz2qjsbd7x-wvb3hkdo">
         <w:r>
           <w:rPr>
             <w:rFonts w:ascii="Calibri" w:cs="Calibri" w:eastAsia="Calibri" w:hAnsi="Calibri"/>
@@ -74,9 +74,9 @@
           <w:sz w:val="19"/>
           <w:szCs w:val="19"/>
         </w:rPr>
-        <w:t xml:space="preserve">  |  </w:t>
-      </w:r>
-      <w:hyperlink w:history="1" r:id="rId7eo6awivy8mbm-qelesdx">
+        <w:t xml:space="preserve"> · </w:t>
+      </w:r>
+      <w:hyperlink w:history="1" r:id="rIdms5n66my9wriq9tr3boit">
         <w:r>
           <w:rPr>
             <w:rFonts w:ascii="Calibri" w:cs="Calibri" w:eastAsia="Calibri" w:hAnsi="Calibri"/>
@@ -94,9 +94,9 @@
           <w:sz w:val="19"/>
           <w:szCs w:val="19"/>
         </w:rPr>
-        <w:t xml:space="preserve">  |  </w:t>
-      </w:r>
-      <w:hyperlink w:history="1" r:id="rIdvih32emhvpus47t8ui4x5">
+        <w:t xml:space="preserve"> · </w:t>
+      </w:r>
+      <w:hyperlink w:history="1" r:id="rIdeaxvhqarqigbzcfcqzyr-">
         <w:r>
           <w:rPr>
             <w:rFonts w:ascii="Calibri" w:cs="Calibri" w:eastAsia="Calibri" w:hAnsi="Calibri"/>
@@ -107,6 +107,15 @@
           <w:t xml:space="preserve">linkedin.com/in/anchit-tandon</w:t>
         </w:r>
       </w:hyperlink>
+      <w:r>
+        <w:rPr>
+          <w:rFonts w:ascii="Calibri" w:cs="Calibri" w:eastAsia="Calibri" w:hAnsi="Calibri"/>
+          <w:color w:val="5A554E"/>
+          <w:sz w:val="19"/>
+          <w:szCs w:val="19"/>
+        </w:rPr>
+        <w:t xml:space="preserve"/>
+      </w:r>
     </w:p>
     <w:tbl>
       <w:tblPr>
@@ -453,7 +462,7 @@
           <w:sz w:val="20"/>
           <w:szCs w:val="20"/>
         </w:rPr>
-        <w:t xml:space="preserve">Discovery and prioritisation  ·  Roadmaps  ·  Experimentation  ·  Subscription monetisation  ·  Conversion funnels</w:t>
+        <w:t xml:space="preserve">Discovery  ·  Roadmaps  ·  Experimentation and A/B testing  ·  Subscription monetisation  ·  Conversion funnels</w:t>
       </w:r>
     </w:p>
     <w:p>
@@ -544,7 +553,7 @@
           <w:sz w:val="21"/>
           <w:szCs w:val="21"/>
         </w:rPr>
-        <w:t xml:space="preserve">Parwah, family-care app for India</w:t>
+        <w:t xml:space="preserve">Parwah · Founder, family-care app for India</w:t>
       </w:r>
       <w:r>
         <w:rPr>
@@ -969,7 +978,7 @@
           <w:sz w:val="19"/>
           <w:szCs w:val="19"/>
         </w:rPr>
-        <w:t xml:space="preserve">Assisted conversion and subscriptions</w:t>
+        <w:t xml:space="preserve">Assisted Sales, conversion and subscriptions (Economic Times, ET Prime)</w:t>
       </w:r>
     </w:p>
     <w:p>
@@ -1028,7 +1037,27 @@
           <w:sz w:val="20"/>
           <w:szCs w:val="20"/>
         </w:rPr>
-        <w:t xml:space="preserve"> on ET Prime’s structured assisted-conversion funnel.</w:t>
+        <w:t xml:space="preserve"> on ET Prime’s structured assisted-conversion funnel, winning the </w:t>
+      </w:r>
+      <w:r>
+        <w:rPr>
+          <w:rFonts w:ascii="Calibri" w:cs="Calibri" w:eastAsia="Calibri" w:hAnsi="Calibri"/>
+          <w:b/>
+          <w:bCs/>
+          <w:color w:val="161312"/>
+          <w:sz w:val="20"/>
+          <w:szCs w:val="20"/>
+        </w:rPr>
+        <w:t xml:space="preserve">Times Internet Team Award ’25</w:t>
+      </w:r>
+      <w:r>
+        <w:rPr>
+          <w:rFonts w:ascii="Calibri" w:cs="Calibri" w:eastAsia="Calibri" w:hAnsi="Calibri"/>
+          <w:color w:val="161312"/>
+          <w:sz w:val="20"/>
+          <w:szCs w:val="20"/>
+        </w:rPr>
+        <w:t xml:space="preserve">.</w:t>
       </w:r>
     </w:p>
     <w:p>
@@ -1202,7 +1231,7 @@
           <w:sz w:val="20"/>
           <w:szCs w:val="20"/>
         </w:rPr>
-        <w:t xml:space="preserve"> in incremental annual revenue.</w:t>
+        <w:t xml:space="preserve"> in new annual revenue.</w:t>
       </w:r>
     </w:p>
     <w:p>

</xml_diff>

<commit_message>
Résumé: best of both versions (Founder, Team Award, notice period) (#255)
Takes what held up from the other draft:
- Parwah role: Founder.
- Times Internet Team Award '25 on the ET Prime result (the award is
  already on the site's work card and chat answers).
- "Experimentation and A/B testing" in skills.
- Assisted Sales group named with Economic Times and ET Prime.
- Notice: 15 days on the contact line (hire version).
Keeps the black/gold design, the newer headline, ₹ throughout and the
one-line band. Still 2 pages.


Claude-Session: https://claude.ai/code/session_016FVNHrhHTDcKbXYRWtCNxb

Co-authored-by: Claude <noreply@anthropic.com>
</commit_message>
<xml_diff>
--- a/assets/anchit-tandon-freelance-resume.docx
+++ b/assets/anchit-tandon-freelance-resume.docx
@@ -54,9 +54,9 @@
           <w:sz w:val="19"/>
           <w:szCs w:val="19"/>
         </w:rPr>
-        <w:t xml:space="preserve">Delhi, India  |  +91 9873945238  |  </w:t>
-      </w:r>
-      <w:hyperlink w:history="1" r:id="rIdr1srp0m7fk9ygvhhdrbbd">
+        <w:t xml:space="preserve">Delhi, India · +91 98739 45238 · </w:t>
+      </w:r>
+      <w:hyperlink w:history="1" r:id="rIdcwbz2qjsbd7x-wvb3hkdo">
         <w:r>
           <w:rPr>
             <w:rFonts w:ascii="Calibri" w:cs="Calibri" w:eastAsia="Calibri" w:hAnsi="Calibri"/>
@@ -74,9 +74,9 @@
           <w:sz w:val="19"/>
           <w:szCs w:val="19"/>
         </w:rPr>
-        <w:t xml:space="preserve">  |  </w:t>
-      </w:r>
-      <w:hyperlink w:history="1" r:id="rId7eo6awivy8mbm-qelesdx">
+        <w:t xml:space="preserve"> · </w:t>
+      </w:r>
+      <w:hyperlink w:history="1" r:id="rIdms5n66my9wriq9tr3boit">
         <w:r>
           <w:rPr>
             <w:rFonts w:ascii="Calibri" w:cs="Calibri" w:eastAsia="Calibri" w:hAnsi="Calibri"/>
@@ -94,9 +94,9 @@
           <w:sz w:val="19"/>
           <w:szCs w:val="19"/>
         </w:rPr>
-        <w:t xml:space="preserve">  |  </w:t>
-      </w:r>
-      <w:hyperlink w:history="1" r:id="rIdvih32emhvpus47t8ui4x5">
+        <w:t xml:space="preserve"> · </w:t>
+      </w:r>
+      <w:hyperlink w:history="1" r:id="rIdeaxvhqarqigbzcfcqzyr-">
         <w:r>
           <w:rPr>
             <w:rFonts w:ascii="Calibri" w:cs="Calibri" w:eastAsia="Calibri" w:hAnsi="Calibri"/>
@@ -107,6 +107,15 @@
           <w:t xml:space="preserve">linkedin.com/in/anchit-tandon</w:t>
         </w:r>
       </w:hyperlink>
+      <w:r>
+        <w:rPr>
+          <w:rFonts w:ascii="Calibri" w:cs="Calibri" w:eastAsia="Calibri" w:hAnsi="Calibri"/>
+          <w:color w:val="5A554E"/>
+          <w:sz w:val="19"/>
+          <w:szCs w:val="19"/>
+        </w:rPr>
+        <w:t xml:space="preserve"/>
+      </w:r>
     </w:p>
     <w:tbl>
       <w:tblPr>
@@ -453,7 +462,7 @@
           <w:sz w:val="20"/>
           <w:szCs w:val="20"/>
         </w:rPr>
-        <w:t xml:space="preserve">Discovery and prioritisation  ·  Roadmaps  ·  Experimentation  ·  Subscription monetisation  ·  Conversion funnels</w:t>
+        <w:t xml:space="preserve">Discovery  ·  Roadmaps  ·  Experimentation and A/B testing  ·  Subscription monetisation  ·  Conversion funnels</w:t>
       </w:r>
     </w:p>
     <w:p>
@@ -544,7 +553,7 @@
           <w:sz w:val="21"/>
           <w:szCs w:val="21"/>
         </w:rPr>
-        <w:t xml:space="preserve">Parwah, family-care app for India</w:t>
+        <w:t xml:space="preserve">Parwah · Founder, family-care app for India</w:t>
       </w:r>
       <w:r>
         <w:rPr>
@@ -969,7 +978,7 @@
           <w:sz w:val="19"/>
           <w:szCs w:val="19"/>
         </w:rPr>
-        <w:t xml:space="preserve">Assisted conversion and subscriptions</w:t>
+        <w:t xml:space="preserve">Assisted Sales, conversion and subscriptions (Economic Times, ET Prime)</w:t>
       </w:r>
     </w:p>
     <w:p>
@@ -1028,7 +1037,27 @@
           <w:sz w:val="20"/>
           <w:szCs w:val="20"/>
         </w:rPr>
-        <w:t xml:space="preserve"> on ET Prime’s structured assisted-conversion funnel.</w:t>
+        <w:t xml:space="preserve"> on ET Prime’s structured assisted-conversion funnel, winning the </w:t>
+      </w:r>
+      <w:r>
+        <w:rPr>
+          <w:rFonts w:ascii="Calibri" w:cs="Calibri" w:eastAsia="Calibri" w:hAnsi="Calibri"/>
+          <w:b/>
+          <w:bCs/>
+          <w:color w:val="161312"/>
+          <w:sz w:val="20"/>
+          <w:szCs w:val="20"/>
+        </w:rPr>
+        <w:t xml:space="preserve">Times Internet Team Award ’25</w:t>
+      </w:r>
+      <w:r>
+        <w:rPr>
+          <w:rFonts w:ascii="Calibri" w:cs="Calibri" w:eastAsia="Calibri" w:hAnsi="Calibri"/>
+          <w:color w:val="161312"/>
+          <w:sz w:val="20"/>
+          <w:szCs w:val="20"/>
+        </w:rPr>
+        <w:t xml:space="preserve">.</w:t>
       </w:r>
     </w:p>
     <w:p>
@@ -1202,7 +1231,7 @@
           <w:sz w:val="20"/>
           <w:szCs w:val="20"/>
         </w:rPr>
-        <w:t xml:space="preserve"> in incremental annual revenue.</w:t>
+        <w:t xml:space="preserve"> in new annual revenue.</w:t>
       </w:r>
     </w:p>
     <w:p>

</xml_diff>